<commit_message>
feat: Clase 06, relaciones sql ORM
</commit_message>
<xml_diff>
--- a/221_backend/App.docx
+++ b/221_backend/App.docx
@@ -5,14 +5,14 @@
     <w:tbl>
       <w:tblPr>
         <w:tblStyle w:val="Tablaconcuadrcula"/>
-        <w:tblW w:w="11662" w:type="dxa"/>
+        <w:tblW w:w="11477" w:type="dxa"/>
         <w:tblLayout w:type="fixed"/>
         <w:tblLook w:val="04A0" w:firstRow="1" w:lastRow="0" w:firstColumn="1" w:lastColumn="0" w:noHBand="0" w:noVBand="1"/>
       </w:tblPr>
       <w:tblGrid>
         <w:gridCol w:w="1696"/>
-        <w:gridCol w:w="2835"/>
-        <w:gridCol w:w="7131"/>
+        <w:gridCol w:w="2694"/>
+        <w:gridCol w:w="7087"/>
       </w:tblGrid>
       <w:tr>
         <w:tc>
@@ -32,7 +32,7 @@
         </w:tc>
         <w:tc>
           <w:tcPr>
-            <w:tcW w:w="2835" w:type="dxa"/>
+            <w:tcW w:w="2694" w:type="dxa"/>
           </w:tcPr>
           <w:p>
             <w:proofErr w:type="spellStart"/>
@@ -49,7 +49,7 @@
         </w:tc>
         <w:tc>
           <w:tcPr>
-            <w:tcW w:w="7131" w:type="dxa"/>
+            <w:tcW w:w="7087" w:type="dxa"/>
           </w:tcPr>
           <w:p>
             <w:proofErr w:type="spellStart"/>
@@ -109,7 +109,7 @@
         </w:tc>
         <w:tc>
           <w:tcPr>
-            <w:tcW w:w="2835" w:type="dxa"/>
+            <w:tcW w:w="2694" w:type="dxa"/>
             <w:hideMark/>
           </w:tcPr>
           <w:p>
@@ -132,7 +132,7 @@
         </w:tc>
         <w:tc>
           <w:tcPr>
-            <w:tcW w:w="7131" w:type="dxa"/>
+            <w:tcW w:w="7087" w:type="dxa"/>
             <w:hideMark/>
           </w:tcPr>
           <w:p>
@@ -175,11 +175,13 @@
               </w:rPr>
               <w:t>catalogs</w:t>
             </w:r>
-          </w:p>
-        </w:tc>
-        <w:tc>
-          <w:tcPr>
-            <w:tcW w:w="2835" w:type="dxa"/>
+            <w:bookmarkStart w:id="0" w:name="_GoBack"/>
+            <w:bookmarkEnd w:id="0"/>
+          </w:p>
+        </w:tc>
+        <w:tc>
+          <w:tcPr>
+            <w:tcW w:w="2694" w:type="dxa"/>
             <w:hideMark/>
           </w:tcPr>
           <w:p>
@@ -200,7 +202,7 @@
         </w:tc>
         <w:tc>
           <w:tcPr>
-            <w:tcW w:w="7131" w:type="dxa"/>
+            <w:tcW w:w="7087" w:type="dxa"/>
             <w:hideMark/>
           </w:tcPr>
           <w:p>
@@ -261,7 +263,7 @@
         </w:tc>
         <w:tc>
           <w:tcPr>
-            <w:tcW w:w="2835" w:type="dxa"/>
+            <w:tcW w:w="2694" w:type="dxa"/>
             <w:hideMark/>
           </w:tcPr>
           <w:p>
@@ -282,7 +284,7 @@
         </w:tc>
         <w:tc>
           <w:tcPr>
-            <w:tcW w:w="7131" w:type="dxa"/>
+            <w:tcW w:w="7087" w:type="dxa"/>
             <w:hideMark/>
           </w:tcPr>
           <w:p>
@@ -343,7 +345,7 @@
         </w:tc>
         <w:tc>
           <w:tcPr>
-            <w:tcW w:w="2835" w:type="dxa"/>
+            <w:tcW w:w="2694" w:type="dxa"/>
             <w:hideMark/>
           </w:tcPr>
           <w:p>
@@ -366,7 +368,7 @@
         </w:tc>
         <w:tc>
           <w:tcPr>
-            <w:tcW w:w="7131" w:type="dxa"/>
+            <w:tcW w:w="7087" w:type="dxa"/>
             <w:hideMark/>
           </w:tcPr>
           <w:p>
@@ -422,7 +424,7 @@
         </w:tc>
         <w:tc>
           <w:tcPr>
-            <w:tcW w:w="2835" w:type="dxa"/>
+            <w:tcW w:w="2694" w:type="dxa"/>
             <w:hideMark/>
           </w:tcPr>
           <w:p>
@@ -445,7 +447,7 @@
         </w:tc>
         <w:tc>
           <w:tcPr>
-            <w:tcW w:w="7131" w:type="dxa"/>
+            <w:tcW w:w="7087" w:type="dxa"/>
             <w:hideMark/>
           </w:tcPr>
           <w:p>
@@ -485,7 +487,7 @@
         </w:tc>
         <w:tc>
           <w:tcPr>
-            <w:tcW w:w="2835" w:type="dxa"/>
+            <w:tcW w:w="2694" w:type="dxa"/>
             <w:hideMark/>
           </w:tcPr>
           <w:p>
@@ -506,7 +508,7 @@
         </w:tc>
         <w:tc>
           <w:tcPr>
-            <w:tcW w:w="7131" w:type="dxa"/>
+            <w:tcW w:w="7087" w:type="dxa"/>
             <w:hideMark/>
           </w:tcPr>
           <w:p>
@@ -567,7 +569,7 @@
         </w:tc>
         <w:tc>
           <w:tcPr>
-            <w:tcW w:w="2835" w:type="dxa"/>
+            <w:tcW w:w="2694" w:type="dxa"/>
             <w:hideMark/>
           </w:tcPr>
           <w:p>
@@ -588,7 +590,7 @@
         </w:tc>
         <w:tc>
           <w:tcPr>
-            <w:tcW w:w="7131" w:type="dxa"/>
+            <w:tcW w:w="7087" w:type="dxa"/>
             <w:hideMark/>
           </w:tcPr>
           <w:p>
@@ -628,7 +630,7 @@
         </w:tc>
         <w:tc>
           <w:tcPr>
-            <w:tcW w:w="2835" w:type="dxa"/>
+            <w:tcW w:w="2694" w:type="dxa"/>
             <w:hideMark/>
           </w:tcPr>
           <w:p>
@@ -649,7 +651,7 @@
         </w:tc>
         <w:tc>
           <w:tcPr>
-            <w:tcW w:w="7131" w:type="dxa"/>
+            <w:tcW w:w="7087" w:type="dxa"/>
             <w:hideMark/>
           </w:tcPr>
           <w:p>
@@ -689,7 +691,7 @@
         </w:tc>
         <w:tc>
           <w:tcPr>
-            <w:tcW w:w="2835" w:type="dxa"/>
+            <w:tcW w:w="2694" w:type="dxa"/>
             <w:hideMark/>
           </w:tcPr>
           <w:p>
@@ -712,7 +714,7 @@
         </w:tc>
         <w:tc>
           <w:tcPr>
-            <w:tcW w:w="7131" w:type="dxa"/>
+            <w:tcW w:w="7087" w:type="dxa"/>
             <w:hideMark/>
           </w:tcPr>
           <w:p>
@@ -752,7 +754,7 @@
         </w:tc>
         <w:tc>
           <w:tcPr>
-            <w:tcW w:w="2835" w:type="dxa"/>
+            <w:tcW w:w="2694" w:type="dxa"/>
             <w:hideMark/>
           </w:tcPr>
           <w:p>
@@ -775,7 +777,7 @@
         </w:tc>
         <w:tc>
           <w:tcPr>
-            <w:tcW w:w="7131" w:type="dxa"/>
+            <w:tcW w:w="7087" w:type="dxa"/>
             <w:hideMark/>
           </w:tcPr>
           <w:p>
@@ -821,7 +823,7 @@
         </w:tc>
         <w:tc>
           <w:tcPr>
-            <w:tcW w:w="2835" w:type="dxa"/>
+            <w:tcW w:w="2694" w:type="dxa"/>
             <w:hideMark/>
           </w:tcPr>
           <w:p>
@@ -842,7 +844,7 @@
         </w:tc>
         <w:tc>
           <w:tcPr>
-            <w:tcW w:w="7131" w:type="dxa"/>
+            <w:tcW w:w="7087" w:type="dxa"/>
             <w:hideMark/>
           </w:tcPr>
           <w:p>
@@ -954,7 +956,7 @@
         </w:tc>
         <w:tc>
           <w:tcPr>
-            <w:tcW w:w="2835" w:type="dxa"/>
+            <w:tcW w:w="2694" w:type="dxa"/>
             <w:hideMark/>
           </w:tcPr>
           <w:p>
@@ -977,14 +979,15 @@
         </w:tc>
         <w:tc>
           <w:tcPr>
-            <w:tcW w:w="7131" w:type="dxa"/>
-            <w:hideMark/>
-          </w:tcPr>
-          <w:p>
-            <w:pPr>
-              <w:spacing w:before="144" w:after="264"/>
-              <w:rPr>
-                <w:rFonts w:ascii="Helvetica" w:eastAsia="Times New Roman" w:hAnsi="Helvetica" w:cs="Times New Roman"/>
+            <w:tcW w:w="7087" w:type="dxa"/>
+            <w:hideMark/>
+          </w:tcPr>
+          <w:p>
+            <w:pPr>
+              <w:spacing w:before="144" w:after="264"/>
+              <w:rPr>
+                <w:rFonts w:ascii="Helvetica" w:eastAsia="Times New Roman" w:hAnsi="Helvetica" w:cs="Times New Roman"/>
+                <w:lang w:val="es-AR"/>
               </w:rPr>
             </w:pPr>
             <w:r>
@@ -1009,13 +1012,14 @@
               <w:spacing w:before="144" w:after="264"/>
               <w:rPr>
                 <w:rFonts w:ascii="Georgia" w:eastAsia="Times New Roman" w:hAnsi="Georgia" w:cs="Times New Roman"/>
-              </w:rPr>
-            </w:pPr>
-          </w:p>
-        </w:tc>
-        <w:tc>
-          <w:tcPr>
-            <w:tcW w:w="2835" w:type="dxa"/>
+                <w:lang w:val="es-AR"/>
+              </w:rPr>
+            </w:pPr>
+          </w:p>
+        </w:tc>
+        <w:tc>
+          <w:tcPr>
+            <w:tcW w:w="2694" w:type="dxa"/>
             <w:hideMark/>
           </w:tcPr>
           <w:p>
@@ -1038,7 +1042,7 @@
         </w:tc>
         <w:tc>
           <w:tcPr>
-            <w:tcW w:w="7131" w:type="dxa"/>
+            <w:tcW w:w="7087" w:type="dxa"/>
             <w:hideMark/>
           </w:tcPr>
           <w:p>
@@ -1094,7 +1098,7 @@
         </w:tc>
         <w:tc>
           <w:tcPr>
-            <w:tcW w:w="2835" w:type="dxa"/>
+            <w:tcW w:w="2694" w:type="dxa"/>
             <w:hideMark/>
           </w:tcPr>
           <w:p>
@@ -1117,7 +1121,7 @@
         </w:tc>
         <w:tc>
           <w:tcPr>
-            <w:tcW w:w="7131" w:type="dxa"/>
+            <w:tcW w:w="7087" w:type="dxa"/>
             <w:hideMark/>
           </w:tcPr>
           <w:p>
@@ -1152,11 +1156,9 @@
           <w:lang w:val="es-AR"/>
         </w:rPr>
       </w:pPr>
-      <w:bookmarkStart w:id="0" w:name="_GoBack"/>
-      <w:bookmarkEnd w:id="0"/>
     </w:p>
     <w:sectPr>
-      <w:pgSz w:w="12240" w:h="15840"/>
+      <w:pgSz w:w="11906" w:h="16838" w:code="9"/>
       <w:pgMar w:top="232" w:right="187" w:bottom="232" w:left="232" w:header="709" w:footer="709" w:gutter="0"/>
       <w:cols w:space="708"/>
       <w:docGrid w:linePitch="360"/>
@@ -1618,6 +1620,36 @@
       <w:szCs w:val="20"/>
     </w:rPr>
   </w:style>
+  <w:style w:type="paragraph" w:styleId="Textodeglobo">
+    <w:name w:val="Balloon Text"/>
+    <w:basedOn w:val="Normal"/>
+    <w:link w:val="TextodegloboCar"/>
+    <w:uiPriority w:val="99"/>
+    <w:semiHidden/>
+    <w:unhideWhenUsed/>
+    <w:rsid w:val="00F439D5"/>
+    <w:pPr>
+      <w:spacing w:after="0" w:line="240" w:lineRule="auto"/>
+    </w:pPr>
+    <w:rPr>
+      <w:rFonts w:ascii="Segoe UI" w:hAnsi="Segoe UI" w:cs="Segoe UI"/>
+      <w:sz w:val="18"/>
+      <w:szCs w:val="18"/>
+    </w:rPr>
+  </w:style>
+  <w:style w:type="character" w:customStyle="1" w:styleId="TextodegloboCar">
+    <w:name w:val="Texto de globo Car"/>
+    <w:basedOn w:val="Fuentedeprrafopredeter"/>
+    <w:link w:val="Textodeglobo"/>
+    <w:uiPriority w:val="99"/>
+    <w:semiHidden/>
+    <w:rsid w:val="00F439D5"/>
+    <w:rPr>
+      <w:rFonts w:ascii="Segoe UI" w:hAnsi="Segoe UI" w:cs="Segoe UI"/>
+      <w:sz w:val="18"/>
+      <w:szCs w:val="18"/>
+    </w:rPr>
+  </w:style>
 </w:styles>
 </file>
 

</xml_diff>

<commit_message>
feat: Clase 07 y hasta punto 9
</commit_message>
<xml_diff>
--- a/221_backend/App.docx
+++ b/221_backend/App.docx
@@ -175,8 +175,6 @@
               </w:rPr>
               <w:t>catalogs</w:t>
             </w:r>
-            <w:bookmarkStart w:id="0" w:name="_GoBack"/>
-            <w:bookmarkEnd w:id="0"/>
           </w:p>
         </w:tc>
         <w:tc>
@@ -243,6 +241,7 @@
         <w:tc>
           <w:tcPr>
             <w:tcW w:w="1696" w:type="dxa"/>
+            <w:vMerge w:val="restart"/>
             <w:hideMark/>
           </w:tcPr>
           <w:p>
@@ -309,7 +308,7 @@
         <w:tc>
           <w:tcPr>
             <w:tcW w:w="1696" w:type="dxa"/>
-            <w:vMerge w:val="restart"/>
+            <w:vMerge/>
             <w:hideMark/>
           </w:tcPr>
           <w:p>
@@ -317,30 +316,9 @@
               <w:spacing w:before="144" w:after="264"/>
               <w:rPr>
                 <w:rFonts w:ascii="Georgia" w:eastAsia="Times New Roman" w:hAnsi="Georgia" w:cs="Times New Roman"/>
-              </w:rPr>
-            </w:pPr>
-            <w:r>
-              <w:rPr>
-                <w:rFonts w:ascii="Consolas" w:eastAsia="Times New Roman" w:hAnsi="Consolas" w:cs="Courier New"/>
-                <w:shd w:val="clear" w:color="auto" w:fill="181D27"/>
-              </w:rPr>
-              <w:t>institutions</w:t>
-            </w:r>
-          </w:p>
-          <w:p>
-            <w:pPr>
-              <w:spacing w:before="144" w:after="264"/>
-              <w:rPr>
-                <w:rFonts w:ascii="Georgia" w:eastAsia="Times New Roman" w:hAnsi="Georgia" w:cs="Times New Roman"/>
-              </w:rPr>
-            </w:pPr>
-            <w:r>
-              <w:rPr>
-                <w:rFonts w:ascii="Consolas" w:eastAsia="Times New Roman" w:hAnsi="Consolas" w:cs="Courier New"/>
-                <w:shd w:val="clear" w:color="auto" w:fill="181D27"/>
-              </w:rPr>
-              <w:t>academics</w:t>
-            </w:r>
+                <w:lang w:val="es-AR"/>
+              </w:rPr>
+            </w:pPr>
           </w:p>
         </w:tc>
         <w:tc>
@@ -469,6 +447,85 @@
         </w:tc>
       </w:tr>
       <w:tr>
+        <w:trPr>
+          <w:trHeight w:val="58"/>
+        </w:trPr>
+        <w:tc>
+          <w:tcPr>
+            <w:tcW w:w="1696" w:type="dxa"/>
+            <w:vMerge w:val="restart"/>
+            <w:hideMark/>
+          </w:tcPr>
+          <w:p>
+            <w:pPr>
+              <w:spacing w:before="144" w:after="264"/>
+              <w:rPr>
+                <w:rFonts w:ascii="Georgia" w:eastAsia="Times New Roman" w:hAnsi="Georgia" w:cs="Times New Roman"/>
+              </w:rPr>
+            </w:pPr>
+            <w:r>
+              <w:rPr>
+                <w:rFonts w:ascii="Consolas" w:eastAsia="Times New Roman" w:hAnsi="Consolas" w:cs="Courier New"/>
+                <w:shd w:val="clear" w:color="auto" w:fill="181D27"/>
+              </w:rPr>
+              <w:t>academics</w:t>
+            </w:r>
+          </w:p>
+          <w:p>
+            <w:pPr>
+              <w:spacing w:before="144" w:after="264"/>
+              <w:rPr>
+                <w:rFonts w:ascii="Georgia" w:eastAsia="Times New Roman" w:hAnsi="Georgia" w:cs="Times New Roman"/>
+                <w:lang w:val="es-AR"/>
+              </w:rPr>
+            </w:pPr>
+          </w:p>
+        </w:tc>
+        <w:tc>
+          <w:tcPr>
+            <w:tcW w:w="2694" w:type="dxa"/>
+            <w:hideMark/>
+          </w:tcPr>
+          <w:p>
+            <w:pPr>
+              <w:spacing w:before="144" w:after="264"/>
+              <w:rPr>
+                <w:rFonts w:ascii="Georgia" w:eastAsia="Times New Roman" w:hAnsi="Georgia" w:cs="Times New Roman"/>
+              </w:rPr>
+            </w:pPr>
+            <w:r>
+              <w:rPr>
+                <w:rFonts w:ascii="Consolas" w:eastAsia="Times New Roman" w:hAnsi="Consolas" w:cs="Courier New"/>
+                <w:shd w:val="clear" w:color="auto" w:fill="181D27"/>
+              </w:rPr>
+              <w:t>Career</w:t>
+            </w:r>
+          </w:p>
+        </w:tc>
+        <w:tc>
+          <w:tcPr>
+            <w:tcW w:w="7087" w:type="dxa"/>
+            <w:hideMark/>
+          </w:tcPr>
+          <w:p>
+            <w:pPr>
+              <w:spacing w:before="144" w:after="264"/>
+              <w:rPr>
+                <w:rFonts w:ascii="Helvetica" w:eastAsia="Times New Roman" w:hAnsi="Helvetica" w:cs="Times New Roman"/>
+                <w:lang w:val="es-AR"/>
+              </w:rPr>
+            </w:pPr>
+            <w:r>
+              <w:rPr>
+                <w:rFonts w:ascii="Helvetica" w:eastAsia="Times New Roman" w:hAnsi="Helvetica" w:cs="Times New Roman"/>
+                <w:lang w:val="es-AR"/>
+              </w:rPr>
+              <w:t>Una carrera de una institución. El nombre es único por institución, no global: dos institutos pueden dictar la misma.</w:t>
+            </w:r>
+          </w:p>
+        </w:tc>
+      </w:tr>
+      <w:tr>
         <w:tc>
           <w:tcPr>
             <w:tcW w:w="1696" w:type="dxa"/>
@@ -502,7 +559,7 @@
                 <w:rFonts w:ascii="Consolas" w:eastAsia="Times New Roman" w:hAnsi="Consolas" w:cs="Courier New"/>
                 <w:shd w:val="clear" w:color="auto" w:fill="181D27"/>
               </w:rPr>
-              <w:t>Career</w:t>
+              <w:t>Student</w:t>
             </w:r>
           </w:p>
         </w:tc>
@@ -524,7 +581,7 @@
                 <w:rFonts w:ascii="Helvetica" w:eastAsia="Times New Roman" w:hAnsi="Helvetica" w:cs="Times New Roman"/>
                 <w:lang w:val="es-AR"/>
               </w:rPr>
-              <w:t>Una carrera de una institución. El nombre es único por institución, no global: dos institutos pueden dictar la misma.</w:t>
+              <w:t>El alumno, cargado por el docente. No es una cuenta: no inicia sesión. Cuelga de la institución y no de la cursada, así la misma persona no se duplica en cada materia.</w:t>
             </w:r>
           </w:p>
         </w:tc>
@@ -533,7 +590,7 @@
         <w:tc>
           <w:tcPr>
             <w:tcW w:w="1696" w:type="dxa"/>
-            <w:vMerge w:val="restart"/>
+            <w:vMerge/>
             <w:hideMark/>
           </w:tcPr>
           <w:p>
@@ -541,6 +598,21 @@
               <w:spacing w:before="144" w:after="264"/>
               <w:rPr>
                 <w:rFonts w:ascii="Georgia" w:eastAsia="Times New Roman" w:hAnsi="Georgia" w:cs="Times New Roman"/>
+                <w:lang w:val="es-AR"/>
+              </w:rPr>
+            </w:pPr>
+          </w:p>
+        </w:tc>
+        <w:tc>
+          <w:tcPr>
+            <w:tcW w:w="2694" w:type="dxa"/>
+            <w:hideMark/>
+          </w:tcPr>
+          <w:p>
+            <w:pPr>
+              <w:spacing w:before="144" w:after="264"/>
+              <w:rPr>
+                <w:rFonts w:ascii="Georgia" w:eastAsia="Times New Roman" w:hAnsi="Georgia" w:cs="Times New Roman"/>
               </w:rPr>
             </w:pPr>
             <w:r>
@@ -548,43 +620,7 @@
                 <w:rFonts w:ascii="Consolas" w:eastAsia="Times New Roman" w:hAnsi="Consolas" w:cs="Courier New"/>
                 <w:shd w:val="clear" w:color="auto" w:fill="181D27"/>
               </w:rPr>
-              <w:t>academics</w:t>
-            </w:r>
-          </w:p>
-          <w:p>
-            <w:pPr>
-              <w:spacing w:before="144" w:after="264"/>
-              <w:rPr>
-                <w:rFonts w:ascii="Georgia" w:eastAsia="Times New Roman" w:hAnsi="Georgia" w:cs="Times New Roman"/>
-              </w:rPr>
-            </w:pPr>
-            <w:r>
-              <w:rPr>
-                <w:rFonts w:ascii="Consolas" w:eastAsia="Times New Roman" w:hAnsi="Consolas" w:cs="Courier New"/>
-                <w:shd w:val="clear" w:color="auto" w:fill="181D27"/>
-              </w:rPr>
-              <w:t>projects</w:t>
-            </w:r>
-          </w:p>
-        </w:tc>
-        <w:tc>
-          <w:tcPr>
-            <w:tcW w:w="2694" w:type="dxa"/>
-            <w:hideMark/>
-          </w:tcPr>
-          <w:p>
-            <w:pPr>
-              <w:spacing w:before="144" w:after="264"/>
-              <w:rPr>
-                <w:rFonts w:ascii="Georgia" w:eastAsia="Times New Roman" w:hAnsi="Georgia" w:cs="Times New Roman"/>
-              </w:rPr>
-            </w:pPr>
-            <w:r>
-              <w:rPr>
-                <w:rFonts w:ascii="Consolas" w:eastAsia="Times New Roman" w:hAnsi="Consolas" w:cs="Courier New"/>
-                <w:shd w:val="clear" w:color="auto" w:fill="181D27"/>
-              </w:rPr>
-              <w:t>Student</w:t>
+              <w:t>Course</w:t>
             </w:r>
           </w:p>
         </w:tc>
@@ -606,7 +642,7 @@
                 <w:rFonts w:ascii="Helvetica" w:eastAsia="Times New Roman" w:hAnsi="Helvetica" w:cs="Times New Roman"/>
                 <w:lang w:val="es-AR"/>
               </w:rPr>
-              <w:t>El alumno, cargado por el docente. No es una cuenta: no inicia sesión. Cuelga de la institución y no de la cursada, así la misma persona no se duplica en cada materia.</w:t>
+              <w:t>La cursada: la comisión concreta donde un docente organiza a sus alumnos. El ciclo lectivo son dos campos propios (año y cuatrimestre) y no una tabla aparte.</w:t>
             </w:r>
           </w:p>
         </w:tc>
@@ -640,13 +676,15 @@
                 <w:rFonts w:ascii="Georgia" w:eastAsia="Times New Roman" w:hAnsi="Georgia" w:cs="Times New Roman"/>
               </w:rPr>
             </w:pPr>
+            <w:proofErr w:type="spellStart"/>
             <w:r>
               <w:rPr>
                 <w:rFonts w:ascii="Consolas" w:eastAsia="Times New Roman" w:hAnsi="Consolas" w:cs="Courier New"/>
                 <w:shd w:val="clear" w:color="auto" w:fill="181D27"/>
               </w:rPr>
-              <w:t>Course</w:t>
-            </w:r>
+              <w:t>CourseStudent</w:t>
+            </w:r>
+            <w:proofErr w:type="spellEnd"/>
           </w:p>
         </w:tc>
         <w:tc>
@@ -667,7 +705,7 @@
                 <w:rFonts w:ascii="Helvetica" w:eastAsia="Times New Roman" w:hAnsi="Helvetica" w:cs="Times New Roman"/>
                 <w:lang w:val="es-AR"/>
               </w:rPr>
-              <w:t>La cursada: la comisión concreta donde un docente organiza a sus alumnos. El ciclo lectivo son dos campos propios (año y cuatrimestre) y no una tabla aparte.</w:t>
+              <w:t>La inscripción: este alumno cursa esta comisión. Es la tabla intermedia entre cursada y alumno, escrita a mano.</w:t>
             </w:r>
           </w:p>
         </w:tc>
@@ -676,7 +714,7 @@
         <w:tc>
           <w:tcPr>
             <w:tcW w:w="1696" w:type="dxa"/>
-            <w:vMerge/>
+            <w:vMerge w:val="restart"/>
             <w:hideMark/>
           </w:tcPr>
           <w:p>
@@ -687,6 +725,13 @@
                 <w:lang w:val="es-AR"/>
               </w:rPr>
             </w:pPr>
+            <w:r>
+              <w:rPr>
+                <w:rFonts w:ascii="Consolas" w:eastAsia="Times New Roman" w:hAnsi="Consolas" w:cs="Courier New"/>
+                <w:shd w:val="clear" w:color="auto" w:fill="181D27"/>
+              </w:rPr>
+              <w:t>projects</w:t>
+            </w:r>
           </w:p>
         </w:tc>
         <w:tc>
@@ -707,7 +752,7 @@
                 <w:rFonts w:ascii="Consolas" w:eastAsia="Times New Roman" w:hAnsi="Consolas" w:cs="Courier New"/>
                 <w:shd w:val="clear" w:color="auto" w:fill="181D27"/>
               </w:rPr>
-              <w:t>CourseStudent</w:t>
+              <w:t>ProjectAsset</w:t>
             </w:r>
             <w:proofErr w:type="spellEnd"/>
           </w:p>
@@ -730,7 +775,7 @@
                 <w:rFonts w:ascii="Helvetica" w:eastAsia="Times New Roman" w:hAnsi="Helvetica" w:cs="Times New Roman"/>
                 <w:lang w:val="es-AR"/>
               </w:rPr>
-              <w:t>La inscripción: este alumno cursa esta comisión. Es la tabla intermedia entre cursada y alumno, escrita a mano.</w:t>
+              <w:t>Lo que se sube y queda guardado en el servidor: imágenes y documentos. Una de las imágenes es la portada de la ficha.</w:t>
             </w:r>
           </w:p>
         </w:tc>
@@ -750,75 +795,6 @@
                 <w:lang w:val="es-AR"/>
               </w:rPr>
             </w:pPr>
-          </w:p>
-        </w:tc>
-        <w:tc>
-          <w:tcPr>
-            <w:tcW w:w="2694" w:type="dxa"/>
-            <w:hideMark/>
-          </w:tcPr>
-          <w:p>
-            <w:pPr>
-              <w:spacing w:before="144" w:after="264"/>
-              <w:rPr>
-                <w:rFonts w:ascii="Georgia" w:eastAsia="Times New Roman" w:hAnsi="Georgia" w:cs="Times New Roman"/>
-              </w:rPr>
-            </w:pPr>
-            <w:proofErr w:type="spellStart"/>
-            <w:r>
-              <w:rPr>
-                <w:rFonts w:ascii="Consolas" w:eastAsia="Times New Roman" w:hAnsi="Consolas" w:cs="Courier New"/>
-                <w:shd w:val="clear" w:color="auto" w:fill="181D27"/>
-              </w:rPr>
-              <w:t>ProjectAsset</w:t>
-            </w:r>
-            <w:proofErr w:type="spellEnd"/>
-          </w:p>
-        </w:tc>
-        <w:tc>
-          <w:tcPr>
-            <w:tcW w:w="7087" w:type="dxa"/>
-            <w:hideMark/>
-          </w:tcPr>
-          <w:p>
-            <w:pPr>
-              <w:spacing w:before="144" w:after="264"/>
-              <w:rPr>
-                <w:rFonts w:ascii="Helvetica" w:eastAsia="Times New Roman" w:hAnsi="Helvetica" w:cs="Times New Roman"/>
-                <w:lang w:val="es-AR"/>
-              </w:rPr>
-            </w:pPr>
-            <w:r>
-              <w:rPr>
-                <w:rFonts w:ascii="Helvetica" w:eastAsia="Times New Roman" w:hAnsi="Helvetica" w:cs="Times New Roman"/>
-                <w:lang w:val="es-AR"/>
-              </w:rPr>
-              <w:t>Lo que se sube y queda guardado en el servidor: imágenes y documentos. Una de las imágenes es la portada de la ficha.</w:t>
-            </w:r>
-          </w:p>
-        </w:tc>
-      </w:tr>
-      <w:tr>
-        <w:tc>
-          <w:tcPr>
-            <w:tcW w:w="1696" w:type="dxa"/>
-            <w:vMerge w:val="restart"/>
-            <w:hideMark/>
-          </w:tcPr>
-          <w:p>
-            <w:pPr>
-              <w:spacing w:before="144" w:after="264"/>
-              <w:rPr>
-                <w:rFonts w:ascii="Georgia" w:eastAsia="Times New Roman" w:hAnsi="Georgia" w:cs="Times New Roman"/>
-              </w:rPr>
-            </w:pPr>
-            <w:r>
-              <w:rPr>
-                <w:rFonts w:ascii="Consolas" w:eastAsia="Times New Roman" w:hAnsi="Consolas" w:cs="Courier New"/>
-                <w:shd w:val="clear" w:color="auto" w:fill="181D27"/>
-              </w:rPr>
-              <w:t>projects</w:t>
-            </w:r>
           </w:p>
         </w:tc>
         <w:tc>
@@ -1150,6 +1126,2211 @@
         </w:rPr>
       </w:pPr>
     </w:p>
+    <w:p>
+      <w:pPr>
+        <w:rPr>
+          <w:lang w:val="es-AR"/>
+        </w:rPr>
+      </w:pPr>
+    </w:p>
+    <w:p>
+      <w:pPr>
+        <w:rPr>
+          <w:lang w:val="es-AR"/>
+        </w:rPr>
+      </w:pPr>
+    </w:p>
+    <w:tbl>
+      <w:tblPr>
+        <w:tblStyle w:val="Tablaconcuadrcula"/>
+        <w:tblW w:w="0" w:type="auto"/>
+        <w:tblLook w:val="04A0" w:firstRow="1" w:lastRow="0" w:firstColumn="1" w:lastColumn="0" w:noHBand="0" w:noVBand="1"/>
+      </w:tblPr>
+      <w:tblGrid>
+        <w:gridCol w:w="2332"/>
+        <w:gridCol w:w="5886"/>
+        <w:gridCol w:w="3259"/>
+      </w:tblGrid>
+      <w:tr>
+        <w:tc>
+          <w:tcPr>
+            <w:tcW w:w="2328" w:type="dxa"/>
+            <w:hideMark/>
+          </w:tcPr>
+          <w:p>
+            <w:pPr>
+              <w:spacing w:before="144" w:after="264"/>
+              <w:rPr>
+                <w:rFonts w:ascii="Helvetica" w:eastAsia="Times New Roman" w:hAnsi="Helvetica" w:cs="Helvetica"/>
+                <w:b/>
+                <w:bCs/>
+                <w:sz w:val="28"/>
+                <w:szCs w:val="26"/>
+              </w:rPr>
+            </w:pPr>
+            <w:proofErr w:type="spellStart"/>
+            <w:r>
+              <w:rPr>
+                <w:rFonts w:ascii="Helvetica" w:eastAsia="Times New Roman" w:hAnsi="Helvetica" w:cs="Helvetica"/>
+                <w:b/>
+                <w:bCs/>
+                <w:sz w:val="28"/>
+                <w:szCs w:val="26"/>
+              </w:rPr>
+              <w:lastRenderedPageBreak/>
+              <w:t>Archivo</w:t>
+            </w:r>
+            <w:proofErr w:type="spellEnd"/>
+          </w:p>
+        </w:tc>
+        <w:tc>
+          <w:tcPr>
+            <w:tcW w:w="5889" w:type="dxa"/>
+            <w:hideMark/>
+          </w:tcPr>
+          <w:p>
+            <w:pPr>
+              <w:spacing w:before="144" w:after="264"/>
+              <w:rPr>
+                <w:rFonts w:ascii="Helvetica" w:eastAsia="Times New Roman" w:hAnsi="Helvetica" w:cs="Helvetica"/>
+                <w:b/>
+                <w:bCs/>
+                <w:sz w:val="28"/>
+                <w:szCs w:val="26"/>
+              </w:rPr>
+            </w:pPr>
+            <w:proofErr w:type="spellStart"/>
+            <w:r>
+              <w:rPr>
+                <w:rFonts w:ascii="Helvetica" w:eastAsia="Times New Roman" w:hAnsi="Helvetica" w:cs="Helvetica"/>
+                <w:b/>
+                <w:bCs/>
+                <w:sz w:val="28"/>
+                <w:szCs w:val="26"/>
+              </w:rPr>
+              <w:t>Qué</w:t>
+            </w:r>
+            <w:proofErr w:type="spellEnd"/>
+            <w:r>
+              <w:rPr>
+                <w:rFonts w:ascii="Helvetica" w:eastAsia="Times New Roman" w:hAnsi="Helvetica" w:cs="Helvetica"/>
+                <w:b/>
+                <w:bCs/>
+                <w:sz w:val="28"/>
+                <w:szCs w:val="26"/>
+              </w:rPr>
+              <w:t xml:space="preserve"> </w:t>
+            </w:r>
+            <w:proofErr w:type="spellStart"/>
+            <w:r>
+              <w:rPr>
+                <w:rFonts w:ascii="Helvetica" w:eastAsia="Times New Roman" w:hAnsi="Helvetica" w:cs="Helvetica"/>
+                <w:b/>
+                <w:bCs/>
+                <w:sz w:val="28"/>
+                <w:szCs w:val="26"/>
+              </w:rPr>
+              <w:t>es</w:t>
+            </w:r>
+            <w:proofErr w:type="spellEnd"/>
+          </w:p>
+        </w:tc>
+        <w:tc>
+          <w:tcPr>
+            <w:tcW w:w="3260" w:type="dxa"/>
+            <w:hideMark/>
+          </w:tcPr>
+          <w:p>
+            <w:pPr>
+              <w:spacing w:before="144" w:after="264"/>
+              <w:rPr>
+                <w:rFonts w:ascii="Helvetica" w:eastAsia="Times New Roman" w:hAnsi="Helvetica" w:cs="Helvetica"/>
+                <w:b/>
+                <w:bCs/>
+                <w:sz w:val="28"/>
+                <w:szCs w:val="26"/>
+                <w:lang w:val="es-AR"/>
+              </w:rPr>
+            </w:pPr>
+            <w:r>
+              <w:rPr>
+                <w:rFonts w:ascii="Helvetica" w:eastAsia="Times New Roman" w:hAnsi="Helvetica" w:cs="Helvetica"/>
+                <w:b/>
+                <w:bCs/>
+                <w:sz w:val="28"/>
+                <w:szCs w:val="26"/>
+                <w:lang w:val="es-AR"/>
+              </w:rPr>
+              <w:t>Cuánto lo vas a tocar</w:t>
+            </w:r>
+          </w:p>
+        </w:tc>
+      </w:tr>
+      <w:tr>
+        <w:tc>
+          <w:tcPr>
+            <w:tcW w:w="0" w:type="auto"/>
+            <w:hideMark/>
+          </w:tcPr>
+          <w:p>
+            <w:pPr>
+              <w:spacing w:before="144" w:after="264"/>
+              <w:rPr>
+                <w:rFonts w:ascii="Helvetica" w:eastAsia="Times New Roman" w:hAnsi="Helvetica" w:cs="Helvetica"/>
+                <w:sz w:val="28"/>
+                <w:szCs w:val="26"/>
+              </w:rPr>
+            </w:pPr>
+            <w:r>
+              <w:rPr>
+                <w:rFonts w:ascii="Helvetica" w:eastAsia="Times New Roman" w:hAnsi="Helvetica" w:cs="Helvetica"/>
+                <w:sz w:val="28"/>
+                <w:szCs w:val="26"/>
+                <w:shd w:val="clear" w:color="auto" w:fill="181D27"/>
+              </w:rPr>
+              <w:t>manage.py</w:t>
+            </w:r>
+          </w:p>
+        </w:tc>
+        <w:tc>
+          <w:tcPr>
+            <w:tcW w:w="5889" w:type="dxa"/>
+            <w:hideMark/>
+          </w:tcPr>
+          <w:p>
+            <w:pPr>
+              <w:spacing w:before="144" w:after="264"/>
+              <w:rPr>
+                <w:rFonts w:ascii="Helvetica" w:eastAsia="Times New Roman" w:hAnsi="Helvetica" w:cs="Helvetica"/>
+                <w:sz w:val="28"/>
+                <w:szCs w:val="26"/>
+                <w:lang w:val="es-AR"/>
+              </w:rPr>
+            </w:pPr>
+            <w:r>
+              <w:rPr>
+                <w:rFonts w:ascii="Helvetica" w:eastAsia="Times New Roman" w:hAnsi="Helvetica" w:cs="Helvetica"/>
+                <w:sz w:val="28"/>
+                <w:szCs w:val="26"/>
+                <w:lang w:val="es-AR"/>
+              </w:rPr>
+              <w:t xml:space="preserve">El comando del proyecto: migrar, levantar el servidor de desarrollo, correr las pruebas, crear un </w:t>
+            </w:r>
+            <w:proofErr w:type="spellStart"/>
+            <w:r>
+              <w:rPr>
+                <w:rFonts w:ascii="Helvetica" w:eastAsia="Times New Roman" w:hAnsi="Helvetica" w:cs="Helvetica"/>
+                <w:sz w:val="28"/>
+                <w:szCs w:val="26"/>
+                <w:lang w:val="es-AR"/>
+              </w:rPr>
+              <w:t>superusuario</w:t>
+            </w:r>
+            <w:proofErr w:type="spellEnd"/>
+            <w:r>
+              <w:rPr>
+                <w:rFonts w:ascii="Helvetica" w:eastAsia="Times New Roman" w:hAnsi="Helvetica" w:cs="Helvetica"/>
+                <w:sz w:val="28"/>
+                <w:szCs w:val="26"/>
+                <w:lang w:val="es-AR"/>
+              </w:rPr>
+              <w:t>.</w:t>
+            </w:r>
+          </w:p>
+        </w:tc>
+        <w:tc>
+          <w:tcPr>
+            <w:tcW w:w="3260" w:type="dxa"/>
+            <w:hideMark/>
+          </w:tcPr>
+          <w:p>
+            <w:pPr>
+              <w:spacing w:before="144" w:after="264"/>
+              <w:rPr>
+                <w:rFonts w:ascii="Helvetica" w:eastAsia="Times New Roman" w:hAnsi="Helvetica" w:cs="Helvetica"/>
+                <w:sz w:val="28"/>
+                <w:szCs w:val="26"/>
+                <w:lang w:val="es-AR"/>
+              </w:rPr>
+            </w:pPr>
+            <w:r>
+              <w:rPr>
+                <w:rFonts w:ascii="Helvetica" w:eastAsia="Times New Roman" w:hAnsi="Helvetica" w:cs="Helvetica"/>
+                <w:sz w:val="28"/>
+                <w:szCs w:val="26"/>
+                <w:lang w:val="es-AR"/>
+              </w:rPr>
+              <w:t>Nunca se edita, se usa todo el tiempo</w:t>
+            </w:r>
+          </w:p>
+        </w:tc>
+      </w:tr>
+      <w:tr>
+        <w:tc>
+          <w:tcPr>
+            <w:tcW w:w="0" w:type="auto"/>
+            <w:hideMark/>
+          </w:tcPr>
+          <w:p>
+            <w:pPr>
+              <w:spacing w:before="144" w:after="264"/>
+              <w:rPr>
+                <w:rFonts w:ascii="Helvetica" w:eastAsia="Times New Roman" w:hAnsi="Helvetica" w:cs="Helvetica"/>
+                <w:sz w:val="28"/>
+                <w:szCs w:val="26"/>
+              </w:rPr>
+            </w:pPr>
+            <w:r>
+              <w:rPr>
+                <w:rFonts w:ascii="Helvetica" w:eastAsia="Times New Roman" w:hAnsi="Helvetica" w:cs="Helvetica"/>
+                <w:sz w:val="28"/>
+                <w:szCs w:val="26"/>
+                <w:shd w:val="clear" w:color="auto" w:fill="181D27"/>
+              </w:rPr>
+              <w:t>settings.py</w:t>
+            </w:r>
+          </w:p>
+        </w:tc>
+        <w:tc>
+          <w:tcPr>
+            <w:tcW w:w="5889" w:type="dxa"/>
+            <w:hideMark/>
+          </w:tcPr>
+          <w:p>
+            <w:pPr>
+              <w:spacing w:before="144" w:after="264"/>
+              <w:rPr>
+                <w:rFonts w:ascii="Helvetica" w:eastAsia="Times New Roman" w:hAnsi="Helvetica" w:cs="Helvetica"/>
+                <w:sz w:val="28"/>
+                <w:szCs w:val="26"/>
+                <w:lang w:val="es-AR"/>
+              </w:rPr>
+            </w:pPr>
+            <w:r>
+              <w:rPr>
+                <w:rFonts w:ascii="Helvetica" w:eastAsia="Times New Roman" w:hAnsi="Helvetica" w:cs="Helvetica"/>
+                <w:sz w:val="28"/>
+                <w:szCs w:val="26"/>
+                <w:lang w:val="es-AR"/>
+              </w:rPr>
+              <w:t>Un módulo de Python con variables en mayúscula: qué apps hay, qué base de datos, qué zona horaria, dónde van los archivos subidos.</w:t>
+            </w:r>
+          </w:p>
+        </w:tc>
+        <w:tc>
+          <w:tcPr>
+            <w:tcW w:w="3260" w:type="dxa"/>
+            <w:hideMark/>
+          </w:tcPr>
+          <w:p>
+            <w:pPr>
+              <w:spacing w:before="144" w:after="264"/>
+              <w:rPr>
+                <w:rFonts w:ascii="Helvetica" w:eastAsia="Times New Roman" w:hAnsi="Helvetica" w:cs="Helvetica"/>
+                <w:sz w:val="28"/>
+                <w:szCs w:val="26"/>
+                <w:lang w:val="es-AR"/>
+              </w:rPr>
+            </w:pPr>
+            <w:r>
+              <w:rPr>
+                <w:rFonts w:ascii="Helvetica" w:eastAsia="Times New Roman" w:hAnsi="Helvetica" w:cs="Helvetica"/>
+                <w:sz w:val="28"/>
+                <w:szCs w:val="26"/>
+                <w:lang w:val="es-AR"/>
+              </w:rPr>
+              <w:t>Mucho, y de a poco</w:t>
+            </w:r>
+          </w:p>
+        </w:tc>
+      </w:tr>
+      <w:tr>
+        <w:tc>
+          <w:tcPr>
+            <w:tcW w:w="0" w:type="auto"/>
+            <w:hideMark/>
+          </w:tcPr>
+          <w:p>
+            <w:pPr>
+              <w:spacing w:before="144" w:after="264"/>
+              <w:rPr>
+                <w:rFonts w:ascii="Helvetica" w:eastAsia="Times New Roman" w:hAnsi="Helvetica" w:cs="Helvetica"/>
+                <w:sz w:val="28"/>
+                <w:szCs w:val="26"/>
+              </w:rPr>
+            </w:pPr>
+            <w:r>
+              <w:rPr>
+                <w:rFonts w:ascii="Helvetica" w:eastAsia="Times New Roman" w:hAnsi="Helvetica" w:cs="Helvetica"/>
+                <w:sz w:val="28"/>
+                <w:szCs w:val="26"/>
+                <w:shd w:val="clear" w:color="auto" w:fill="181D27"/>
+              </w:rPr>
+              <w:t>urls.py</w:t>
+            </w:r>
+          </w:p>
+        </w:tc>
+        <w:tc>
+          <w:tcPr>
+            <w:tcW w:w="5889" w:type="dxa"/>
+            <w:hideMark/>
+          </w:tcPr>
+          <w:p>
+            <w:pPr>
+              <w:spacing w:before="144" w:after="264"/>
+              <w:rPr>
+                <w:rFonts w:ascii="Helvetica" w:eastAsia="Times New Roman" w:hAnsi="Helvetica" w:cs="Helvetica"/>
+                <w:sz w:val="28"/>
+                <w:szCs w:val="26"/>
+                <w:lang w:val="es-AR"/>
+              </w:rPr>
+            </w:pPr>
+            <w:r>
+              <w:rPr>
+                <w:rFonts w:ascii="Helvetica" w:eastAsia="Times New Roman" w:hAnsi="Helvetica" w:cs="Helvetica"/>
+                <w:sz w:val="28"/>
+                <w:szCs w:val="26"/>
+                <w:lang w:val="es-AR"/>
+              </w:rPr>
+              <w:t>El mapa de rutas del proyecto: qué URL atiende qué código.</w:t>
+            </w:r>
+          </w:p>
+        </w:tc>
+        <w:tc>
+          <w:tcPr>
+            <w:tcW w:w="3260" w:type="dxa"/>
+            <w:hideMark/>
+          </w:tcPr>
+          <w:p>
+            <w:pPr>
+              <w:spacing w:before="144" w:after="264"/>
+              <w:rPr>
+                <w:rFonts w:ascii="Helvetica" w:eastAsia="Times New Roman" w:hAnsi="Helvetica" w:cs="Helvetica"/>
+                <w:sz w:val="28"/>
+                <w:szCs w:val="26"/>
+                <w:lang w:val="es-AR"/>
+              </w:rPr>
+            </w:pPr>
+            <w:r>
+              <w:rPr>
+                <w:rFonts w:ascii="Helvetica" w:eastAsia="Times New Roman" w:hAnsi="Helvetica" w:cs="Helvetica"/>
+                <w:sz w:val="28"/>
+                <w:szCs w:val="26"/>
+                <w:lang w:val="es-AR"/>
+              </w:rPr>
+              <w:t>Una vez, casi al final</w:t>
+            </w:r>
+          </w:p>
+        </w:tc>
+      </w:tr>
+      <w:tr>
+        <w:tc>
+          <w:tcPr>
+            <w:tcW w:w="0" w:type="auto"/>
+            <w:hideMark/>
+          </w:tcPr>
+          <w:p>
+            <w:pPr>
+              <w:spacing w:before="144" w:after="264"/>
+              <w:rPr>
+                <w:rFonts w:ascii="Helvetica" w:eastAsia="Times New Roman" w:hAnsi="Helvetica" w:cs="Helvetica"/>
+                <w:sz w:val="28"/>
+                <w:szCs w:val="26"/>
+                <w:lang w:val="es-AR"/>
+              </w:rPr>
+            </w:pPr>
+            <w:r>
+              <w:rPr>
+                <w:rFonts w:ascii="Helvetica" w:eastAsia="Times New Roman" w:hAnsi="Helvetica" w:cs="Helvetica"/>
+                <w:sz w:val="28"/>
+                <w:szCs w:val="26"/>
+                <w:shd w:val="clear" w:color="auto" w:fill="181D27"/>
+                <w:lang w:val="es-AR"/>
+              </w:rPr>
+              <w:t>wsgi.py</w:t>
+            </w:r>
+            <w:r>
+              <w:rPr>
+                <w:rFonts w:ascii="Helvetica" w:eastAsia="Times New Roman" w:hAnsi="Helvetica" w:cs="Helvetica"/>
+                <w:sz w:val="28"/>
+                <w:szCs w:val="26"/>
+                <w:lang w:val="es-AR"/>
+              </w:rPr>
+              <w:t xml:space="preserve"> y </w:t>
+            </w:r>
+            <w:r>
+              <w:rPr>
+                <w:rFonts w:ascii="Helvetica" w:eastAsia="Times New Roman" w:hAnsi="Helvetica" w:cs="Helvetica"/>
+                <w:sz w:val="28"/>
+                <w:szCs w:val="26"/>
+                <w:shd w:val="clear" w:color="auto" w:fill="181D27"/>
+                <w:lang w:val="es-AR"/>
+              </w:rPr>
+              <w:t>asgi.py</w:t>
+            </w:r>
+          </w:p>
+        </w:tc>
+        <w:tc>
+          <w:tcPr>
+            <w:tcW w:w="5889" w:type="dxa"/>
+            <w:hideMark/>
+          </w:tcPr>
+          <w:p>
+            <w:pPr>
+              <w:spacing w:before="144" w:after="264"/>
+              <w:rPr>
+                <w:rFonts w:ascii="Helvetica" w:eastAsia="Times New Roman" w:hAnsi="Helvetica" w:cs="Helvetica"/>
+                <w:sz w:val="28"/>
+                <w:szCs w:val="26"/>
+                <w:lang w:val="es-AR"/>
+              </w:rPr>
+            </w:pPr>
+            <w:r>
+              <w:rPr>
+                <w:rFonts w:ascii="Helvetica" w:eastAsia="Times New Roman" w:hAnsi="Helvetica" w:cs="Helvetica"/>
+                <w:sz w:val="28"/>
+                <w:szCs w:val="26"/>
+                <w:lang w:val="es-AR"/>
+              </w:rPr>
+              <w:t>Los puntos de entrada que usa un servidor real para levantar la aplicación.</w:t>
+            </w:r>
+          </w:p>
+        </w:tc>
+        <w:tc>
+          <w:tcPr>
+            <w:tcW w:w="3260" w:type="dxa"/>
+            <w:hideMark/>
+          </w:tcPr>
+          <w:p>
+            <w:pPr>
+              <w:spacing w:before="144" w:after="264"/>
+              <w:rPr>
+                <w:rFonts w:ascii="Helvetica" w:eastAsia="Times New Roman" w:hAnsi="Helvetica" w:cs="Helvetica"/>
+                <w:sz w:val="28"/>
+                <w:szCs w:val="26"/>
+              </w:rPr>
+            </w:pPr>
+            <w:proofErr w:type="spellStart"/>
+            <w:r>
+              <w:rPr>
+                <w:rFonts w:ascii="Helvetica" w:eastAsia="Times New Roman" w:hAnsi="Helvetica" w:cs="Helvetica"/>
+                <w:sz w:val="28"/>
+                <w:szCs w:val="26"/>
+              </w:rPr>
+              <w:t>Nunca</w:t>
+            </w:r>
+            <w:proofErr w:type="spellEnd"/>
+          </w:p>
+        </w:tc>
+      </w:tr>
+      <w:tr>
+        <w:tc>
+          <w:tcPr>
+            <w:tcW w:w="0" w:type="auto"/>
+            <w:hideMark/>
+          </w:tcPr>
+          <w:p>
+            <w:pPr>
+              <w:spacing w:before="144" w:after="264"/>
+              <w:rPr>
+                <w:rFonts w:ascii="Helvetica" w:eastAsia="Times New Roman" w:hAnsi="Helvetica" w:cs="Helvetica"/>
+                <w:sz w:val="28"/>
+                <w:szCs w:val="26"/>
+              </w:rPr>
+            </w:pPr>
+            <w:r>
+              <w:rPr>
+                <w:rFonts w:ascii="Helvetica" w:eastAsia="Times New Roman" w:hAnsi="Helvetica" w:cs="Helvetica"/>
+                <w:sz w:val="28"/>
+                <w:szCs w:val="26"/>
+                <w:shd w:val="clear" w:color="auto" w:fill="181D27"/>
+              </w:rPr>
+              <w:t>models.py</w:t>
+            </w:r>
+          </w:p>
+        </w:tc>
+        <w:tc>
+          <w:tcPr>
+            <w:tcW w:w="5889" w:type="dxa"/>
+            <w:hideMark/>
+          </w:tcPr>
+          <w:p>
+            <w:pPr>
+              <w:spacing w:before="144" w:after="264"/>
+              <w:rPr>
+                <w:rFonts w:ascii="Helvetica" w:eastAsia="Times New Roman" w:hAnsi="Helvetica" w:cs="Helvetica"/>
+                <w:sz w:val="28"/>
+                <w:szCs w:val="26"/>
+                <w:lang w:val="es-AR"/>
+              </w:rPr>
+            </w:pPr>
+            <w:r>
+              <w:rPr>
+                <w:rFonts w:ascii="Helvetica" w:eastAsia="Times New Roman" w:hAnsi="Helvetica" w:cs="Helvetica"/>
+                <w:sz w:val="28"/>
+                <w:szCs w:val="26"/>
+                <w:lang w:val="es-AR"/>
+              </w:rPr>
+              <w:t>Las tablas de esa app escritas como clases. Es el archivo más importante de cada app.</w:t>
+            </w:r>
+          </w:p>
+        </w:tc>
+        <w:tc>
+          <w:tcPr>
+            <w:tcW w:w="3260" w:type="dxa"/>
+            <w:hideMark/>
+          </w:tcPr>
+          <w:p>
+            <w:pPr>
+              <w:spacing w:before="144" w:after="264"/>
+              <w:rPr>
+                <w:rFonts w:ascii="Helvetica" w:eastAsia="Times New Roman" w:hAnsi="Helvetica" w:cs="Helvetica"/>
+                <w:sz w:val="28"/>
+                <w:szCs w:val="26"/>
+              </w:rPr>
+            </w:pPr>
+            <w:proofErr w:type="spellStart"/>
+            <w:r>
+              <w:rPr>
+                <w:rFonts w:ascii="Helvetica" w:eastAsia="Times New Roman" w:hAnsi="Helvetica" w:cs="Helvetica"/>
+                <w:sz w:val="28"/>
+                <w:szCs w:val="26"/>
+              </w:rPr>
+              <w:t>En</w:t>
+            </w:r>
+            <w:proofErr w:type="spellEnd"/>
+            <w:r>
+              <w:rPr>
+                <w:rFonts w:ascii="Helvetica" w:eastAsia="Times New Roman" w:hAnsi="Helvetica" w:cs="Helvetica"/>
+                <w:sz w:val="28"/>
+                <w:szCs w:val="26"/>
+              </w:rPr>
+              <w:t xml:space="preserve"> </w:t>
+            </w:r>
+            <w:proofErr w:type="spellStart"/>
+            <w:r>
+              <w:rPr>
+                <w:rFonts w:ascii="Helvetica" w:eastAsia="Times New Roman" w:hAnsi="Helvetica" w:cs="Helvetica"/>
+                <w:sz w:val="28"/>
+                <w:szCs w:val="26"/>
+              </w:rPr>
+              <w:t>cada</w:t>
+            </w:r>
+            <w:proofErr w:type="spellEnd"/>
+            <w:r>
+              <w:rPr>
+                <w:rFonts w:ascii="Helvetica" w:eastAsia="Times New Roman" w:hAnsi="Helvetica" w:cs="Helvetica"/>
+                <w:sz w:val="28"/>
+                <w:szCs w:val="26"/>
+              </w:rPr>
+              <w:t xml:space="preserve"> app</w:t>
+            </w:r>
+          </w:p>
+        </w:tc>
+      </w:tr>
+      <w:tr>
+        <w:tc>
+          <w:tcPr>
+            <w:tcW w:w="0" w:type="auto"/>
+            <w:hideMark/>
+          </w:tcPr>
+          <w:p>
+            <w:pPr>
+              <w:spacing w:before="144" w:after="264"/>
+              <w:rPr>
+                <w:rFonts w:ascii="Helvetica" w:eastAsia="Times New Roman" w:hAnsi="Helvetica" w:cs="Helvetica"/>
+                <w:sz w:val="28"/>
+                <w:szCs w:val="26"/>
+              </w:rPr>
+            </w:pPr>
+            <w:r>
+              <w:rPr>
+                <w:rFonts w:ascii="Helvetica" w:eastAsia="Times New Roman" w:hAnsi="Helvetica" w:cs="Helvetica"/>
+                <w:sz w:val="28"/>
+                <w:szCs w:val="26"/>
+                <w:shd w:val="clear" w:color="auto" w:fill="181D27"/>
+              </w:rPr>
+              <w:t>admin.py</w:t>
+            </w:r>
+          </w:p>
+        </w:tc>
+        <w:tc>
+          <w:tcPr>
+            <w:tcW w:w="5889" w:type="dxa"/>
+            <w:hideMark/>
+          </w:tcPr>
+          <w:p>
+            <w:pPr>
+              <w:spacing w:before="144" w:after="264"/>
+              <w:rPr>
+                <w:rFonts w:ascii="Helvetica" w:eastAsia="Times New Roman" w:hAnsi="Helvetica" w:cs="Helvetica"/>
+                <w:sz w:val="28"/>
+                <w:szCs w:val="26"/>
+                <w:lang w:val="es-AR"/>
+              </w:rPr>
+            </w:pPr>
+            <w:r>
+              <w:rPr>
+                <w:rFonts w:ascii="Helvetica" w:eastAsia="Times New Roman" w:hAnsi="Helvetica" w:cs="Helvetica"/>
+                <w:sz w:val="28"/>
+                <w:szCs w:val="26"/>
+                <w:lang w:val="es-AR"/>
+              </w:rPr>
+              <w:t>Qué modelos aparecen en el panel de administración y cómo se ven.</w:t>
+            </w:r>
+          </w:p>
+        </w:tc>
+        <w:tc>
+          <w:tcPr>
+            <w:tcW w:w="3260" w:type="dxa"/>
+            <w:hideMark/>
+          </w:tcPr>
+          <w:p>
+            <w:pPr>
+              <w:spacing w:before="144" w:after="264"/>
+              <w:rPr>
+                <w:rFonts w:ascii="Helvetica" w:eastAsia="Times New Roman" w:hAnsi="Helvetica" w:cs="Helvetica"/>
+                <w:sz w:val="28"/>
+                <w:szCs w:val="26"/>
+              </w:rPr>
+            </w:pPr>
+            <w:proofErr w:type="spellStart"/>
+            <w:r>
+              <w:rPr>
+                <w:rFonts w:ascii="Helvetica" w:eastAsia="Times New Roman" w:hAnsi="Helvetica" w:cs="Helvetica"/>
+                <w:sz w:val="28"/>
+                <w:szCs w:val="26"/>
+              </w:rPr>
+              <w:t>En</w:t>
+            </w:r>
+            <w:proofErr w:type="spellEnd"/>
+            <w:r>
+              <w:rPr>
+                <w:rFonts w:ascii="Helvetica" w:eastAsia="Times New Roman" w:hAnsi="Helvetica" w:cs="Helvetica"/>
+                <w:sz w:val="28"/>
+                <w:szCs w:val="26"/>
+              </w:rPr>
+              <w:t xml:space="preserve"> </w:t>
+            </w:r>
+            <w:proofErr w:type="spellStart"/>
+            <w:r>
+              <w:rPr>
+                <w:rFonts w:ascii="Helvetica" w:eastAsia="Times New Roman" w:hAnsi="Helvetica" w:cs="Helvetica"/>
+                <w:sz w:val="28"/>
+                <w:szCs w:val="26"/>
+              </w:rPr>
+              <w:t>casi</w:t>
+            </w:r>
+            <w:proofErr w:type="spellEnd"/>
+            <w:r>
+              <w:rPr>
+                <w:rFonts w:ascii="Helvetica" w:eastAsia="Times New Roman" w:hAnsi="Helvetica" w:cs="Helvetica"/>
+                <w:sz w:val="28"/>
+                <w:szCs w:val="26"/>
+              </w:rPr>
+              <w:t xml:space="preserve"> </w:t>
+            </w:r>
+            <w:proofErr w:type="spellStart"/>
+            <w:r>
+              <w:rPr>
+                <w:rFonts w:ascii="Helvetica" w:eastAsia="Times New Roman" w:hAnsi="Helvetica" w:cs="Helvetica"/>
+                <w:sz w:val="28"/>
+                <w:szCs w:val="26"/>
+              </w:rPr>
+              <w:t>todas</w:t>
+            </w:r>
+            <w:proofErr w:type="spellEnd"/>
+          </w:p>
+        </w:tc>
+      </w:tr>
+      <w:tr>
+        <w:tc>
+          <w:tcPr>
+            <w:tcW w:w="0" w:type="auto"/>
+            <w:hideMark/>
+          </w:tcPr>
+          <w:p>
+            <w:pPr>
+              <w:spacing w:before="144" w:after="264"/>
+              <w:rPr>
+                <w:rFonts w:ascii="Helvetica" w:eastAsia="Times New Roman" w:hAnsi="Helvetica" w:cs="Helvetica"/>
+                <w:sz w:val="28"/>
+                <w:szCs w:val="26"/>
+              </w:rPr>
+            </w:pPr>
+            <w:r>
+              <w:rPr>
+                <w:rFonts w:ascii="Helvetica" w:eastAsia="Times New Roman" w:hAnsi="Helvetica" w:cs="Helvetica"/>
+                <w:sz w:val="28"/>
+                <w:szCs w:val="26"/>
+                <w:shd w:val="clear" w:color="auto" w:fill="181D27"/>
+              </w:rPr>
+              <w:t>apps.py</w:t>
+            </w:r>
+          </w:p>
+        </w:tc>
+        <w:tc>
+          <w:tcPr>
+            <w:tcW w:w="5889" w:type="dxa"/>
+            <w:hideMark/>
+          </w:tcPr>
+          <w:p>
+            <w:pPr>
+              <w:spacing w:before="144" w:after="264"/>
+              <w:rPr>
+                <w:rFonts w:ascii="Helvetica" w:eastAsia="Times New Roman" w:hAnsi="Helvetica" w:cs="Helvetica"/>
+                <w:sz w:val="28"/>
+                <w:szCs w:val="26"/>
+                <w:lang w:val="es-AR"/>
+              </w:rPr>
+            </w:pPr>
+            <w:r>
+              <w:rPr>
+                <w:rFonts w:ascii="Helvetica" w:eastAsia="Times New Roman" w:hAnsi="Helvetica" w:cs="Helvetica"/>
+                <w:sz w:val="28"/>
+                <w:szCs w:val="26"/>
+                <w:lang w:val="es-AR"/>
+              </w:rPr>
+              <w:t>La configuración de la app: su nombre real y cómo se la llama.</w:t>
+            </w:r>
+          </w:p>
+        </w:tc>
+        <w:tc>
+          <w:tcPr>
+            <w:tcW w:w="3260" w:type="dxa"/>
+            <w:hideMark/>
+          </w:tcPr>
+          <w:p>
+            <w:pPr>
+              <w:spacing w:before="144" w:after="264"/>
+              <w:rPr>
+                <w:rFonts w:ascii="Helvetica" w:eastAsia="Times New Roman" w:hAnsi="Helvetica" w:cs="Helvetica"/>
+                <w:sz w:val="28"/>
+                <w:szCs w:val="26"/>
+              </w:rPr>
+            </w:pPr>
+            <w:proofErr w:type="spellStart"/>
+            <w:r>
+              <w:rPr>
+                <w:rFonts w:ascii="Helvetica" w:eastAsia="Times New Roman" w:hAnsi="Helvetica" w:cs="Helvetica"/>
+                <w:sz w:val="28"/>
+                <w:szCs w:val="26"/>
+              </w:rPr>
+              <w:t>Una</w:t>
+            </w:r>
+            <w:proofErr w:type="spellEnd"/>
+            <w:r>
+              <w:rPr>
+                <w:rFonts w:ascii="Helvetica" w:eastAsia="Times New Roman" w:hAnsi="Helvetica" w:cs="Helvetica"/>
+                <w:sz w:val="28"/>
+                <w:szCs w:val="26"/>
+              </w:rPr>
+              <w:t xml:space="preserve"> </w:t>
+            </w:r>
+            <w:proofErr w:type="spellStart"/>
+            <w:r>
+              <w:rPr>
+                <w:rFonts w:ascii="Helvetica" w:eastAsia="Times New Roman" w:hAnsi="Helvetica" w:cs="Helvetica"/>
+                <w:sz w:val="28"/>
+                <w:szCs w:val="26"/>
+              </w:rPr>
+              <w:t>línea</w:t>
+            </w:r>
+            <w:proofErr w:type="spellEnd"/>
+            <w:r>
+              <w:rPr>
+                <w:rFonts w:ascii="Helvetica" w:eastAsia="Times New Roman" w:hAnsi="Helvetica" w:cs="Helvetica"/>
+                <w:sz w:val="28"/>
+                <w:szCs w:val="26"/>
+              </w:rPr>
+              <w:t xml:space="preserve"> </w:t>
+            </w:r>
+            <w:proofErr w:type="spellStart"/>
+            <w:r>
+              <w:rPr>
+                <w:rFonts w:ascii="Helvetica" w:eastAsia="Times New Roman" w:hAnsi="Helvetica" w:cs="Helvetica"/>
+                <w:sz w:val="28"/>
+                <w:szCs w:val="26"/>
+              </w:rPr>
+              <w:t>por</w:t>
+            </w:r>
+            <w:proofErr w:type="spellEnd"/>
+            <w:r>
+              <w:rPr>
+                <w:rFonts w:ascii="Helvetica" w:eastAsia="Times New Roman" w:hAnsi="Helvetica" w:cs="Helvetica"/>
+                <w:sz w:val="28"/>
+                <w:szCs w:val="26"/>
+              </w:rPr>
+              <w:t xml:space="preserve"> app</w:t>
+            </w:r>
+          </w:p>
+        </w:tc>
+      </w:tr>
+      <w:tr>
+        <w:tc>
+          <w:tcPr>
+            <w:tcW w:w="0" w:type="auto"/>
+            <w:hideMark/>
+          </w:tcPr>
+          <w:p>
+            <w:pPr>
+              <w:spacing w:before="144" w:after="264"/>
+              <w:rPr>
+                <w:rFonts w:ascii="Helvetica" w:eastAsia="Times New Roman" w:hAnsi="Helvetica" w:cs="Helvetica"/>
+                <w:sz w:val="28"/>
+                <w:szCs w:val="26"/>
+              </w:rPr>
+            </w:pPr>
+            <w:r>
+              <w:rPr>
+                <w:rFonts w:ascii="Helvetica" w:eastAsia="Times New Roman" w:hAnsi="Helvetica" w:cs="Helvetica"/>
+                <w:sz w:val="28"/>
+                <w:szCs w:val="26"/>
+                <w:shd w:val="clear" w:color="auto" w:fill="181D27"/>
+              </w:rPr>
+              <w:t>migrations/</w:t>
+            </w:r>
+          </w:p>
+        </w:tc>
+        <w:tc>
+          <w:tcPr>
+            <w:tcW w:w="5889" w:type="dxa"/>
+            <w:hideMark/>
+          </w:tcPr>
+          <w:p>
+            <w:pPr>
+              <w:spacing w:before="144" w:after="264"/>
+              <w:rPr>
+                <w:rFonts w:ascii="Helvetica" w:eastAsia="Times New Roman" w:hAnsi="Helvetica" w:cs="Helvetica"/>
+                <w:sz w:val="28"/>
+                <w:szCs w:val="26"/>
+                <w:lang w:val="es-AR"/>
+              </w:rPr>
+            </w:pPr>
+            <w:r>
+              <w:rPr>
+                <w:rFonts w:ascii="Helvetica" w:eastAsia="Times New Roman" w:hAnsi="Helvetica" w:cs="Helvetica"/>
+                <w:sz w:val="28"/>
+                <w:szCs w:val="26"/>
+                <w:lang w:val="es-AR"/>
+              </w:rPr>
+              <w:t>El historial de cambios de la estructura de las tablas, en archivos de Python que genera Django.</w:t>
+            </w:r>
+          </w:p>
+        </w:tc>
+        <w:tc>
+          <w:tcPr>
+            <w:tcW w:w="3260" w:type="dxa"/>
+            <w:hideMark/>
+          </w:tcPr>
+          <w:p>
+            <w:pPr>
+              <w:spacing w:before="144" w:after="264"/>
+              <w:rPr>
+                <w:rFonts w:ascii="Helvetica" w:eastAsia="Times New Roman" w:hAnsi="Helvetica" w:cs="Helvetica"/>
+                <w:sz w:val="28"/>
+                <w:szCs w:val="26"/>
+                <w:lang w:val="es-AR"/>
+              </w:rPr>
+            </w:pPr>
+            <w:r>
+              <w:rPr>
+                <w:rFonts w:ascii="Helvetica" w:eastAsia="Times New Roman" w:hAnsi="Helvetica" w:cs="Helvetica"/>
+                <w:sz w:val="28"/>
+                <w:szCs w:val="26"/>
+                <w:lang w:val="es-AR"/>
+              </w:rPr>
+              <w:t>Se generan, no se escriben</w:t>
+            </w:r>
+          </w:p>
+        </w:tc>
+      </w:tr>
+      <w:tr>
+        <w:tc>
+          <w:tcPr>
+            <w:tcW w:w="0" w:type="auto"/>
+            <w:hideMark/>
+          </w:tcPr>
+          <w:p>
+            <w:pPr>
+              <w:spacing w:before="144" w:after="264"/>
+              <w:rPr>
+                <w:rFonts w:ascii="Helvetica" w:eastAsia="Times New Roman" w:hAnsi="Helvetica" w:cs="Helvetica"/>
+                <w:sz w:val="28"/>
+                <w:szCs w:val="26"/>
+              </w:rPr>
+            </w:pPr>
+            <w:r>
+              <w:rPr>
+                <w:rFonts w:ascii="Helvetica" w:eastAsia="Times New Roman" w:hAnsi="Helvetica" w:cs="Helvetica"/>
+                <w:sz w:val="28"/>
+                <w:szCs w:val="26"/>
+                <w:shd w:val="clear" w:color="auto" w:fill="181D27"/>
+              </w:rPr>
+              <w:t>tests.py</w:t>
+            </w:r>
+          </w:p>
+        </w:tc>
+        <w:tc>
+          <w:tcPr>
+            <w:tcW w:w="5889" w:type="dxa"/>
+            <w:hideMark/>
+          </w:tcPr>
+          <w:p>
+            <w:pPr>
+              <w:spacing w:before="144" w:after="264"/>
+              <w:rPr>
+                <w:rFonts w:ascii="Helvetica" w:eastAsia="Times New Roman" w:hAnsi="Helvetica" w:cs="Helvetica"/>
+                <w:sz w:val="28"/>
+                <w:szCs w:val="26"/>
+                <w:lang w:val="es-AR"/>
+              </w:rPr>
+            </w:pPr>
+            <w:r>
+              <w:rPr>
+                <w:rFonts w:ascii="Helvetica" w:eastAsia="Times New Roman" w:hAnsi="Helvetica" w:cs="Helvetica"/>
+                <w:sz w:val="28"/>
+                <w:szCs w:val="26"/>
+                <w:lang w:val="es-AR"/>
+              </w:rPr>
+              <w:t>Las pruebas automáticas de la app.</w:t>
+            </w:r>
+          </w:p>
+        </w:tc>
+        <w:tc>
+          <w:tcPr>
+            <w:tcW w:w="3260" w:type="dxa"/>
+            <w:hideMark/>
+          </w:tcPr>
+          <w:p>
+            <w:pPr>
+              <w:spacing w:before="144" w:after="264"/>
+              <w:rPr>
+                <w:rFonts w:ascii="Helvetica" w:eastAsia="Times New Roman" w:hAnsi="Helvetica" w:cs="Helvetica"/>
+                <w:sz w:val="28"/>
+                <w:szCs w:val="26"/>
+              </w:rPr>
+            </w:pPr>
+            <w:r>
+              <w:rPr>
+                <w:rFonts w:ascii="Helvetica" w:eastAsia="Times New Roman" w:hAnsi="Helvetica" w:cs="Helvetica"/>
+                <w:sz w:val="28"/>
+                <w:szCs w:val="26"/>
+              </w:rPr>
+              <w:t xml:space="preserve">Al final, </w:t>
+            </w:r>
+            <w:proofErr w:type="spellStart"/>
+            <w:r>
+              <w:rPr>
+                <w:rFonts w:ascii="Helvetica" w:eastAsia="Times New Roman" w:hAnsi="Helvetica" w:cs="Helvetica"/>
+                <w:sz w:val="28"/>
+                <w:szCs w:val="26"/>
+              </w:rPr>
+              <w:t>todas</w:t>
+            </w:r>
+            <w:proofErr w:type="spellEnd"/>
+            <w:r>
+              <w:rPr>
+                <w:rFonts w:ascii="Helvetica" w:eastAsia="Times New Roman" w:hAnsi="Helvetica" w:cs="Helvetica"/>
+                <w:sz w:val="28"/>
+                <w:szCs w:val="26"/>
+              </w:rPr>
+              <w:t xml:space="preserve"> juntas</w:t>
+            </w:r>
+          </w:p>
+        </w:tc>
+      </w:tr>
+    </w:tbl>
+    <w:p>
+      <w:pPr>
+        <w:rPr>
+          <w:lang w:val="es-AR"/>
+        </w:rPr>
+      </w:pPr>
+    </w:p>
+    <w:p>
+      <w:pPr>
+        <w:rPr>
+          <w:lang w:val="es-AR"/>
+        </w:rPr>
+      </w:pPr>
+    </w:p>
+    <w:p>
+      <w:pPr>
+        <w:rPr>
+          <w:lang w:val="es-AR"/>
+        </w:rPr>
+      </w:pPr>
+    </w:p>
+    <w:p>
+      <w:pPr>
+        <w:rPr>
+          <w:lang w:val="es-AR"/>
+        </w:rPr>
+      </w:pPr>
+    </w:p>
+    <w:p>
+      <w:pPr>
+        <w:rPr>
+          <w:lang w:val="es-AR"/>
+        </w:rPr>
+      </w:pPr>
+    </w:p>
+    <w:p>
+      <w:pPr>
+        <w:rPr>
+          <w:lang w:val="es-AR"/>
+        </w:rPr>
+      </w:pPr>
+    </w:p>
+    <w:p>
+      <w:pPr>
+        <w:rPr>
+          <w:lang w:val="es-AR"/>
+        </w:rPr>
+      </w:pPr>
+    </w:p>
+    <w:p>
+      <w:pPr>
+        <w:rPr>
+          <w:lang w:val="es-AR"/>
+        </w:rPr>
+      </w:pPr>
+    </w:p>
+    <w:p>
+      <w:pPr>
+        <w:rPr>
+          <w:lang w:val="es-AR"/>
+        </w:rPr>
+      </w:pPr>
+    </w:p>
+    <w:p>
+      <w:pPr>
+        <w:rPr>
+          <w:lang w:val="es-AR"/>
+        </w:rPr>
+      </w:pPr>
+    </w:p>
+    <w:p>
+      <w:pPr>
+        <w:rPr>
+          <w:lang w:val="es-AR"/>
+        </w:rPr>
+      </w:pPr>
+    </w:p>
+    <w:p>
+      <w:pPr>
+        <w:rPr>
+          <w:lang w:val="es-AR"/>
+        </w:rPr>
+      </w:pPr>
+      <w:r>
+        <w:rPr>
+          <w:lang w:val="es-AR"/>
+        </w:rPr>
+        <w:lastRenderedPageBreak/>
+        <w:t xml:space="preserve">Teoría 9 - </w:t>
+      </w:r>
+      <w:r>
+        <w:rPr>
+          <w:lang w:val="es-AR"/>
+        </w:rPr>
+        <w:t>Arquitectura en capas: qué archivo hace qué</w:t>
+      </w:r>
+    </w:p>
+    <w:p>
+      <w:pPr>
+        <w:rPr>
+          <w:lang w:val="es-AR"/>
+        </w:rPr>
+      </w:pPr>
+      <w:proofErr w:type="spellStart"/>
+      <w:r>
+        <w:rPr>
+          <w:lang w:val="es-AR"/>
+        </w:rPr>
+        <w:t>Models</w:t>
+      </w:r>
+      <w:proofErr w:type="spellEnd"/>
+      <w:r>
+        <w:rPr>
+          <w:lang w:val="es-AR"/>
+        </w:rPr>
+        <w:t xml:space="preserve">, managers, </w:t>
+      </w:r>
+      <w:proofErr w:type="spellStart"/>
+      <w:r>
+        <w:rPr>
+          <w:lang w:val="es-AR"/>
+        </w:rPr>
+        <w:t>selectors</w:t>
+      </w:r>
+      <w:proofErr w:type="spellEnd"/>
+      <w:r>
+        <w:rPr>
+          <w:lang w:val="es-AR"/>
+        </w:rPr>
+        <w:t xml:space="preserve"> y </w:t>
+      </w:r>
+      <w:proofErr w:type="spellStart"/>
+      <w:r>
+        <w:rPr>
+          <w:lang w:val="es-AR"/>
+        </w:rPr>
+        <w:t>services</w:t>
+      </w:r>
+      <w:proofErr w:type="spellEnd"/>
+      <w:r>
+        <w:rPr>
+          <w:lang w:val="es-AR"/>
+        </w:rPr>
+        <w:t xml:space="preserve">, </w:t>
+      </w:r>
+      <w:r>
+        <w:rPr>
+          <w:lang w:val="es-AR"/>
+        </w:rPr>
+        <w:t>y por qué la API no toca el ORM</w:t>
+      </w:r>
+      <w:bookmarkStart w:id="0" w:name="_GoBack"/>
+      <w:bookmarkEnd w:id="0"/>
+    </w:p>
+    <w:tbl>
+      <w:tblPr>
+        <w:tblStyle w:val="Tablaconcuadrcula"/>
+        <w:tblW w:w="0" w:type="auto"/>
+        <w:tblLook w:val="04A0" w:firstRow="1" w:lastRow="0" w:firstColumn="1" w:lastColumn="0" w:noHBand="0" w:noVBand="1"/>
+      </w:tblPr>
+      <w:tblGrid>
+        <w:gridCol w:w="1812"/>
+        <w:gridCol w:w="6405"/>
+        <w:gridCol w:w="3260"/>
+      </w:tblGrid>
+      <w:tr>
+        <w:tc>
+          <w:tcPr>
+            <w:tcW w:w="1812" w:type="dxa"/>
+            <w:hideMark/>
+          </w:tcPr>
+          <w:p>
+            <w:pPr>
+              <w:spacing w:before="144" w:after="264"/>
+              <w:rPr>
+                <w:rFonts w:ascii="Helvetica" w:eastAsia="Times New Roman" w:hAnsi="Helvetica" w:cs="Helvetica"/>
+                <w:b/>
+                <w:bCs/>
+                <w:sz w:val="26"/>
+                <w:szCs w:val="26"/>
+              </w:rPr>
+            </w:pPr>
+            <w:proofErr w:type="spellStart"/>
+            <w:r>
+              <w:rPr>
+                <w:rFonts w:ascii="Helvetica" w:eastAsia="Times New Roman" w:hAnsi="Helvetica" w:cs="Helvetica"/>
+                <w:b/>
+                <w:bCs/>
+                <w:sz w:val="26"/>
+                <w:szCs w:val="26"/>
+              </w:rPr>
+              <w:t>Archivo</w:t>
+            </w:r>
+            <w:proofErr w:type="spellEnd"/>
+          </w:p>
+        </w:tc>
+        <w:tc>
+          <w:tcPr>
+            <w:tcW w:w="6405" w:type="dxa"/>
+            <w:hideMark/>
+          </w:tcPr>
+          <w:p>
+            <w:pPr>
+              <w:spacing w:before="144" w:after="264"/>
+              <w:rPr>
+                <w:rFonts w:ascii="Helvetica" w:eastAsia="Times New Roman" w:hAnsi="Helvetica" w:cs="Helvetica"/>
+                <w:b/>
+                <w:bCs/>
+                <w:sz w:val="26"/>
+                <w:szCs w:val="26"/>
+              </w:rPr>
+            </w:pPr>
+            <w:proofErr w:type="spellStart"/>
+            <w:r>
+              <w:rPr>
+                <w:rFonts w:ascii="Helvetica" w:eastAsia="Times New Roman" w:hAnsi="Helvetica" w:cs="Helvetica"/>
+                <w:b/>
+                <w:bCs/>
+                <w:sz w:val="26"/>
+                <w:szCs w:val="26"/>
+              </w:rPr>
+              <w:t>Qué</w:t>
+            </w:r>
+            <w:proofErr w:type="spellEnd"/>
+            <w:r>
+              <w:rPr>
+                <w:rFonts w:ascii="Helvetica" w:eastAsia="Times New Roman" w:hAnsi="Helvetica" w:cs="Helvetica"/>
+                <w:b/>
+                <w:bCs/>
+                <w:sz w:val="26"/>
+                <w:szCs w:val="26"/>
+              </w:rPr>
+              <w:t xml:space="preserve"> </w:t>
+            </w:r>
+            <w:proofErr w:type="spellStart"/>
+            <w:r>
+              <w:rPr>
+                <w:rFonts w:ascii="Helvetica" w:eastAsia="Times New Roman" w:hAnsi="Helvetica" w:cs="Helvetica"/>
+                <w:b/>
+                <w:bCs/>
+                <w:sz w:val="26"/>
+                <w:szCs w:val="26"/>
+              </w:rPr>
+              <w:t>va</w:t>
+            </w:r>
+            <w:proofErr w:type="spellEnd"/>
+            <w:r>
+              <w:rPr>
+                <w:rFonts w:ascii="Helvetica" w:eastAsia="Times New Roman" w:hAnsi="Helvetica" w:cs="Helvetica"/>
+                <w:b/>
+                <w:bCs/>
+                <w:sz w:val="26"/>
+                <w:szCs w:val="26"/>
+              </w:rPr>
+              <w:t xml:space="preserve"> </w:t>
+            </w:r>
+            <w:proofErr w:type="spellStart"/>
+            <w:r>
+              <w:rPr>
+                <w:rFonts w:ascii="Helvetica" w:eastAsia="Times New Roman" w:hAnsi="Helvetica" w:cs="Helvetica"/>
+                <w:b/>
+                <w:bCs/>
+                <w:sz w:val="26"/>
+                <w:szCs w:val="26"/>
+              </w:rPr>
+              <w:t>adentro</w:t>
+            </w:r>
+            <w:proofErr w:type="spellEnd"/>
+          </w:p>
+        </w:tc>
+        <w:tc>
+          <w:tcPr>
+            <w:tcW w:w="3260" w:type="dxa"/>
+            <w:hideMark/>
+          </w:tcPr>
+          <w:p>
+            <w:pPr>
+              <w:spacing w:before="144" w:after="264"/>
+              <w:rPr>
+                <w:rFonts w:ascii="Helvetica" w:eastAsia="Times New Roman" w:hAnsi="Helvetica" w:cs="Helvetica"/>
+                <w:b/>
+                <w:bCs/>
+                <w:sz w:val="26"/>
+                <w:szCs w:val="26"/>
+              </w:rPr>
+            </w:pPr>
+            <w:proofErr w:type="spellStart"/>
+            <w:r>
+              <w:rPr>
+                <w:rFonts w:ascii="Helvetica" w:eastAsia="Times New Roman" w:hAnsi="Helvetica" w:cs="Helvetica"/>
+                <w:b/>
+                <w:bCs/>
+                <w:sz w:val="26"/>
+                <w:szCs w:val="26"/>
+              </w:rPr>
+              <w:t>Cómo</w:t>
+            </w:r>
+            <w:proofErr w:type="spellEnd"/>
+            <w:r>
+              <w:rPr>
+                <w:rFonts w:ascii="Helvetica" w:eastAsia="Times New Roman" w:hAnsi="Helvetica" w:cs="Helvetica"/>
+                <w:b/>
+                <w:bCs/>
+                <w:sz w:val="26"/>
+                <w:szCs w:val="26"/>
+              </w:rPr>
+              <w:t xml:space="preserve"> </w:t>
+            </w:r>
+            <w:proofErr w:type="spellStart"/>
+            <w:r>
+              <w:rPr>
+                <w:rFonts w:ascii="Helvetica" w:eastAsia="Times New Roman" w:hAnsi="Helvetica" w:cs="Helvetica"/>
+                <w:b/>
+                <w:bCs/>
+                <w:sz w:val="26"/>
+                <w:szCs w:val="26"/>
+              </w:rPr>
+              <w:t>reconocerlo</w:t>
+            </w:r>
+            <w:proofErr w:type="spellEnd"/>
+          </w:p>
+        </w:tc>
+      </w:tr>
+      <w:tr>
+        <w:tc>
+          <w:tcPr>
+            <w:tcW w:w="1812" w:type="dxa"/>
+            <w:hideMark/>
+          </w:tcPr>
+          <w:p>
+            <w:pPr>
+              <w:spacing w:before="144" w:after="264"/>
+              <w:rPr>
+                <w:rFonts w:ascii="Helvetica" w:eastAsia="Times New Roman" w:hAnsi="Helvetica" w:cs="Helvetica"/>
+                <w:sz w:val="26"/>
+                <w:szCs w:val="26"/>
+              </w:rPr>
+            </w:pPr>
+            <w:r>
+              <w:rPr>
+                <w:rFonts w:ascii="Helvetica" w:eastAsia="Times New Roman" w:hAnsi="Helvetica" w:cs="Helvetica"/>
+                <w:sz w:val="26"/>
+                <w:szCs w:val="26"/>
+                <w:shd w:val="clear" w:color="auto" w:fill="181D27"/>
+              </w:rPr>
+              <w:t>models.py</w:t>
+            </w:r>
+          </w:p>
+        </w:tc>
+        <w:tc>
+          <w:tcPr>
+            <w:tcW w:w="6405" w:type="dxa"/>
+            <w:hideMark/>
+          </w:tcPr>
+          <w:p>
+            <w:pPr>
+              <w:spacing w:before="144" w:after="264"/>
+              <w:rPr>
+                <w:rFonts w:ascii="Helvetica" w:eastAsia="Times New Roman" w:hAnsi="Helvetica" w:cs="Helvetica"/>
+                <w:sz w:val="26"/>
+                <w:szCs w:val="26"/>
+                <w:lang w:val="es-AR"/>
+              </w:rPr>
+            </w:pPr>
+            <w:r>
+              <w:rPr>
+                <w:rFonts w:ascii="Helvetica" w:eastAsia="Times New Roman" w:hAnsi="Helvetica" w:cs="Helvetica"/>
+                <w:sz w:val="26"/>
+                <w:szCs w:val="26"/>
+                <w:lang w:val="es-AR"/>
+              </w:rPr>
+              <w:t xml:space="preserve">La estructura y el comportamiento propio de cada modelo: campos, relaciones, </w:t>
+            </w:r>
+            <w:proofErr w:type="spellStart"/>
+            <w:r>
+              <w:rPr>
+                <w:rFonts w:ascii="Helvetica" w:eastAsia="Times New Roman" w:hAnsi="Helvetica" w:cs="Helvetica"/>
+                <w:sz w:val="26"/>
+                <w:szCs w:val="26"/>
+                <w:shd w:val="clear" w:color="auto" w:fill="181D27"/>
+                <w:lang w:val="es-AR"/>
+              </w:rPr>
+              <w:t>clean</w:t>
+            </w:r>
+            <w:proofErr w:type="spellEnd"/>
+            <w:r>
+              <w:rPr>
+                <w:rFonts w:ascii="Helvetica" w:eastAsia="Times New Roman" w:hAnsi="Helvetica" w:cs="Helvetica"/>
+                <w:sz w:val="26"/>
+                <w:szCs w:val="26"/>
+                <w:shd w:val="clear" w:color="auto" w:fill="181D27"/>
+                <w:lang w:val="es-AR"/>
+              </w:rPr>
+              <w:t>()</w:t>
+            </w:r>
+            <w:r>
+              <w:rPr>
+                <w:rFonts w:ascii="Helvetica" w:eastAsia="Times New Roman" w:hAnsi="Helvetica" w:cs="Helvetica"/>
+                <w:sz w:val="26"/>
+                <w:szCs w:val="26"/>
+                <w:lang w:val="es-AR"/>
+              </w:rPr>
+              <w:t xml:space="preserve">, </w:t>
+            </w:r>
+            <w:proofErr w:type="spellStart"/>
+            <w:r>
+              <w:rPr>
+                <w:rFonts w:ascii="Helvetica" w:eastAsia="Times New Roman" w:hAnsi="Helvetica" w:cs="Helvetica"/>
+                <w:sz w:val="26"/>
+                <w:szCs w:val="26"/>
+                <w:shd w:val="clear" w:color="auto" w:fill="181D27"/>
+                <w:lang w:val="es-AR"/>
+              </w:rPr>
+              <w:t>save</w:t>
+            </w:r>
+            <w:proofErr w:type="spellEnd"/>
+            <w:r>
+              <w:rPr>
+                <w:rFonts w:ascii="Helvetica" w:eastAsia="Times New Roman" w:hAnsi="Helvetica" w:cs="Helvetica"/>
+                <w:sz w:val="26"/>
+                <w:szCs w:val="26"/>
+                <w:shd w:val="clear" w:color="auto" w:fill="181D27"/>
+                <w:lang w:val="es-AR"/>
+              </w:rPr>
+              <w:t>()</w:t>
+            </w:r>
+            <w:r>
+              <w:rPr>
+                <w:rFonts w:ascii="Helvetica" w:eastAsia="Times New Roman" w:hAnsi="Helvetica" w:cs="Helvetica"/>
+                <w:sz w:val="26"/>
+                <w:szCs w:val="26"/>
+                <w:lang w:val="es-AR"/>
+              </w:rPr>
+              <w:t>, propiedades calculadas.</w:t>
+            </w:r>
+          </w:p>
+        </w:tc>
+        <w:tc>
+          <w:tcPr>
+            <w:tcW w:w="3260" w:type="dxa"/>
+            <w:hideMark/>
+          </w:tcPr>
+          <w:p>
+            <w:pPr>
+              <w:spacing w:before="144" w:after="264"/>
+              <w:rPr>
+                <w:rFonts w:ascii="Helvetica" w:eastAsia="Times New Roman" w:hAnsi="Helvetica" w:cs="Helvetica"/>
+                <w:sz w:val="26"/>
+                <w:szCs w:val="26"/>
+                <w:lang w:val="es-AR"/>
+              </w:rPr>
+            </w:pPr>
+            <w:r>
+              <w:rPr>
+                <w:rFonts w:ascii="Helvetica" w:eastAsia="Times New Roman" w:hAnsi="Helvetica" w:cs="Helvetica"/>
+                <w:sz w:val="26"/>
+                <w:szCs w:val="26"/>
+                <w:lang w:val="es-AR"/>
+              </w:rPr>
+              <w:t>Habla de una sola fila</w:t>
+            </w:r>
+          </w:p>
+        </w:tc>
+      </w:tr>
+      <w:tr>
+        <w:tc>
+          <w:tcPr>
+            <w:tcW w:w="1812" w:type="dxa"/>
+            <w:hideMark/>
+          </w:tcPr>
+          <w:p>
+            <w:pPr>
+              <w:spacing w:before="144" w:after="264"/>
+              <w:rPr>
+                <w:rFonts w:ascii="Helvetica" w:eastAsia="Times New Roman" w:hAnsi="Helvetica" w:cs="Helvetica"/>
+                <w:sz w:val="26"/>
+                <w:szCs w:val="26"/>
+              </w:rPr>
+            </w:pPr>
+            <w:r>
+              <w:rPr>
+                <w:rFonts w:ascii="Helvetica" w:eastAsia="Times New Roman" w:hAnsi="Helvetica" w:cs="Helvetica"/>
+                <w:sz w:val="26"/>
+                <w:szCs w:val="26"/>
+                <w:shd w:val="clear" w:color="auto" w:fill="181D27"/>
+              </w:rPr>
+              <w:t>managers.py</w:t>
+            </w:r>
+          </w:p>
+        </w:tc>
+        <w:tc>
+          <w:tcPr>
+            <w:tcW w:w="6405" w:type="dxa"/>
+            <w:hideMark/>
+          </w:tcPr>
+          <w:p>
+            <w:pPr>
+              <w:spacing w:before="144" w:after="264"/>
+              <w:rPr>
+                <w:rFonts w:ascii="Helvetica" w:eastAsia="Times New Roman" w:hAnsi="Helvetica" w:cs="Helvetica"/>
+                <w:sz w:val="26"/>
+                <w:szCs w:val="26"/>
+                <w:lang w:val="es-AR"/>
+              </w:rPr>
+            </w:pPr>
+            <w:r>
+              <w:rPr>
+                <w:rFonts w:ascii="Helvetica" w:eastAsia="Times New Roman" w:hAnsi="Helvetica" w:cs="Helvetica"/>
+                <w:sz w:val="26"/>
+                <w:szCs w:val="26"/>
+                <w:lang w:val="es-AR"/>
+              </w:rPr>
+              <w:t xml:space="preserve">Filtros reutilizables y </w:t>
+            </w:r>
+            <w:proofErr w:type="spellStart"/>
+            <w:r>
+              <w:rPr>
+                <w:rFonts w:ascii="Helvetica" w:eastAsia="Times New Roman" w:hAnsi="Helvetica" w:cs="Helvetica"/>
+                <w:sz w:val="26"/>
+                <w:szCs w:val="26"/>
+                <w:lang w:val="es-AR"/>
+              </w:rPr>
+              <w:t>encadenables</w:t>
+            </w:r>
+            <w:proofErr w:type="spellEnd"/>
+            <w:r>
+              <w:rPr>
+                <w:rFonts w:ascii="Helvetica" w:eastAsia="Times New Roman" w:hAnsi="Helvetica" w:cs="Helvetica"/>
+                <w:sz w:val="26"/>
+                <w:szCs w:val="26"/>
+                <w:lang w:val="es-AR"/>
+              </w:rPr>
+              <w:t xml:space="preserve"> sobre un modelo: </w:t>
+            </w:r>
+            <w:proofErr w:type="spellStart"/>
+            <w:r>
+              <w:rPr>
+                <w:rFonts w:ascii="Helvetica" w:eastAsia="Times New Roman" w:hAnsi="Helvetica" w:cs="Helvetica"/>
+                <w:sz w:val="26"/>
+                <w:szCs w:val="26"/>
+                <w:shd w:val="clear" w:color="auto" w:fill="181D27"/>
+                <w:lang w:val="es-AR"/>
+              </w:rPr>
+              <w:t>approved</w:t>
+            </w:r>
+            <w:proofErr w:type="spellEnd"/>
+            <w:r>
+              <w:rPr>
+                <w:rFonts w:ascii="Helvetica" w:eastAsia="Times New Roman" w:hAnsi="Helvetica" w:cs="Helvetica"/>
+                <w:sz w:val="26"/>
+                <w:szCs w:val="26"/>
+                <w:shd w:val="clear" w:color="auto" w:fill="181D27"/>
+                <w:lang w:val="es-AR"/>
+              </w:rPr>
+              <w:t>()</w:t>
+            </w:r>
+            <w:r>
+              <w:rPr>
+                <w:rFonts w:ascii="Helvetica" w:eastAsia="Times New Roman" w:hAnsi="Helvetica" w:cs="Helvetica"/>
+                <w:sz w:val="26"/>
+                <w:szCs w:val="26"/>
+                <w:lang w:val="es-AR"/>
+              </w:rPr>
+              <w:t xml:space="preserve">, </w:t>
+            </w:r>
+            <w:proofErr w:type="spellStart"/>
+            <w:r>
+              <w:rPr>
+                <w:rFonts w:ascii="Helvetica" w:eastAsia="Times New Roman" w:hAnsi="Helvetica" w:cs="Helvetica"/>
+                <w:sz w:val="26"/>
+                <w:szCs w:val="26"/>
+                <w:shd w:val="clear" w:color="auto" w:fill="181D27"/>
+                <w:lang w:val="es-AR"/>
+              </w:rPr>
+              <w:t>accepted</w:t>
+            </w:r>
+            <w:proofErr w:type="spellEnd"/>
+            <w:r>
+              <w:rPr>
+                <w:rFonts w:ascii="Helvetica" w:eastAsia="Times New Roman" w:hAnsi="Helvetica" w:cs="Helvetica"/>
+                <w:sz w:val="26"/>
+                <w:szCs w:val="26"/>
+                <w:shd w:val="clear" w:color="auto" w:fill="181D27"/>
+                <w:lang w:val="es-AR"/>
+              </w:rPr>
+              <w:t>()</w:t>
+            </w:r>
+            <w:r>
+              <w:rPr>
+                <w:rFonts w:ascii="Helvetica" w:eastAsia="Times New Roman" w:hAnsi="Helvetica" w:cs="Helvetica"/>
+                <w:sz w:val="26"/>
+                <w:szCs w:val="26"/>
+                <w:lang w:val="es-AR"/>
+              </w:rPr>
+              <w:t xml:space="preserve">, </w:t>
+            </w:r>
+            <w:r>
+              <w:rPr>
+                <w:rFonts w:ascii="Helvetica" w:eastAsia="Times New Roman" w:hAnsi="Helvetica" w:cs="Helvetica"/>
+                <w:sz w:val="26"/>
+                <w:szCs w:val="26"/>
+                <w:shd w:val="clear" w:color="auto" w:fill="181D27"/>
+                <w:lang w:val="es-AR"/>
+              </w:rPr>
+              <w:t>active()</w:t>
+            </w:r>
+            <w:r>
+              <w:rPr>
+                <w:rFonts w:ascii="Helvetica" w:eastAsia="Times New Roman" w:hAnsi="Helvetica" w:cs="Helvetica"/>
+                <w:sz w:val="26"/>
+                <w:szCs w:val="26"/>
+                <w:lang w:val="es-AR"/>
+              </w:rPr>
+              <w:t>.</w:t>
+            </w:r>
+          </w:p>
+        </w:tc>
+        <w:tc>
+          <w:tcPr>
+            <w:tcW w:w="3260" w:type="dxa"/>
+            <w:hideMark/>
+          </w:tcPr>
+          <w:p>
+            <w:pPr>
+              <w:spacing w:before="144" w:after="264"/>
+              <w:rPr>
+                <w:rFonts w:ascii="Helvetica" w:eastAsia="Times New Roman" w:hAnsi="Helvetica" w:cs="Helvetica"/>
+                <w:sz w:val="26"/>
+                <w:szCs w:val="26"/>
+              </w:rPr>
+            </w:pPr>
+            <w:proofErr w:type="spellStart"/>
+            <w:r>
+              <w:rPr>
+                <w:rFonts w:ascii="Helvetica" w:eastAsia="Times New Roman" w:hAnsi="Helvetica" w:cs="Helvetica"/>
+                <w:sz w:val="26"/>
+                <w:szCs w:val="26"/>
+              </w:rPr>
+              <w:t>Devuelve</w:t>
+            </w:r>
+            <w:proofErr w:type="spellEnd"/>
+            <w:r>
+              <w:rPr>
+                <w:rFonts w:ascii="Helvetica" w:eastAsia="Times New Roman" w:hAnsi="Helvetica" w:cs="Helvetica"/>
+                <w:sz w:val="26"/>
+                <w:szCs w:val="26"/>
+              </w:rPr>
+              <w:t xml:space="preserve"> </w:t>
+            </w:r>
+            <w:proofErr w:type="spellStart"/>
+            <w:r>
+              <w:rPr>
+                <w:rFonts w:ascii="Helvetica" w:eastAsia="Times New Roman" w:hAnsi="Helvetica" w:cs="Helvetica"/>
+                <w:sz w:val="26"/>
+                <w:szCs w:val="26"/>
+              </w:rPr>
+              <w:t>siempre</w:t>
+            </w:r>
+            <w:proofErr w:type="spellEnd"/>
+            <w:r>
+              <w:rPr>
+                <w:rFonts w:ascii="Helvetica" w:eastAsia="Times New Roman" w:hAnsi="Helvetica" w:cs="Helvetica"/>
+                <w:sz w:val="26"/>
+                <w:szCs w:val="26"/>
+              </w:rPr>
+              <w:t xml:space="preserve"> un </w:t>
+            </w:r>
+            <w:proofErr w:type="spellStart"/>
+            <w:r>
+              <w:rPr>
+                <w:rFonts w:ascii="Helvetica" w:eastAsia="Times New Roman" w:hAnsi="Helvetica" w:cs="Helvetica"/>
+                <w:sz w:val="26"/>
+                <w:szCs w:val="26"/>
+              </w:rPr>
+              <w:t>QuerySet</w:t>
+            </w:r>
+            <w:proofErr w:type="spellEnd"/>
+          </w:p>
+        </w:tc>
+      </w:tr>
+      <w:tr>
+        <w:tc>
+          <w:tcPr>
+            <w:tcW w:w="1812" w:type="dxa"/>
+            <w:hideMark/>
+          </w:tcPr>
+          <w:p>
+            <w:pPr>
+              <w:spacing w:before="144" w:after="264"/>
+              <w:rPr>
+                <w:rFonts w:ascii="Helvetica" w:eastAsia="Times New Roman" w:hAnsi="Helvetica" w:cs="Helvetica"/>
+                <w:sz w:val="26"/>
+                <w:szCs w:val="26"/>
+              </w:rPr>
+            </w:pPr>
+            <w:r>
+              <w:rPr>
+                <w:rFonts w:ascii="Helvetica" w:eastAsia="Times New Roman" w:hAnsi="Helvetica" w:cs="Helvetica"/>
+                <w:sz w:val="26"/>
+                <w:szCs w:val="26"/>
+                <w:shd w:val="clear" w:color="auto" w:fill="181D27"/>
+              </w:rPr>
+              <w:t>selectors.py</w:t>
+            </w:r>
+          </w:p>
+        </w:tc>
+        <w:tc>
+          <w:tcPr>
+            <w:tcW w:w="6405" w:type="dxa"/>
+            <w:hideMark/>
+          </w:tcPr>
+          <w:p>
+            <w:pPr>
+              <w:spacing w:before="144" w:after="264"/>
+              <w:rPr>
+                <w:rFonts w:ascii="Helvetica" w:eastAsia="Times New Roman" w:hAnsi="Helvetica" w:cs="Helvetica"/>
+                <w:sz w:val="26"/>
+                <w:szCs w:val="26"/>
+                <w:lang w:val="es-AR"/>
+              </w:rPr>
+            </w:pPr>
+            <w:r>
+              <w:rPr>
+                <w:rFonts w:ascii="Helvetica" w:eastAsia="Times New Roman" w:hAnsi="Helvetica" w:cs="Helvetica"/>
+                <w:sz w:val="26"/>
+                <w:szCs w:val="26"/>
+                <w:lang w:val="es-AR"/>
+              </w:rPr>
+              <w:t xml:space="preserve">Consultas de lectura más complejas, que combinan esos filtros y resuelven un caso de uso: </w:t>
+            </w:r>
+            <w:proofErr w:type="spellStart"/>
+            <w:r>
+              <w:rPr>
+                <w:rFonts w:ascii="Helvetica" w:eastAsia="Times New Roman" w:hAnsi="Helvetica" w:cs="Helvetica"/>
+                <w:sz w:val="26"/>
+                <w:szCs w:val="26"/>
+                <w:shd w:val="clear" w:color="auto" w:fill="181D27"/>
+                <w:lang w:val="es-AR"/>
+              </w:rPr>
+              <w:t>public_catalog</w:t>
+            </w:r>
+            <w:proofErr w:type="spellEnd"/>
+            <w:r>
+              <w:rPr>
+                <w:rFonts w:ascii="Helvetica" w:eastAsia="Times New Roman" w:hAnsi="Helvetica" w:cs="Helvetica"/>
+                <w:sz w:val="26"/>
+                <w:szCs w:val="26"/>
+                <w:shd w:val="clear" w:color="auto" w:fill="181D27"/>
+                <w:lang w:val="es-AR"/>
+              </w:rPr>
+              <w:t>(filtros)</w:t>
+            </w:r>
+            <w:r>
+              <w:rPr>
+                <w:rFonts w:ascii="Helvetica" w:eastAsia="Times New Roman" w:hAnsi="Helvetica" w:cs="Helvetica"/>
+                <w:sz w:val="26"/>
+                <w:szCs w:val="26"/>
+                <w:lang w:val="es-AR"/>
+              </w:rPr>
+              <w:t>.</w:t>
+            </w:r>
+          </w:p>
+        </w:tc>
+        <w:tc>
+          <w:tcPr>
+            <w:tcW w:w="3260" w:type="dxa"/>
+            <w:hideMark/>
+          </w:tcPr>
+          <w:p>
+            <w:pPr>
+              <w:spacing w:before="144" w:after="264"/>
+              <w:rPr>
+                <w:rFonts w:ascii="Helvetica" w:eastAsia="Times New Roman" w:hAnsi="Helvetica" w:cs="Helvetica"/>
+                <w:sz w:val="26"/>
+                <w:szCs w:val="26"/>
+              </w:rPr>
+            </w:pPr>
+            <w:r>
+              <w:rPr>
+                <w:rFonts w:ascii="Helvetica" w:eastAsia="Times New Roman" w:hAnsi="Helvetica" w:cs="Helvetica"/>
+                <w:sz w:val="26"/>
+                <w:szCs w:val="26"/>
+              </w:rPr>
+              <w:t xml:space="preserve">Lee, </w:t>
+            </w:r>
+            <w:proofErr w:type="spellStart"/>
+            <w:r>
+              <w:rPr>
+                <w:rFonts w:ascii="Helvetica" w:eastAsia="Times New Roman" w:hAnsi="Helvetica" w:cs="Helvetica"/>
+                <w:sz w:val="26"/>
+                <w:szCs w:val="26"/>
+              </w:rPr>
+              <w:t>nunca</w:t>
+            </w:r>
+            <w:proofErr w:type="spellEnd"/>
+            <w:r>
+              <w:rPr>
+                <w:rFonts w:ascii="Helvetica" w:eastAsia="Times New Roman" w:hAnsi="Helvetica" w:cs="Helvetica"/>
+                <w:sz w:val="26"/>
+                <w:szCs w:val="26"/>
+              </w:rPr>
+              <w:t xml:space="preserve"> escribe</w:t>
+            </w:r>
+          </w:p>
+        </w:tc>
+      </w:tr>
+      <w:tr>
+        <w:tc>
+          <w:tcPr>
+            <w:tcW w:w="1812" w:type="dxa"/>
+            <w:hideMark/>
+          </w:tcPr>
+          <w:p>
+            <w:pPr>
+              <w:spacing w:before="144" w:after="264"/>
+              <w:rPr>
+                <w:rFonts w:ascii="Helvetica" w:eastAsia="Times New Roman" w:hAnsi="Helvetica" w:cs="Helvetica"/>
+                <w:sz w:val="26"/>
+                <w:szCs w:val="26"/>
+              </w:rPr>
+            </w:pPr>
+            <w:r>
+              <w:rPr>
+                <w:rFonts w:ascii="Helvetica" w:eastAsia="Times New Roman" w:hAnsi="Helvetica" w:cs="Helvetica"/>
+                <w:sz w:val="26"/>
+                <w:szCs w:val="26"/>
+                <w:shd w:val="clear" w:color="auto" w:fill="181D27"/>
+              </w:rPr>
+              <w:t>services.py</w:t>
+            </w:r>
+          </w:p>
+        </w:tc>
+        <w:tc>
+          <w:tcPr>
+            <w:tcW w:w="6405" w:type="dxa"/>
+            <w:hideMark/>
+          </w:tcPr>
+          <w:p>
+            <w:pPr>
+              <w:spacing w:before="144" w:after="264"/>
+              <w:rPr>
+                <w:rFonts w:ascii="Helvetica" w:eastAsia="Times New Roman" w:hAnsi="Helvetica" w:cs="Helvetica"/>
+                <w:sz w:val="26"/>
+                <w:szCs w:val="26"/>
+                <w:lang w:val="es-AR"/>
+              </w:rPr>
+            </w:pPr>
+            <w:r>
+              <w:rPr>
+                <w:rFonts w:ascii="Helvetica" w:eastAsia="Times New Roman" w:hAnsi="Helvetica" w:cs="Helvetica"/>
+                <w:sz w:val="26"/>
+                <w:szCs w:val="26"/>
+                <w:lang w:val="es-AR"/>
+              </w:rPr>
+              <w:t xml:space="preserve">Operaciones que modifican datos o coordinan varios modelos: </w:t>
+            </w:r>
+            <w:proofErr w:type="spellStart"/>
+            <w:r>
+              <w:rPr>
+                <w:rFonts w:ascii="Helvetica" w:eastAsia="Times New Roman" w:hAnsi="Helvetica" w:cs="Helvetica"/>
+                <w:sz w:val="26"/>
+                <w:szCs w:val="26"/>
+                <w:shd w:val="clear" w:color="auto" w:fill="181D27"/>
+                <w:lang w:val="es-AR"/>
+              </w:rPr>
+              <w:t>create_project</w:t>
+            </w:r>
+            <w:proofErr w:type="spellEnd"/>
+            <w:r>
+              <w:rPr>
+                <w:rFonts w:ascii="Helvetica" w:eastAsia="Times New Roman" w:hAnsi="Helvetica" w:cs="Helvetica"/>
+                <w:sz w:val="26"/>
+                <w:szCs w:val="26"/>
+                <w:shd w:val="clear" w:color="auto" w:fill="181D27"/>
+                <w:lang w:val="es-AR"/>
+              </w:rPr>
+              <w:t>()</w:t>
+            </w:r>
+            <w:r>
+              <w:rPr>
+                <w:rFonts w:ascii="Helvetica" w:eastAsia="Times New Roman" w:hAnsi="Helvetica" w:cs="Helvetica"/>
+                <w:sz w:val="26"/>
+                <w:szCs w:val="26"/>
+                <w:lang w:val="es-AR"/>
+              </w:rPr>
+              <w:t xml:space="preserve">, </w:t>
+            </w:r>
+            <w:proofErr w:type="spellStart"/>
+            <w:r>
+              <w:rPr>
+                <w:rFonts w:ascii="Helvetica" w:eastAsia="Times New Roman" w:hAnsi="Helvetica" w:cs="Helvetica"/>
+                <w:sz w:val="26"/>
+                <w:szCs w:val="26"/>
+                <w:shd w:val="clear" w:color="auto" w:fill="181D27"/>
+                <w:lang w:val="es-AR"/>
+              </w:rPr>
+              <w:t>review_project</w:t>
+            </w:r>
+            <w:proofErr w:type="spellEnd"/>
+            <w:r>
+              <w:rPr>
+                <w:rFonts w:ascii="Helvetica" w:eastAsia="Times New Roman" w:hAnsi="Helvetica" w:cs="Helvetica"/>
+                <w:sz w:val="26"/>
+                <w:szCs w:val="26"/>
+                <w:shd w:val="clear" w:color="auto" w:fill="181D27"/>
+                <w:lang w:val="es-AR"/>
+              </w:rPr>
+              <w:t>()</w:t>
+            </w:r>
+            <w:r>
+              <w:rPr>
+                <w:rFonts w:ascii="Helvetica" w:eastAsia="Times New Roman" w:hAnsi="Helvetica" w:cs="Helvetica"/>
+                <w:sz w:val="26"/>
+                <w:szCs w:val="26"/>
+                <w:lang w:val="es-AR"/>
+              </w:rPr>
+              <w:t>.</w:t>
+            </w:r>
+          </w:p>
+        </w:tc>
+        <w:tc>
+          <w:tcPr>
+            <w:tcW w:w="3260" w:type="dxa"/>
+            <w:hideMark/>
+          </w:tcPr>
+          <w:p>
+            <w:pPr>
+              <w:spacing w:before="144" w:after="264"/>
+              <w:rPr>
+                <w:rFonts w:ascii="Helvetica" w:eastAsia="Times New Roman" w:hAnsi="Helvetica" w:cs="Helvetica"/>
+                <w:sz w:val="26"/>
+                <w:szCs w:val="26"/>
+                <w:lang w:val="es-AR"/>
+              </w:rPr>
+            </w:pPr>
+            <w:r>
+              <w:rPr>
+                <w:rFonts w:ascii="Helvetica" w:eastAsia="Times New Roman" w:hAnsi="Helvetica" w:cs="Helvetica"/>
+                <w:sz w:val="26"/>
+                <w:szCs w:val="26"/>
+                <w:lang w:val="es-AR"/>
+              </w:rPr>
+              <w:t>Escribe, y suele ser transaccional</w:t>
+            </w:r>
+          </w:p>
+        </w:tc>
+      </w:tr>
+      <w:tr>
+        <w:tc>
+          <w:tcPr>
+            <w:tcW w:w="1812" w:type="dxa"/>
+            <w:hideMark/>
+          </w:tcPr>
+          <w:p>
+            <w:pPr>
+              <w:spacing w:before="144" w:after="264"/>
+              <w:rPr>
+                <w:rFonts w:ascii="Helvetica" w:eastAsia="Times New Roman" w:hAnsi="Helvetica" w:cs="Helvetica"/>
+                <w:sz w:val="26"/>
+                <w:szCs w:val="26"/>
+              </w:rPr>
+            </w:pPr>
+            <w:r>
+              <w:rPr>
+                <w:rFonts w:ascii="Helvetica" w:eastAsia="Times New Roman" w:hAnsi="Helvetica" w:cs="Helvetica"/>
+                <w:sz w:val="26"/>
+                <w:szCs w:val="26"/>
+                <w:shd w:val="clear" w:color="auto" w:fill="181D27"/>
+              </w:rPr>
+              <w:t>schemas.py</w:t>
+            </w:r>
+          </w:p>
+        </w:tc>
+        <w:tc>
+          <w:tcPr>
+            <w:tcW w:w="6405" w:type="dxa"/>
+            <w:hideMark/>
+          </w:tcPr>
+          <w:p>
+            <w:pPr>
+              <w:spacing w:before="144" w:after="264"/>
+              <w:rPr>
+                <w:rFonts w:ascii="Helvetica" w:eastAsia="Times New Roman" w:hAnsi="Helvetica" w:cs="Helvetica"/>
+                <w:sz w:val="26"/>
+                <w:szCs w:val="26"/>
+                <w:lang w:val="es-AR"/>
+              </w:rPr>
+            </w:pPr>
+            <w:r>
+              <w:rPr>
+                <w:rFonts w:ascii="Helvetica" w:eastAsia="Times New Roman" w:hAnsi="Helvetica" w:cs="Helvetica"/>
+                <w:sz w:val="26"/>
+                <w:szCs w:val="26"/>
+                <w:lang w:val="es-AR"/>
+              </w:rPr>
+              <w:t>La forma de lo que entra y sale por la API, con su validación.</w:t>
+            </w:r>
+          </w:p>
+        </w:tc>
+        <w:tc>
+          <w:tcPr>
+            <w:tcW w:w="3260" w:type="dxa"/>
+            <w:hideMark/>
+          </w:tcPr>
+          <w:p>
+            <w:pPr>
+              <w:spacing w:before="144" w:after="264"/>
+              <w:rPr>
+                <w:rFonts w:ascii="Helvetica" w:eastAsia="Times New Roman" w:hAnsi="Helvetica" w:cs="Helvetica"/>
+                <w:sz w:val="26"/>
+                <w:szCs w:val="26"/>
+                <w:lang w:val="es-AR"/>
+              </w:rPr>
+            </w:pPr>
+            <w:r>
+              <w:rPr>
+                <w:rFonts w:ascii="Helvetica" w:eastAsia="Times New Roman" w:hAnsi="Helvetica" w:cs="Helvetica"/>
+                <w:sz w:val="26"/>
+                <w:szCs w:val="26"/>
+                <w:lang w:val="es-AR"/>
+              </w:rPr>
+              <w:t>No sabe nada de la base</w:t>
+            </w:r>
+          </w:p>
+        </w:tc>
+      </w:tr>
+      <w:tr>
+        <w:tc>
+          <w:tcPr>
+            <w:tcW w:w="1812" w:type="dxa"/>
+            <w:hideMark/>
+          </w:tcPr>
+          <w:p>
+            <w:pPr>
+              <w:spacing w:before="144" w:after="264"/>
+              <w:rPr>
+                <w:rFonts w:ascii="Helvetica" w:eastAsia="Times New Roman" w:hAnsi="Helvetica" w:cs="Helvetica"/>
+                <w:sz w:val="26"/>
+                <w:szCs w:val="26"/>
+              </w:rPr>
+            </w:pPr>
+            <w:r>
+              <w:rPr>
+                <w:rFonts w:ascii="Helvetica" w:eastAsia="Times New Roman" w:hAnsi="Helvetica" w:cs="Helvetica"/>
+                <w:sz w:val="26"/>
+                <w:szCs w:val="26"/>
+                <w:shd w:val="clear" w:color="auto" w:fill="181D27"/>
+              </w:rPr>
+              <w:t>api.py</w:t>
+            </w:r>
+          </w:p>
+        </w:tc>
+        <w:tc>
+          <w:tcPr>
+            <w:tcW w:w="6405" w:type="dxa"/>
+            <w:hideMark/>
+          </w:tcPr>
+          <w:p>
+            <w:pPr>
+              <w:spacing w:before="144" w:after="264"/>
+              <w:rPr>
+                <w:rFonts w:ascii="Helvetica" w:eastAsia="Times New Roman" w:hAnsi="Helvetica" w:cs="Helvetica"/>
+                <w:sz w:val="26"/>
+                <w:szCs w:val="26"/>
+                <w:lang w:val="es-AR"/>
+              </w:rPr>
+            </w:pPr>
+            <w:r>
+              <w:rPr>
+                <w:rFonts w:ascii="Helvetica" w:eastAsia="Times New Roman" w:hAnsi="Helvetica" w:cs="Helvetica"/>
+                <w:sz w:val="26"/>
+                <w:szCs w:val="26"/>
+                <w:lang w:val="es-AR"/>
+              </w:rPr>
+              <w:t xml:space="preserve">Los </w:t>
+            </w:r>
+            <w:proofErr w:type="spellStart"/>
+            <w:r>
+              <w:rPr>
+                <w:rFonts w:ascii="Helvetica" w:eastAsia="Times New Roman" w:hAnsi="Helvetica" w:cs="Helvetica"/>
+                <w:sz w:val="26"/>
+                <w:szCs w:val="26"/>
+                <w:lang w:val="es-AR"/>
+              </w:rPr>
+              <w:t>endpoints</w:t>
+            </w:r>
+            <w:proofErr w:type="spellEnd"/>
+            <w:r>
+              <w:rPr>
+                <w:rFonts w:ascii="Helvetica" w:eastAsia="Times New Roman" w:hAnsi="Helvetica" w:cs="Helvetica"/>
+                <w:sz w:val="26"/>
+                <w:szCs w:val="26"/>
+                <w:lang w:val="es-AR"/>
+              </w:rPr>
+              <w:t xml:space="preserve">: permisos, validación de entrada, llamada a un selector o a un </w:t>
+            </w:r>
+            <w:proofErr w:type="spellStart"/>
+            <w:r>
+              <w:rPr>
+                <w:rFonts w:ascii="Helvetica" w:eastAsia="Times New Roman" w:hAnsi="Helvetica" w:cs="Helvetica"/>
+                <w:sz w:val="26"/>
+                <w:szCs w:val="26"/>
+                <w:lang w:val="es-AR"/>
+              </w:rPr>
+              <w:t>service</w:t>
+            </w:r>
+            <w:proofErr w:type="spellEnd"/>
+            <w:r>
+              <w:rPr>
+                <w:rFonts w:ascii="Helvetica" w:eastAsia="Times New Roman" w:hAnsi="Helvetica" w:cs="Helvetica"/>
+                <w:sz w:val="26"/>
+                <w:szCs w:val="26"/>
+                <w:lang w:val="es-AR"/>
+              </w:rPr>
+              <w:t>, y traducción de errores.</w:t>
+            </w:r>
+          </w:p>
+        </w:tc>
+        <w:tc>
+          <w:tcPr>
+            <w:tcW w:w="3260" w:type="dxa"/>
+            <w:hideMark/>
+          </w:tcPr>
+          <w:p>
+            <w:pPr>
+              <w:spacing w:before="144" w:after="264"/>
+              <w:rPr>
+                <w:rFonts w:ascii="Helvetica" w:eastAsia="Times New Roman" w:hAnsi="Helvetica" w:cs="Helvetica"/>
+                <w:sz w:val="26"/>
+                <w:szCs w:val="26"/>
+              </w:rPr>
+            </w:pPr>
+            <w:r>
+              <w:rPr>
+                <w:rFonts w:ascii="Helvetica" w:eastAsia="Times New Roman" w:hAnsi="Helvetica" w:cs="Helvetica"/>
+                <w:sz w:val="26"/>
+                <w:szCs w:val="26"/>
+              </w:rPr>
+              <w:t xml:space="preserve">No </w:t>
+            </w:r>
+            <w:proofErr w:type="spellStart"/>
+            <w:r>
+              <w:rPr>
+                <w:rFonts w:ascii="Helvetica" w:eastAsia="Times New Roman" w:hAnsi="Helvetica" w:cs="Helvetica"/>
+                <w:sz w:val="26"/>
+                <w:szCs w:val="26"/>
+              </w:rPr>
+              <w:t>debería</w:t>
+            </w:r>
+            <w:proofErr w:type="spellEnd"/>
+            <w:r>
+              <w:rPr>
+                <w:rFonts w:ascii="Helvetica" w:eastAsia="Times New Roman" w:hAnsi="Helvetica" w:cs="Helvetica"/>
+                <w:sz w:val="26"/>
+                <w:szCs w:val="26"/>
+              </w:rPr>
+              <w:t xml:space="preserve"> </w:t>
+            </w:r>
+            <w:proofErr w:type="spellStart"/>
+            <w:r>
+              <w:rPr>
+                <w:rFonts w:ascii="Helvetica" w:eastAsia="Times New Roman" w:hAnsi="Helvetica" w:cs="Helvetica"/>
+                <w:sz w:val="26"/>
+                <w:szCs w:val="26"/>
+              </w:rPr>
+              <w:t>tener</w:t>
+            </w:r>
+            <w:proofErr w:type="spellEnd"/>
+            <w:r>
+              <w:rPr>
+                <w:rFonts w:ascii="Helvetica" w:eastAsia="Times New Roman" w:hAnsi="Helvetica" w:cs="Helvetica"/>
+                <w:sz w:val="26"/>
+                <w:szCs w:val="26"/>
+              </w:rPr>
+              <w:t xml:space="preserve"> </w:t>
+            </w:r>
+            <w:proofErr w:type="spellStart"/>
+            <w:r>
+              <w:rPr>
+                <w:rFonts w:ascii="Helvetica" w:eastAsia="Times New Roman" w:hAnsi="Helvetica" w:cs="Helvetica"/>
+                <w:sz w:val="26"/>
+                <w:szCs w:val="26"/>
+              </w:rPr>
+              <w:t>lógica</w:t>
+            </w:r>
+            <w:proofErr w:type="spellEnd"/>
+          </w:p>
+        </w:tc>
+      </w:tr>
+    </w:tbl>
     <w:p>
       <w:pPr>
         <w:rPr>

</xml_diff>

<commit_message>
feat: Clase 07 y hasta punto 9 (#6)
</commit_message>
<xml_diff>
--- a/221_backend/App.docx
+++ b/221_backend/App.docx
@@ -175,8 +175,6 @@
               </w:rPr>
               <w:t>catalogs</w:t>
             </w:r>
-            <w:bookmarkStart w:id="0" w:name="_GoBack"/>
-            <w:bookmarkEnd w:id="0"/>
           </w:p>
         </w:tc>
         <w:tc>
@@ -243,6 +241,7 @@
         <w:tc>
           <w:tcPr>
             <w:tcW w:w="1696" w:type="dxa"/>
+            <w:vMerge w:val="restart"/>
             <w:hideMark/>
           </w:tcPr>
           <w:p>
@@ -309,7 +308,7 @@
         <w:tc>
           <w:tcPr>
             <w:tcW w:w="1696" w:type="dxa"/>
-            <w:vMerge w:val="restart"/>
+            <w:vMerge/>
             <w:hideMark/>
           </w:tcPr>
           <w:p>
@@ -317,30 +316,9 @@
               <w:spacing w:before="144" w:after="264"/>
               <w:rPr>
                 <w:rFonts w:ascii="Georgia" w:eastAsia="Times New Roman" w:hAnsi="Georgia" w:cs="Times New Roman"/>
-              </w:rPr>
-            </w:pPr>
-            <w:r>
-              <w:rPr>
-                <w:rFonts w:ascii="Consolas" w:eastAsia="Times New Roman" w:hAnsi="Consolas" w:cs="Courier New"/>
-                <w:shd w:val="clear" w:color="auto" w:fill="181D27"/>
-              </w:rPr>
-              <w:t>institutions</w:t>
-            </w:r>
-          </w:p>
-          <w:p>
-            <w:pPr>
-              <w:spacing w:before="144" w:after="264"/>
-              <w:rPr>
-                <w:rFonts w:ascii="Georgia" w:eastAsia="Times New Roman" w:hAnsi="Georgia" w:cs="Times New Roman"/>
-              </w:rPr>
-            </w:pPr>
-            <w:r>
-              <w:rPr>
-                <w:rFonts w:ascii="Consolas" w:eastAsia="Times New Roman" w:hAnsi="Consolas" w:cs="Courier New"/>
-                <w:shd w:val="clear" w:color="auto" w:fill="181D27"/>
-              </w:rPr>
-              <w:t>academics</w:t>
-            </w:r>
+                <w:lang w:val="es-AR"/>
+              </w:rPr>
+            </w:pPr>
           </w:p>
         </w:tc>
         <w:tc>
@@ -469,6 +447,85 @@
         </w:tc>
       </w:tr>
       <w:tr>
+        <w:trPr>
+          <w:trHeight w:val="58"/>
+        </w:trPr>
+        <w:tc>
+          <w:tcPr>
+            <w:tcW w:w="1696" w:type="dxa"/>
+            <w:vMerge w:val="restart"/>
+            <w:hideMark/>
+          </w:tcPr>
+          <w:p>
+            <w:pPr>
+              <w:spacing w:before="144" w:after="264"/>
+              <w:rPr>
+                <w:rFonts w:ascii="Georgia" w:eastAsia="Times New Roman" w:hAnsi="Georgia" w:cs="Times New Roman"/>
+              </w:rPr>
+            </w:pPr>
+            <w:r>
+              <w:rPr>
+                <w:rFonts w:ascii="Consolas" w:eastAsia="Times New Roman" w:hAnsi="Consolas" w:cs="Courier New"/>
+                <w:shd w:val="clear" w:color="auto" w:fill="181D27"/>
+              </w:rPr>
+              <w:t>academics</w:t>
+            </w:r>
+          </w:p>
+          <w:p>
+            <w:pPr>
+              <w:spacing w:before="144" w:after="264"/>
+              <w:rPr>
+                <w:rFonts w:ascii="Georgia" w:eastAsia="Times New Roman" w:hAnsi="Georgia" w:cs="Times New Roman"/>
+                <w:lang w:val="es-AR"/>
+              </w:rPr>
+            </w:pPr>
+          </w:p>
+        </w:tc>
+        <w:tc>
+          <w:tcPr>
+            <w:tcW w:w="2694" w:type="dxa"/>
+            <w:hideMark/>
+          </w:tcPr>
+          <w:p>
+            <w:pPr>
+              <w:spacing w:before="144" w:after="264"/>
+              <w:rPr>
+                <w:rFonts w:ascii="Georgia" w:eastAsia="Times New Roman" w:hAnsi="Georgia" w:cs="Times New Roman"/>
+              </w:rPr>
+            </w:pPr>
+            <w:r>
+              <w:rPr>
+                <w:rFonts w:ascii="Consolas" w:eastAsia="Times New Roman" w:hAnsi="Consolas" w:cs="Courier New"/>
+                <w:shd w:val="clear" w:color="auto" w:fill="181D27"/>
+              </w:rPr>
+              <w:t>Career</w:t>
+            </w:r>
+          </w:p>
+        </w:tc>
+        <w:tc>
+          <w:tcPr>
+            <w:tcW w:w="7087" w:type="dxa"/>
+            <w:hideMark/>
+          </w:tcPr>
+          <w:p>
+            <w:pPr>
+              <w:spacing w:before="144" w:after="264"/>
+              <w:rPr>
+                <w:rFonts w:ascii="Helvetica" w:eastAsia="Times New Roman" w:hAnsi="Helvetica" w:cs="Times New Roman"/>
+                <w:lang w:val="es-AR"/>
+              </w:rPr>
+            </w:pPr>
+            <w:r>
+              <w:rPr>
+                <w:rFonts w:ascii="Helvetica" w:eastAsia="Times New Roman" w:hAnsi="Helvetica" w:cs="Times New Roman"/>
+                <w:lang w:val="es-AR"/>
+              </w:rPr>
+              <w:t>Una carrera de una institución. El nombre es único por institución, no global: dos institutos pueden dictar la misma.</w:t>
+            </w:r>
+          </w:p>
+        </w:tc>
+      </w:tr>
+      <w:tr>
         <w:tc>
           <w:tcPr>
             <w:tcW w:w="1696" w:type="dxa"/>
@@ -502,7 +559,7 @@
                 <w:rFonts w:ascii="Consolas" w:eastAsia="Times New Roman" w:hAnsi="Consolas" w:cs="Courier New"/>
                 <w:shd w:val="clear" w:color="auto" w:fill="181D27"/>
               </w:rPr>
-              <w:t>Career</w:t>
+              <w:t>Student</w:t>
             </w:r>
           </w:p>
         </w:tc>
@@ -524,7 +581,7 @@
                 <w:rFonts w:ascii="Helvetica" w:eastAsia="Times New Roman" w:hAnsi="Helvetica" w:cs="Times New Roman"/>
                 <w:lang w:val="es-AR"/>
               </w:rPr>
-              <w:t>Una carrera de una institución. El nombre es único por institución, no global: dos institutos pueden dictar la misma.</w:t>
+              <w:t>El alumno, cargado por el docente. No es una cuenta: no inicia sesión. Cuelga de la institución y no de la cursada, así la misma persona no se duplica en cada materia.</w:t>
             </w:r>
           </w:p>
         </w:tc>
@@ -533,7 +590,7 @@
         <w:tc>
           <w:tcPr>
             <w:tcW w:w="1696" w:type="dxa"/>
-            <w:vMerge w:val="restart"/>
+            <w:vMerge/>
             <w:hideMark/>
           </w:tcPr>
           <w:p>
@@ -541,6 +598,21 @@
               <w:spacing w:before="144" w:after="264"/>
               <w:rPr>
                 <w:rFonts w:ascii="Georgia" w:eastAsia="Times New Roman" w:hAnsi="Georgia" w:cs="Times New Roman"/>
+                <w:lang w:val="es-AR"/>
+              </w:rPr>
+            </w:pPr>
+          </w:p>
+        </w:tc>
+        <w:tc>
+          <w:tcPr>
+            <w:tcW w:w="2694" w:type="dxa"/>
+            <w:hideMark/>
+          </w:tcPr>
+          <w:p>
+            <w:pPr>
+              <w:spacing w:before="144" w:after="264"/>
+              <w:rPr>
+                <w:rFonts w:ascii="Georgia" w:eastAsia="Times New Roman" w:hAnsi="Georgia" w:cs="Times New Roman"/>
               </w:rPr>
             </w:pPr>
             <w:r>
@@ -548,43 +620,7 @@
                 <w:rFonts w:ascii="Consolas" w:eastAsia="Times New Roman" w:hAnsi="Consolas" w:cs="Courier New"/>
                 <w:shd w:val="clear" w:color="auto" w:fill="181D27"/>
               </w:rPr>
-              <w:t>academics</w:t>
-            </w:r>
-          </w:p>
-          <w:p>
-            <w:pPr>
-              <w:spacing w:before="144" w:after="264"/>
-              <w:rPr>
-                <w:rFonts w:ascii="Georgia" w:eastAsia="Times New Roman" w:hAnsi="Georgia" w:cs="Times New Roman"/>
-              </w:rPr>
-            </w:pPr>
-            <w:r>
-              <w:rPr>
-                <w:rFonts w:ascii="Consolas" w:eastAsia="Times New Roman" w:hAnsi="Consolas" w:cs="Courier New"/>
-                <w:shd w:val="clear" w:color="auto" w:fill="181D27"/>
-              </w:rPr>
-              <w:t>projects</w:t>
-            </w:r>
-          </w:p>
-        </w:tc>
-        <w:tc>
-          <w:tcPr>
-            <w:tcW w:w="2694" w:type="dxa"/>
-            <w:hideMark/>
-          </w:tcPr>
-          <w:p>
-            <w:pPr>
-              <w:spacing w:before="144" w:after="264"/>
-              <w:rPr>
-                <w:rFonts w:ascii="Georgia" w:eastAsia="Times New Roman" w:hAnsi="Georgia" w:cs="Times New Roman"/>
-              </w:rPr>
-            </w:pPr>
-            <w:r>
-              <w:rPr>
-                <w:rFonts w:ascii="Consolas" w:eastAsia="Times New Roman" w:hAnsi="Consolas" w:cs="Courier New"/>
-                <w:shd w:val="clear" w:color="auto" w:fill="181D27"/>
-              </w:rPr>
-              <w:t>Student</w:t>
+              <w:t>Course</w:t>
             </w:r>
           </w:p>
         </w:tc>
@@ -606,7 +642,7 @@
                 <w:rFonts w:ascii="Helvetica" w:eastAsia="Times New Roman" w:hAnsi="Helvetica" w:cs="Times New Roman"/>
                 <w:lang w:val="es-AR"/>
               </w:rPr>
-              <w:t>El alumno, cargado por el docente. No es una cuenta: no inicia sesión. Cuelga de la institución y no de la cursada, así la misma persona no se duplica en cada materia.</w:t>
+              <w:t>La cursada: la comisión concreta donde un docente organiza a sus alumnos. El ciclo lectivo son dos campos propios (año y cuatrimestre) y no una tabla aparte.</w:t>
             </w:r>
           </w:p>
         </w:tc>
@@ -640,13 +676,15 @@
                 <w:rFonts w:ascii="Georgia" w:eastAsia="Times New Roman" w:hAnsi="Georgia" w:cs="Times New Roman"/>
               </w:rPr>
             </w:pPr>
+            <w:proofErr w:type="spellStart"/>
             <w:r>
               <w:rPr>
                 <w:rFonts w:ascii="Consolas" w:eastAsia="Times New Roman" w:hAnsi="Consolas" w:cs="Courier New"/>
                 <w:shd w:val="clear" w:color="auto" w:fill="181D27"/>
               </w:rPr>
-              <w:t>Course</w:t>
-            </w:r>
+              <w:t>CourseStudent</w:t>
+            </w:r>
+            <w:proofErr w:type="spellEnd"/>
           </w:p>
         </w:tc>
         <w:tc>
@@ -667,7 +705,7 @@
                 <w:rFonts w:ascii="Helvetica" w:eastAsia="Times New Roman" w:hAnsi="Helvetica" w:cs="Times New Roman"/>
                 <w:lang w:val="es-AR"/>
               </w:rPr>
-              <w:t>La cursada: la comisión concreta donde un docente organiza a sus alumnos. El ciclo lectivo son dos campos propios (año y cuatrimestre) y no una tabla aparte.</w:t>
+              <w:t>La inscripción: este alumno cursa esta comisión. Es la tabla intermedia entre cursada y alumno, escrita a mano.</w:t>
             </w:r>
           </w:p>
         </w:tc>
@@ -676,7 +714,7 @@
         <w:tc>
           <w:tcPr>
             <w:tcW w:w="1696" w:type="dxa"/>
-            <w:vMerge/>
+            <w:vMerge w:val="restart"/>
             <w:hideMark/>
           </w:tcPr>
           <w:p>
@@ -687,6 +725,13 @@
                 <w:lang w:val="es-AR"/>
               </w:rPr>
             </w:pPr>
+            <w:r>
+              <w:rPr>
+                <w:rFonts w:ascii="Consolas" w:eastAsia="Times New Roman" w:hAnsi="Consolas" w:cs="Courier New"/>
+                <w:shd w:val="clear" w:color="auto" w:fill="181D27"/>
+              </w:rPr>
+              <w:t>projects</w:t>
+            </w:r>
           </w:p>
         </w:tc>
         <w:tc>
@@ -707,7 +752,7 @@
                 <w:rFonts w:ascii="Consolas" w:eastAsia="Times New Roman" w:hAnsi="Consolas" w:cs="Courier New"/>
                 <w:shd w:val="clear" w:color="auto" w:fill="181D27"/>
               </w:rPr>
-              <w:t>CourseStudent</w:t>
+              <w:t>ProjectAsset</w:t>
             </w:r>
             <w:proofErr w:type="spellEnd"/>
           </w:p>
@@ -730,7 +775,7 @@
                 <w:rFonts w:ascii="Helvetica" w:eastAsia="Times New Roman" w:hAnsi="Helvetica" w:cs="Times New Roman"/>
                 <w:lang w:val="es-AR"/>
               </w:rPr>
-              <w:t>La inscripción: este alumno cursa esta comisión. Es la tabla intermedia entre cursada y alumno, escrita a mano.</w:t>
+              <w:t>Lo que se sube y queda guardado en el servidor: imágenes y documentos. Una de las imágenes es la portada de la ficha.</w:t>
             </w:r>
           </w:p>
         </w:tc>
@@ -750,75 +795,6 @@
                 <w:lang w:val="es-AR"/>
               </w:rPr>
             </w:pPr>
-          </w:p>
-        </w:tc>
-        <w:tc>
-          <w:tcPr>
-            <w:tcW w:w="2694" w:type="dxa"/>
-            <w:hideMark/>
-          </w:tcPr>
-          <w:p>
-            <w:pPr>
-              <w:spacing w:before="144" w:after="264"/>
-              <w:rPr>
-                <w:rFonts w:ascii="Georgia" w:eastAsia="Times New Roman" w:hAnsi="Georgia" w:cs="Times New Roman"/>
-              </w:rPr>
-            </w:pPr>
-            <w:proofErr w:type="spellStart"/>
-            <w:r>
-              <w:rPr>
-                <w:rFonts w:ascii="Consolas" w:eastAsia="Times New Roman" w:hAnsi="Consolas" w:cs="Courier New"/>
-                <w:shd w:val="clear" w:color="auto" w:fill="181D27"/>
-              </w:rPr>
-              <w:t>ProjectAsset</w:t>
-            </w:r>
-            <w:proofErr w:type="spellEnd"/>
-          </w:p>
-        </w:tc>
-        <w:tc>
-          <w:tcPr>
-            <w:tcW w:w="7087" w:type="dxa"/>
-            <w:hideMark/>
-          </w:tcPr>
-          <w:p>
-            <w:pPr>
-              <w:spacing w:before="144" w:after="264"/>
-              <w:rPr>
-                <w:rFonts w:ascii="Helvetica" w:eastAsia="Times New Roman" w:hAnsi="Helvetica" w:cs="Times New Roman"/>
-                <w:lang w:val="es-AR"/>
-              </w:rPr>
-            </w:pPr>
-            <w:r>
-              <w:rPr>
-                <w:rFonts w:ascii="Helvetica" w:eastAsia="Times New Roman" w:hAnsi="Helvetica" w:cs="Times New Roman"/>
-                <w:lang w:val="es-AR"/>
-              </w:rPr>
-              <w:t>Lo que se sube y queda guardado en el servidor: imágenes y documentos. Una de las imágenes es la portada de la ficha.</w:t>
-            </w:r>
-          </w:p>
-        </w:tc>
-      </w:tr>
-      <w:tr>
-        <w:tc>
-          <w:tcPr>
-            <w:tcW w:w="1696" w:type="dxa"/>
-            <w:vMerge w:val="restart"/>
-            <w:hideMark/>
-          </w:tcPr>
-          <w:p>
-            <w:pPr>
-              <w:spacing w:before="144" w:after="264"/>
-              <w:rPr>
-                <w:rFonts w:ascii="Georgia" w:eastAsia="Times New Roman" w:hAnsi="Georgia" w:cs="Times New Roman"/>
-              </w:rPr>
-            </w:pPr>
-            <w:r>
-              <w:rPr>
-                <w:rFonts w:ascii="Consolas" w:eastAsia="Times New Roman" w:hAnsi="Consolas" w:cs="Courier New"/>
-                <w:shd w:val="clear" w:color="auto" w:fill="181D27"/>
-              </w:rPr>
-              <w:t>projects</w:t>
-            </w:r>
           </w:p>
         </w:tc>
         <w:tc>
@@ -1150,6 +1126,2211 @@
         </w:rPr>
       </w:pPr>
     </w:p>
+    <w:p>
+      <w:pPr>
+        <w:rPr>
+          <w:lang w:val="es-AR"/>
+        </w:rPr>
+      </w:pPr>
+    </w:p>
+    <w:p>
+      <w:pPr>
+        <w:rPr>
+          <w:lang w:val="es-AR"/>
+        </w:rPr>
+      </w:pPr>
+    </w:p>
+    <w:tbl>
+      <w:tblPr>
+        <w:tblStyle w:val="Tablaconcuadrcula"/>
+        <w:tblW w:w="0" w:type="auto"/>
+        <w:tblLook w:val="04A0" w:firstRow="1" w:lastRow="0" w:firstColumn="1" w:lastColumn="0" w:noHBand="0" w:noVBand="1"/>
+      </w:tblPr>
+      <w:tblGrid>
+        <w:gridCol w:w="2332"/>
+        <w:gridCol w:w="5886"/>
+        <w:gridCol w:w="3259"/>
+      </w:tblGrid>
+      <w:tr>
+        <w:tc>
+          <w:tcPr>
+            <w:tcW w:w="2328" w:type="dxa"/>
+            <w:hideMark/>
+          </w:tcPr>
+          <w:p>
+            <w:pPr>
+              <w:spacing w:before="144" w:after="264"/>
+              <w:rPr>
+                <w:rFonts w:ascii="Helvetica" w:eastAsia="Times New Roman" w:hAnsi="Helvetica" w:cs="Helvetica"/>
+                <w:b/>
+                <w:bCs/>
+                <w:sz w:val="28"/>
+                <w:szCs w:val="26"/>
+              </w:rPr>
+            </w:pPr>
+            <w:proofErr w:type="spellStart"/>
+            <w:r>
+              <w:rPr>
+                <w:rFonts w:ascii="Helvetica" w:eastAsia="Times New Roman" w:hAnsi="Helvetica" w:cs="Helvetica"/>
+                <w:b/>
+                <w:bCs/>
+                <w:sz w:val="28"/>
+                <w:szCs w:val="26"/>
+              </w:rPr>
+              <w:lastRenderedPageBreak/>
+              <w:t>Archivo</w:t>
+            </w:r>
+            <w:proofErr w:type="spellEnd"/>
+          </w:p>
+        </w:tc>
+        <w:tc>
+          <w:tcPr>
+            <w:tcW w:w="5889" w:type="dxa"/>
+            <w:hideMark/>
+          </w:tcPr>
+          <w:p>
+            <w:pPr>
+              <w:spacing w:before="144" w:after="264"/>
+              <w:rPr>
+                <w:rFonts w:ascii="Helvetica" w:eastAsia="Times New Roman" w:hAnsi="Helvetica" w:cs="Helvetica"/>
+                <w:b/>
+                <w:bCs/>
+                <w:sz w:val="28"/>
+                <w:szCs w:val="26"/>
+              </w:rPr>
+            </w:pPr>
+            <w:proofErr w:type="spellStart"/>
+            <w:r>
+              <w:rPr>
+                <w:rFonts w:ascii="Helvetica" w:eastAsia="Times New Roman" w:hAnsi="Helvetica" w:cs="Helvetica"/>
+                <w:b/>
+                <w:bCs/>
+                <w:sz w:val="28"/>
+                <w:szCs w:val="26"/>
+              </w:rPr>
+              <w:t>Qué</w:t>
+            </w:r>
+            <w:proofErr w:type="spellEnd"/>
+            <w:r>
+              <w:rPr>
+                <w:rFonts w:ascii="Helvetica" w:eastAsia="Times New Roman" w:hAnsi="Helvetica" w:cs="Helvetica"/>
+                <w:b/>
+                <w:bCs/>
+                <w:sz w:val="28"/>
+                <w:szCs w:val="26"/>
+              </w:rPr>
+              <w:t xml:space="preserve"> </w:t>
+            </w:r>
+            <w:proofErr w:type="spellStart"/>
+            <w:r>
+              <w:rPr>
+                <w:rFonts w:ascii="Helvetica" w:eastAsia="Times New Roman" w:hAnsi="Helvetica" w:cs="Helvetica"/>
+                <w:b/>
+                <w:bCs/>
+                <w:sz w:val="28"/>
+                <w:szCs w:val="26"/>
+              </w:rPr>
+              <w:t>es</w:t>
+            </w:r>
+            <w:proofErr w:type="spellEnd"/>
+          </w:p>
+        </w:tc>
+        <w:tc>
+          <w:tcPr>
+            <w:tcW w:w="3260" w:type="dxa"/>
+            <w:hideMark/>
+          </w:tcPr>
+          <w:p>
+            <w:pPr>
+              <w:spacing w:before="144" w:after="264"/>
+              <w:rPr>
+                <w:rFonts w:ascii="Helvetica" w:eastAsia="Times New Roman" w:hAnsi="Helvetica" w:cs="Helvetica"/>
+                <w:b/>
+                <w:bCs/>
+                <w:sz w:val="28"/>
+                <w:szCs w:val="26"/>
+                <w:lang w:val="es-AR"/>
+              </w:rPr>
+            </w:pPr>
+            <w:r>
+              <w:rPr>
+                <w:rFonts w:ascii="Helvetica" w:eastAsia="Times New Roman" w:hAnsi="Helvetica" w:cs="Helvetica"/>
+                <w:b/>
+                <w:bCs/>
+                <w:sz w:val="28"/>
+                <w:szCs w:val="26"/>
+                <w:lang w:val="es-AR"/>
+              </w:rPr>
+              <w:t>Cuánto lo vas a tocar</w:t>
+            </w:r>
+          </w:p>
+        </w:tc>
+      </w:tr>
+      <w:tr>
+        <w:tc>
+          <w:tcPr>
+            <w:tcW w:w="0" w:type="auto"/>
+            <w:hideMark/>
+          </w:tcPr>
+          <w:p>
+            <w:pPr>
+              <w:spacing w:before="144" w:after="264"/>
+              <w:rPr>
+                <w:rFonts w:ascii="Helvetica" w:eastAsia="Times New Roman" w:hAnsi="Helvetica" w:cs="Helvetica"/>
+                <w:sz w:val="28"/>
+                <w:szCs w:val="26"/>
+              </w:rPr>
+            </w:pPr>
+            <w:r>
+              <w:rPr>
+                <w:rFonts w:ascii="Helvetica" w:eastAsia="Times New Roman" w:hAnsi="Helvetica" w:cs="Helvetica"/>
+                <w:sz w:val="28"/>
+                <w:szCs w:val="26"/>
+                <w:shd w:val="clear" w:color="auto" w:fill="181D27"/>
+              </w:rPr>
+              <w:t>manage.py</w:t>
+            </w:r>
+          </w:p>
+        </w:tc>
+        <w:tc>
+          <w:tcPr>
+            <w:tcW w:w="5889" w:type="dxa"/>
+            <w:hideMark/>
+          </w:tcPr>
+          <w:p>
+            <w:pPr>
+              <w:spacing w:before="144" w:after="264"/>
+              <w:rPr>
+                <w:rFonts w:ascii="Helvetica" w:eastAsia="Times New Roman" w:hAnsi="Helvetica" w:cs="Helvetica"/>
+                <w:sz w:val="28"/>
+                <w:szCs w:val="26"/>
+                <w:lang w:val="es-AR"/>
+              </w:rPr>
+            </w:pPr>
+            <w:r>
+              <w:rPr>
+                <w:rFonts w:ascii="Helvetica" w:eastAsia="Times New Roman" w:hAnsi="Helvetica" w:cs="Helvetica"/>
+                <w:sz w:val="28"/>
+                <w:szCs w:val="26"/>
+                <w:lang w:val="es-AR"/>
+              </w:rPr>
+              <w:t xml:space="preserve">El comando del proyecto: migrar, levantar el servidor de desarrollo, correr las pruebas, crear un </w:t>
+            </w:r>
+            <w:proofErr w:type="spellStart"/>
+            <w:r>
+              <w:rPr>
+                <w:rFonts w:ascii="Helvetica" w:eastAsia="Times New Roman" w:hAnsi="Helvetica" w:cs="Helvetica"/>
+                <w:sz w:val="28"/>
+                <w:szCs w:val="26"/>
+                <w:lang w:val="es-AR"/>
+              </w:rPr>
+              <w:t>superusuario</w:t>
+            </w:r>
+            <w:proofErr w:type="spellEnd"/>
+            <w:r>
+              <w:rPr>
+                <w:rFonts w:ascii="Helvetica" w:eastAsia="Times New Roman" w:hAnsi="Helvetica" w:cs="Helvetica"/>
+                <w:sz w:val="28"/>
+                <w:szCs w:val="26"/>
+                <w:lang w:val="es-AR"/>
+              </w:rPr>
+              <w:t>.</w:t>
+            </w:r>
+          </w:p>
+        </w:tc>
+        <w:tc>
+          <w:tcPr>
+            <w:tcW w:w="3260" w:type="dxa"/>
+            <w:hideMark/>
+          </w:tcPr>
+          <w:p>
+            <w:pPr>
+              <w:spacing w:before="144" w:after="264"/>
+              <w:rPr>
+                <w:rFonts w:ascii="Helvetica" w:eastAsia="Times New Roman" w:hAnsi="Helvetica" w:cs="Helvetica"/>
+                <w:sz w:val="28"/>
+                <w:szCs w:val="26"/>
+                <w:lang w:val="es-AR"/>
+              </w:rPr>
+            </w:pPr>
+            <w:r>
+              <w:rPr>
+                <w:rFonts w:ascii="Helvetica" w:eastAsia="Times New Roman" w:hAnsi="Helvetica" w:cs="Helvetica"/>
+                <w:sz w:val="28"/>
+                <w:szCs w:val="26"/>
+                <w:lang w:val="es-AR"/>
+              </w:rPr>
+              <w:t>Nunca se edita, se usa todo el tiempo</w:t>
+            </w:r>
+          </w:p>
+        </w:tc>
+      </w:tr>
+      <w:tr>
+        <w:tc>
+          <w:tcPr>
+            <w:tcW w:w="0" w:type="auto"/>
+            <w:hideMark/>
+          </w:tcPr>
+          <w:p>
+            <w:pPr>
+              <w:spacing w:before="144" w:after="264"/>
+              <w:rPr>
+                <w:rFonts w:ascii="Helvetica" w:eastAsia="Times New Roman" w:hAnsi="Helvetica" w:cs="Helvetica"/>
+                <w:sz w:val="28"/>
+                <w:szCs w:val="26"/>
+              </w:rPr>
+            </w:pPr>
+            <w:r>
+              <w:rPr>
+                <w:rFonts w:ascii="Helvetica" w:eastAsia="Times New Roman" w:hAnsi="Helvetica" w:cs="Helvetica"/>
+                <w:sz w:val="28"/>
+                <w:szCs w:val="26"/>
+                <w:shd w:val="clear" w:color="auto" w:fill="181D27"/>
+              </w:rPr>
+              <w:t>settings.py</w:t>
+            </w:r>
+          </w:p>
+        </w:tc>
+        <w:tc>
+          <w:tcPr>
+            <w:tcW w:w="5889" w:type="dxa"/>
+            <w:hideMark/>
+          </w:tcPr>
+          <w:p>
+            <w:pPr>
+              <w:spacing w:before="144" w:after="264"/>
+              <w:rPr>
+                <w:rFonts w:ascii="Helvetica" w:eastAsia="Times New Roman" w:hAnsi="Helvetica" w:cs="Helvetica"/>
+                <w:sz w:val="28"/>
+                <w:szCs w:val="26"/>
+                <w:lang w:val="es-AR"/>
+              </w:rPr>
+            </w:pPr>
+            <w:r>
+              <w:rPr>
+                <w:rFonts w:ascii="Helvetica" w:eastAsia="Times New Roman" w:hAnsi="Helvetica" w:cs="Helvetica"/>
+                <w:sz w:val="28"/>
+                <w:szCs w:val="26"/>
+                <w:lang w:val="es-AR"/>
+              </w:rPr>
+              <w:t>Un módulo de Python con variables en mayúscula: qué apps hay, qué base de datos, qué zona horaria, dónde van los archivos subidos.</w:t>
+            </w:r>
+          </w:p>
+        </w:tc>
+        <w:tc>
+          <w:tcPr>
+            <w:tcW w:w="3260" w:type="dxa"/>
+            <w:hideMark/>
+          </w:tcPr>
+          <w:p>
+            <w:pPr>
+              <w:spacing w:before="144" w:after="264"/>
+              <w:rPr>
+                <w:rFonts w:ascii="Helvetica" w:eastAsia="Times New Roman" w:hAnsi="Helvetica" w:cs="Helvetica"/>
+                <w:sz w:val="28"/>
+                <w:szCs w:val="26"/>
+                <w:lang w:val="es-AR"/>
+              </w:rPr>
+            </w:pPr>
+            <w:r>
+              <w:rPr>
+                <w:rFonts w:ascii="Helvetica" w:eastAsia="Times New Roman" w:hAnsi="Helvetica" w:cs="Helvetica"/>
+                <w:sz w:val="28"/>
+                <w:szCs w:val="26"/>
+                <w:lang w:val="es-AR"/>
+              </w:rPr>
+              <w:t>Mucho, y de a poco</w:t>
+            </w:r>
+          </w:p>
+        </w:tc>
+      </w:tr>
+      <w:tr>
+        <w:tc>
+          <w:tcPr>
+            <w:tcW w:w="0" w:type="auto"/>
+            <w:hideMark/>
+          </w:tcPr>
+          <w:p>
+            <w:pPr>
+              <w:spacing w:before="144" w:after="264"/>
+              <w:rPr>
+                <w:rFonts w:ascii="Helvetica" w:eastAsia="Times New Roman" w:hAnsi="Helvetica" w:cs="Helvetica"/>
+                <w:sz w:val="28"/>
+                <w:szCs w:val="26"/>
+              </w:rPr>
+            </w:pPr>
+            <w:r>
+              <w:rPr>
+                <w:rFonts w:ascii="Helvetica" w:eastAsia="Times New Roman" w:hAnsi="Helvetica" w:cs="Helvetica"/>
+                <w:sz w:val="28"/>
+                <w:szCs w:val="26"/>
+                <w:shd w:val="clear" w:color="auto" w:fill="181D27"/>
+              </w:rPr>
+              <w:t>urls.py</w:t>
+            </w:r>
+          </w:p>
+        </w:tc>
+        <w:tc>
+          <w:tcPr>
+            <w:tcW w:w="5889" w:type="dxa"/>
+            <w:hideMark/>
+          </w:tcPr>
+          <w:p>
+            <w:pPr>
+              <w:spacing w:before="144" w:after="264"/>
+              <w:rPr>
+                <w:rFonts w:ascii="Helvetica" w:eastAsia="Times New Roman" w:hAnsi="Helvetica" w:cs="Helvetica"/>
+                <w:sz w:val="28"/>
+                <w:szCs w:val="26"/>
+                <w:lang w:val="es-AR"/>
+              </w:rPr>
+            </w:pPr>
+            <w:r>
+              <w:rPr>
+                <w:rFonts w:ascii="Helvetica" w:eastAsia="Times New Roman" w:hAnsi="Helvetica" w:cs="Helvetica"/>
+                <w:sz w:val="28"/>
+                <w:szCs w:val="26"/>
+                <w:lang w:val="es-AR"/>
+              </w:rPr>
+              <w:t>El mapa de rutas del proyecto: qué URL atiende qué código.</w:t>
+            </w:r>
+          </w:p>
+        </w:tc>
+        <w:tc>
+          <w:tcPr>
+            <w:tcW w:w="3260" w:type="dxa"/>
+            <w:hideMark/>
+          </w:tcPr>
+          <w:p>
+            <w:pPr>
+              <w:spacing w:before="144" w:after="264"/>
+              <w:rPr>
+                <w:rFonts w:ascii="Helvetica" w:eastAsia="Times New Roman" w:hAnsi="Helvetica" w:cs="Helvetica"/>
+                <w:sz w:val="28"/>
+                <w:szCs w:val="26"/>
+                <w:lang w:val="es-AR"/>
+              </w:rPr>
+            </w:pPr>
+            <w:r>
+              <w:rPr>
+                <w:rFonts w:ascii="Helvetica" w:eastAsia="Times New Roman" w:hAnsi="Helvetica" w:cs="Helvetica"/>
+                <w:sz w:val="28"/>
+                <w:szCs w:val="26"/>
+                <w:lang w:val="es-AR"/>
+              </w:rPr>
+              <w:t>Una vez, casi al final</w:t>
+            </w:r>
+          </w:p>
+        </w:tc>
+      </w:tr>
+      <w:tr>
+        <w:tc>
+          <w:tcPr>
+            <w:tcW w:w="0" w:type="auto"/>
+            <w:hideMark/>
+          </w:tcPr>
+          <w:p>
+            <w:pPr>
+              <w:spacing w:before="144" w:after="264"/>
+              <w:rPr>
+                <w:rFonts w:ascii="Helvetica" w:eastAsia="Times New Roman" w:hAnsi="Helvetica" w:cs="Helvetica"/>
+                <w:sz w:val="28"/>
+                <w:szCs w:val="26"/>
+                <w:lang w:val="es-AR"/>
+              </w:rPr>
+            </w:pPr>
+            <w:r>
+              <w:rPr>
+                <w:rFonts w:ascii="Helvetica" w:eastAsia="Times New Roman" w:hAnsi="Helvetica" w:cs="Helvetica"/>
+                <w:sz w:val="28"/>
+                <w:szCs w:val="26"/>
+                <w:shd w:val="clear" w:color="auto" w:fill="181D27"/>
+                <w:lang w:val="es-AR"/>
+              </w:rPr>
+              <w:t>wsgi.py</w:t>
+            </w:r>
+            <w:r>
+              <w:rPr>
+                <w:rFonts w:ascii="Helvetica" w:eastAsia="Times New Roman" w:hAnsi="Helvetica" w:cs="Helvetica"/>
+                <w:sz w:val="28"/>
+                <w:szCs w:val="26"/>
+                <w:lang w:val="es-AR"/>
+              </w:rPr>
+              <w:t xml:space="preserve"> y </w:t>
+            </w:r>
+            <w:r>
+              <w:rPr>
+                <w:rFonts w:ascii="Helvetica" w:eastAsia="Times New Roman" w:hAnsi="Helvetica" w:cs="Helvetica"/>
+                <w:sz w:val="28"/>
+                <w:szCs w:val="26"/>
+                <w:shd w:val="clear" w:color="auto" w:fill="181D27"/>
+                <w:lang w:val="es-AR"/>
+              </w:rPr>
+              <w:t>asgi.py</w:t>
+            </w:r>
+          </w:p>
+        </w:tc>
+        <w:tc>
+          <w:tcPr>
+            <w:tcW w:w="5889" w:type="dxa"/>
+            <w:hideMark/>
+          </w:tcPr>
+          <w:p>
+            <w:pPr>
+              <w:spacing w:before="144" w:after="264"/>
+              <w:rPr>
+                <w:rFonts w:ascii="Helvetica" w:eastAsia="Times New Roman" w:hAnsi="Helvetica" w:cs="Helvetica"/>
+                <w:sz w:val="28"/>
+                <w:szCs w:val="26"/>
+                <w:lang w:val="es-AR"/>
+              </w:rPr>
+            </w:pPr>
+            <w:r>
+              <w:rPr>
+                <w:rFonts w:ascii="Helvetica" w:eastAsia="Times New Roman" w:hAnsi="Helvetica" w:cs="Helvetica"/>
+                <w:sz w:val="28"/>
+                <w:szCs w:val="26"/>
+                <w:lang w:val="es-AR"/>
+              </w:rPr>
+              <w:t>Los puntos de entrada que usa un servidor real para levantar la aplicación.</w:t>
+            </w:r>
+          </w:p>
+        </w:tc>
+        <w:tc>
+          <w:tcPr>
+            <w:tcW w:w="3260" w:type="dxa"/>
+            <w:hideMark/>
+          </w:tcPr>
+          <w:p>
+            <w:pPr>
+              <w:spacing w:before="144" w:after="264"/>
+              <w:rPr>
+                <w:rFonts w:ascii="Helvetica" w:eastAsia="Times New Roman" w:hAnsi="Helvetica" w:cs="Helvetica"/>
+                <w:sz w:val="28"/>
+                <w:szCs w:val="26"/>
+              </w:rPr>
+            </w:pPr>
+            <w:proofErr w:type="spellStart"/>
+            <w:r>
+              <w:rPr>
+                <w:rFonts w:ascii="Helvetica" w:eastAsia="Times New Roman" w:hAnsi="Helvetica" w:cs="Helvetica"/>
+                <w:sz w:val="28"/>
+                <w:szCs w:val="26"/>
+              </w:rPr>
+              <w:t>Nunca</w:t>
+            </w:r>
+            <w:proofErr w:type="spellEnd"/>
+          </w:p>
+        </w:tc>
+      </w:tr>
+      <w:tr>
+        <w:tc>
+          <w:tcPr>
+            <w:tcW w:w="0" w:type="auto"/>
+            <w:hideMark/>
+          </w:tcPr>
+          <w:p>
+            <w:pPr>
+              <w:spacing w:before="144" w:after="264"/>
+              <w:rPr>
+                <w:rFonts w:ascii="Helvetica" w:eastAsia="Times New Roman" w:hAnsi="Helvetica" w:cs="Helvetica"/>
+                <w:sz w:val="28"/>
+                <w:szCs w:val="26"/>
+              </w:rPr>
+            </w:pPr>
+            <w:r>
+              <w:rPr>
+                <w:rFonts w:ascii="Helvetica" w:eastAsia="Times New Roman" w:hAnsi="Helvetica" w:cs="Helvetica"/>
+                <w:sz w:val="28"/>
+                <w:szCs w:val="26"/>
+                <w:shd w:val="clear" w:color="auto" w:fill="181D27"/>
+              </w:rPr>
+              <w:t>models.py</w:t>
+            </w:r>
+          </w:p>
+        </w:tc>
+        <w:tc>
+          <w:tcPr>
+            <w:tcW w:w="5889" w:type="dxa"/>
+            <w:hideMark/>
+          </w:tcPr>
+          <w:p>
+            <w:pPr>
+              <w:spacing w:before="144" w:after="264"/>
+              <w:rPr>
+                <w:rFonts w:ascii="Helvetica" w:eastAsia="Times New Roman" w:hAnsi="Helvetica" w:cs="Helvetica"/>
+                <w:sz w:val="28"/>
+                <w:szCs w:val="26"/>
+                <w:lang w:val="es-AR"/>
+              </w:rPr>
+            </w:pPr>
+            <w:r>
+              <w:rPr>
+                <w:rFonts w:ascii="Helvetica" w:eastAsia="Times New Roman" w:hAnsi="Helvetica" w:cs="Helvetica"/>
+                <w:sz w:val="28"/>
+                <w:szCs w:val="26"/>
+                <w:lang w:val="es-AR"/>
+              </w:rPr>
+              <w:t>Las tablas de esa app escritas como clases. Es el archivo más importante de cada app.</w:t>
+            </w:r>
+          </w:p>
+        </w:tc>
+        <w:tc>
+          <w:tcPr>
+            <w:tcW w:w="3260" w:type="dxa"/>
+            <w:hideMark/>
+          </w:tcPr>
+          <w:p>
+            <w:pPr>
+              <w:spacing w:before="144" w:after="264"/>
+              <w:rPr>
+                <w:rFonts w:ascii="Helvetica" w:eastAsia="Times New Roman" w:hAnsi="Helvetica" w:cs="Helvetica"/>
+                <w:sz w:val="28"/>
+                <w:szCs w:val="26"/>
+              </w:rPr>
+            </w:pPr>
+            <w:proofErr w:type="spellStart"/>
+            <w:r>
+              <w:rPr>
+                <w:rFonts w:ascii="Helvetica" w:eastAsia="Times New Roman" w:hAnsi="Helvetica" w:cs="Helvetica"/>
+                <w:sz w:val="28"/>
+                <w:szCs w:val="26"/>
+              </w:rPr>
+              <w:t>En</w:t>
+            </w:r>
+            <w:proofErr w:type="spellEnd"/>
+            <w:r>
+              <w:rPr>
+                <w:rFonts w:ascii="Helvetica" w:eastAsia="Times New Roman" w:hAnsi="Helvetica" w:cs="Helvetica"/>
+                <w:sz w:val="28"/>
+                <w:szCs w:val="26"/>
+              </w:rPr>
+              <w:t xml:space="preserve"> </w:t>
+            </w:r>
+            <w:proofErr w:type="spellStart"/>
+            <w:r>
+              <w:rPr>
+                <w:rFonts w:ascii="Helvetica" w:eastAsia="Times New Roman" w:hAnsi="Helvetica" w:cs="Helvetica"/>
+                <w:sz w:val="28"/>
+                <w:szCs w:val="26"/>
+              </w:rPr>
+              <w:t>cada</w:t>
+            </w:r>
+            <w:proofErr w:type="spellEnd"/>
+            <w:r>
+              <w:rPr>
+                <w:rFonts w:ascii="Helvetica" w:eastAsia="Times New Roman" w:hAnsi="Helvetica" w:cs="Helvetica"/>
+                <w:sz w:val="28"/>
+                <w:szCs w:val="26"/>
+              </w:rPr>
+              <w:t xml:space="preserve"> app</w:t>
+            </w:r>
+          </w:p>
+        </w:tc>
+      </w:tr>
+      <w:tr>
+        <w:tc>
+          <w:tcPr>
+            <w:tcW w:w="0" w:type="auto"/>
+            <w:hideMark/>
+          </w:tcPr>
+          <w:p>
+            <w:pPr>
+              <w:spacing w:before="144" w:after="264"/>
+              <w:rPr>
+                <w:rFonts w:ascii="Helvetica" w:eastAsia="Times New Roman" w:hAnsi="Helvetica" w:cs="Helvetica"/>
+                <w:sz w:val="28"/>
+                <w:szCs w:val="26"/>
+              </w:rPr>
+            </w:pPr>
+            <w:r>
+              <w:rPr>
+                <w:rFonts w:ascii="Helvetica" w:eastAsia="Times New Roman" w:hAnsi="Helvetica" w:cs="Helvetica"/>
+                <w:sz w:val="28"/>
+                <w:szCs w:val="26"/>
+                <w:shd w:val="clear" w:color="auto" w:fill="181D27"/>
+              </w:rPr>
+              <w:t>admin.py</w:t>
+            </w:r>
+          </w:p>
+        </w:tc>
+        <w:tc>
+          <w:tcPr>
+            <w:tcW w:w="5889" w:type="dxa"/>
+            <w:hideMark/>
+          </w:tcPr>
+          <w:p>
+            <w:pPr>
+              <w:spacing w:before="144" w:after="264"/>
+              <w:rPr>
+                <w:rFonts w:ascii="Helvetica" w:eastAsia="Times New Roman" w:hAnsi="Helvetica" w:cs="Helvetica"/>
+                <w:sz w:val="28"/>
+                <w:szCs w:val="26"/>
+                <w:lang w:val="es-AR"/>
+              </w:rPr>
+            </w:pPr>
+            <w:r>
+              <w:rPr>
+                <w:rFonts w:ascii="Helvetica" w:eastAsia="Times New Roman" w:hAnsi="Helvetica" w:cs="Helvetica"/>
+                <w:sz w:val="28"/>
+                <w:szCs w:val="26"/>
+                <w:lang w:val="es-AR"/>
+              </w:rPr>
+              <w:t>Qué modelos aparecen en el panel de administración y cómo se ven.</w:t>
+            </w:r>
+          </w:p>
+        </w:tc>
+        <w:tc>
+          <w:tcPr>
+            <w:tcW w:w="3260" w:type="dxa"/>
+            <w:hideMark/>
+          </w:tcPr>
+          <w:p>
+            <w:pPr>
+              <w:spacing w:before="144" w:after="264"/>
+              <w:rPr>
+                <w:rFonts w:ascii="Helvetica" w:eastAsia="Times New Roman" w:hAnsi="Helvetica" w:cs="Helvetica"/>
+                <w:sz w:val="28"/>
+                <w:szCs w:val="26"/>
+              </w:rPr>
+            </w:pPr>
+            <w:proofErr w:type="spellStart"/>
+            <w:r>
+              <w:rPr>
+                <w:rFonts w:ascii="Helvetica" w:eastAsia="Times New Roman" w:hAnsi="Helvetica" w:cs="Helvetica"/>
+                <w:sz w:val="28"/>
+                <w:szCs w:val="26"/>
+              </w:rPr>
+              <w:t>En</w:t>
+            </w:r>
+            <w:proofErr w:type="spellEnd"/>
+            <w:r>
+              <w:rPr>
+                <w:rFonts w:ascii="Helvetica" w:eastAsia="Times New Roman" w:hAnsi="Helvetica" w:cs="Helvetica"/>
+                <w:sz w:val="28"/>
+                <w:szCs w:val="26"/>
+              </w:rPr>
+              <w:t xml:space="preserve"> </w:t>
+            </w:r>
+            <w:proofErr w:type="spellStart"/>
+            <w:r>
+              <w:rPr>
+                <w:rFonts w:ascii="Helvetica" w:eastAsia="Times New Roman" w:hAnsi="Helvetica" w:cs="Helvetica"/>
+                <w:sz w:val="28"/>
+                <w:szCs w:val="26"/>
+              </w:rPr>
+              <w:t>casi</w:t>
+            </w:r>
+            <w:proofErr w:type="spellEnd"/>
+            <w:r>
+              <w:rPr>
+                <w:rFonts w:ascii="Helvetica" w:eastAsia="Times New Roman" w:hAnsi="Helvetica" w:cs="Helvetica"/>
+                <w:sz w:val="28"/>
+                <w:szCs w:val="26"/>
+              </w:rPr>
+              <w:t xml:space="preserve"> </w:t>
+            </w:r>
+            <w:proofErr w:type="spellStart"/>
+            <w:r>
+              <w:rPr>
+                <w:rFonts w:ascii="Helvetica" w:eastAsia="Times New Roman" w:hAnsi="Helvetica" w:cs="Helvetica"/>
+                <w:sz w:val="28"/>
+                <w:szCs w:val="26"/>
+              </w:rPr>
+              <w:t>todas</w:t>
+            </w:r>
+            <w:proofErr w:type="spellEnd"/>
+          </w:p>
+        </w:tc>
+      </w:tr>
+      <w:tr>
+        <w:tc>
+          <w:tcPr>
+            <w:tcW w:w="0" w:type="auto"/>
+            <w:hideMark/>
+          </w:tcPr>
+          <w:p>
+            <w:pPr>
+              <w:spacing w:before="144" w:after="264"/>
+              <w:rPr>
+                <w:rFonts w:ascii="Helvetica" w:eastAsia="Times New Roman" w:hAnsi="Helvetica" w:cs="Helvetica"/>
+                <w:sz w:val="28"/>
+                <w:szCs w:val="26"/>
+              </w:rPr>
+            </w:pPr>
+            <w:r>
+              <w:rPr>
+                <w:rFonts w:ascii="Helvetica" w:eastAsia="Times New Roman" w:hAnsi="Helvetica" w:cs="Helvetica"/>
+                <w:sz w:val="28"/>
+                <w:szCs w:val="26"/>
+                <w:shd w:val="clear" w:color="auto" w:fill="181D27"/>
+              </w:rPr>
+              <w:t>apps.py</w:t>
+            </w:r>
+          </w:p>
+        </w:tc>
+        <w:tc>
+          <w:tcPr>
+            <w:tcW w:w="5889" w:type="dxa"/>
+            <w:hideMark/>
+          </w:tcPr>
+          <w:p>
+            <w:pPr>
+              <w:spacing w:before="144" w:after="264"/>
+              <w:rPr>
+                <w:rFonts w:ascii="Helvetica" w:eastAsia="Times New Roman" w:hAnsi="Helvetica" w:cs="Helvetica"/>
+                <w:sz w:val="28"/>
+                <w:szCs w:val="26"/>
+                <w:lang w:val="es-AR"/>
+              </w:rPr>
+            </w:pPr>
+            <w:r>
+              <w:rPr>
+                <w:rFonts w:ascii="Helvetica" w:eastAsia="Times New Roman" w:hAnsi="Helvetica" w:cs="Helvetica"/>
+                <w:sz w:val="28"/>
+                <w:szCs w:val="26"/>
+                <w:lang w:val="es-AR"/>
+              </w:rPr>
+              <w:t>La configuración de la app: su nombre real y cómo se la llama.</w:t>
+            </w:r>
+          </w:p>
+        </w:tc>
+        <w:tc>
+          <w:tcPr>
+            <w:tcW w:w="3260" w:type="dxa"/>
+            <w:hideMark/>
+          </w:tcPr>
+          <w:p>
+            <w:pPr>
+              <w:spacing w:before="144" w:after="264"/>
+              <w:rPr>
+                <w:rFonts w:ascii="Helvetica" w:eastAsia="Times New Roman" w:hAnsi="Helvetica" w:cs="Helvetica"/>
+                <w:sz w:val="28"/>
+                <w:szCs w:val="26"/>
+              </w:rPr>
+            </w:pPr>
+            <w:proofErr w:type="spellStart"/>
+            <w:r>
+              <w:rPr>
+                <w:rFonts w:ascii="Helvetica" w:eastAsia="Times New Roman" w:hAnsi="Helvetica" w:cs="Helvetica"/>
+                <w:sz w:val="28"/>
+                <w:szCs w:val="26"/>
+              </w:rPr>
+              <w:t>Una</w:t>
+            </w:r>
+            <w:proofErr w:type="spellEnd"/>
+            <w:r>
+              <w:rPr>
+                <w:rFonts w:ascii="Helvetica" w:eastAsia="Times New Roman" w:hAnsi="Helvetica" w:cs="Helvetica"/>
+                <w:sz w:val="28"/>
+                <w:szCs w:val="26"/>
+              </w:rPr>
+              <w:t xml:space="preserve"> </w:t>
+            </w:r>
+            <w:proofErr w:type="spellStart"/>
+            <w:r>
+              <w:rPr>
+                <w:rFonts w:ascii="Helvetica" w:eastAsia="Times New Roman" w:hAnsi="Helvetica" w:cs="Helvetica"/>
+                <w:sz w:val="28"/>
+                <w:szCs w:val="26"/>
+              </w:rPr>
+              <w:t>línea</w:t>
+            </w:r>
+            <w:proofErr w:type="spellEnd"/>
+            <w:r>
+              <w:rPr>
+                <w:rFonts w:ascii="Helvetica" w:eastAsia="Times New Roman" w:hAnsi="Helvetica" w:cs="Helvetica"/>
+                <w:sz w:val="28"/>
+                <w:szCs w:val="26"/>
+              </w:rPr>
+              <w:t xml:space="preserve"> </w:t>
+            </w:r>
+            <w:proofErr w:type="spellStart"/>
+            <w:r>
+              <w:rPr>
+                <w:rFonts w:ascii="Helvetica" w:eastAsia="Times New Roman" w:hAnsi="Helvetica" w:cs="Helvetica"/>
+                <w:sz w:val="28"/>
+                <w:szCs w:val="26"/>
+              </w:rPr>
+              <w:t>por</w:t>
+            </w:r>
+            <w:proofErr w:type="spellEnd"/>
+            <w:r>
+              <w:rPr>
+                <w:rFonts w:ascii="Helvetica" w:eastAsia="Times New Roman" w:hAnsi="Helvetica" w:cs="Helvetica"/>
+                <w:sz w:val="28"/>
+                <w:szCs w:val="26"/>
+              </w:rPr>
+              <w:t xml:space="preserve"> app</w:t>
+            </w:r>
+          </w:p>
+        </w:tc>
+      </w:tr>
+      <w:tr>
+        <w:tc>
+          <w:tcPr>
+            <w:tcW w:w="0" w:type="auto"/>
+            <w:hideMark/>
+          </w:tcPr>
+          <w:p>
+            <w:pPr>
+              <w:spacing w:before="144" w:after="264"/>
+              <w:rPr>
+                <w:rFonts w:ascii="Helvetica" w:eastAsia="Times New Roman" w:hAnsi="Helvetica" w:cs="Helvetica"/>
+                <w:sz w:val="28"/>
+                <w:szCs w:val="26"/>
+              </w:rPr>
+            </w:pPr>
+            <w:r>
+              <w:rPr>
+                <w:rFonts w:ascii="Helvetica" w:eastAsia="Times New Roman" w:hAnsi="Helvetica" w:cs="Helvetica"/>
+                <w:sz w:val="28"/>
+                <w:szCs w:val="26"/>
+                <w:shd w:val="clear" w:color="auto" w:fill="181D27"/>
+              </w:rPr>
+              <w:t>migrations/</w:t>
+            </w:r>
+          </w:p>
+        </w:tc>
+        <w:tc>
+          <w:tcPr>
+            <w:tcW w:w="5889" w:type="dxa"/>
+            <w:hideMark/>
+          </w:tcPr>
+          <w:p>
+            <w:pPr>
+              <w:spacing w:before="144" w:after="264"/>
+              <w:rPr>
+                <w:rFonts w:ascii="Helvetica" w:eastAsia="Times New Roman" w:hAnsi="Helvetica" w:cs="Helvetica"/>
+                <w:sz w:val="28"/>
+                <w:szCs w:val="26"/>
+                <w:lang w:val="es-AR"/>
+              </w:rPr>
+            </w:pPr>
+            <w:r>
+              <w:rPr>
+                <w:rFonts w:ascii="Helvetica" w:eastAsia="Times New Roman" w:hAnsi="Helvetica" w:cs="Helvetica"/>
+                <w:sz w:val="28"/>
+                <w:szCs w:val="26"/>
+                <w:lang w:val="es-AR"/>
+              </w:rPr>
+              <w:t>El historial de cambios de la estructura de las tablas, en archivos de Python que genera Django.</w:t>
+            </w:r>
+          </w:p>
+        </w:tc>
+        <w:tc>
+          <w:tcPr>
+            <w:tcW w:w="3260" w:type="dxa"/>
+            <w:hideMark/>
+          </w:tcPr>
+          <w:p>
+            <w:pPr>
+              <w:spacing w:before="144" w:after="264"/>
+              <w:rPr>
+                <w:rFonts w:ascii="Helvetica" w:eastAsia="Times New Roman" w:hAnsi="Helvetica" w:cs="Helvetica"/>
+                <w:sz w:val="28"/>
+                <w:szCs w:val="26"/>
+                <w:lang w:val="es-AR"/>
+              </w:rPr>
+            </w:pPr>
+            <w:r>
+              <w:rPr>
+                <w:rFonts w:ascii="Helvetica" w:eastAsia="Times New Roman" w:hAnsi="Helvetica" w:cs="Helvetica"/>
+                <w:sz w:val="28"/>
+                <w:szCs w:val="26"/>
+                <w:lang w:val="es-AR"/>
+              </w:rPr>
+              <w:t>Se generan, no se escriben</w:t>
+            </w:r>
+          </w:p>
+        </w:tc>
+      </w:tr>
+      <w:tr>
+        <w:tc>
+          <w:tcPr>
+            <w:tcW w:w="0" w:type="auto"/>
+            <w:hideMark/>
+          </w:tcPr>
+          <w:p>
+            <w:pPr>
+              <w:spacing w:before="144" w:after="264"/>
+              <w:rPr>
+                <w:rFonts w:ascii="Helvetica" w:eastAsia="Times New Roman" w:hAnsi="Helvetica" w:cs="Helvetica"/>
+                <w:sz w:val="28"/>
+                <w:szCs w:val="26"/>
+              </w:rPr>
+            </w:pPr>
+            <w:r>
+              <w:rPr>
+                <w:rFonts w:ascii="Helvetica" w:eastAsia="Times New Roman" w:hAnsi="Helvetica" w:cs="Helvetica"/>
+                <w:sz w:val="28"/>
+                <w:szCs w:val="26"/>
+                <w:shd w:val="clear" w:color="auto" w:fill="181D27"/>
+              </w:rPr>
+              <w:t>tests.py</w:t>
+            </w:r>
+          </w:p>
+        </w:tc>
+        <w:tc>
+          <w:tcPr>
+            <w:tcW w:w="5889" w:type="dxa"/>
+            <w:hideMark/>
+          </w:tcPr>
+          <w:p>
+            <w:pPr>
+              <w:spacing w:before="144" w:after="264"/>
+              <w:rPr>
+                <w:rFonts w:ascii="Helvetica" w:eastAsia="Times New Roman" w:hAnsi="Helvetica" w:cs="Helvetica"/>
+                <w:sz w:val="28"/>
+                <w:szCs w:val="26"/>
+                <w:lang w:val="es-AR"/>
+              </w:rPr>
+            </w:pPr>
+            <w:r>
+              <w:rPr>
+                <w:rFonts w:ascii="Helvetica" w:eastAsia="Times New Roman" w:hAnsi="Helvetica" w:cs="Helvetica"/>
+                <w:sz w:val="28"/>
+                <w:szCs w:val="26"/>
+                <w:lang w:val="es-AR"/>
+              </w:rPr>
+              <w:t>Las pruebas automáticas de la app.</w:t>
+            </w:r>
+          </w:p>
+        </w:tc>
+        <w:tc>
+          <w:tcPr>
+            <w:tcW w:w="3260" w:type="dxa"/>
+            <w:hideMark/>
+          </w:tcPr>
+          <w:p>
+            <w:pPr>
+              <w:spacing w:before="144" w:after="264"/>
+              <w:rPr>
+                <w:rFonts w:ascii="Helvetica" w:eastAsia="Times New Roman" w:hAnsi="Helvetica" w:cs="Helvetica"/>
+                <w:sz w:val="28"/>
+                <w:szCs w:val="26"/>
+              </w:rPr>
+            </w:pPr>
+            <w:r>
+              <w:rPr>
+                <w:rFonts w:ascii="Helvetica" w:eastAsia="Times New Roman" w:hAnsi="Helvetica" w:cs="Helvetica"/>
+                <w:sz w:val="28"/>
+                <w:szCs w:val="26"/>
+              </w:rPr>
+              <w:t xml:space="preserve">Al final, </w:t>
+            </w:r>
+            <w:proofErr w:type="spellStart"/>
+            <w:r>
+              <w:rPr>
+                <w:rFonts w:ascii="Helvetica" w:eastAsia="Times New Roman" w:hAnsi="Helvetica" w:cs="Helvetica"/>
+                <w:sz w:val="28"/>
+                <w:szCs w:val="26"/>
+              </w:rPr>
+              <w:t>todas</w:t>
+            </w:r>
+            <w:proofErr w:type="spellEnd"/>
+            <w:r>
+              <w:rPr>
+                <w:rFonts w:ascii="Helvetica" w:eastAsia="Times New Roman" w:hAnsi="Helvetica" w:cs="Helvetica"/>
+                <w:sz w:val="28"/>
+                <w:szCs w:val="26"/>
+              </w:rPr>
+              <w:t xml:space="preserve"> juntas</w:t>
+            </w:r>
+          </w:p>
+        </w:tc>
+      </w:tr>
+    </w:tbl>
+    <w:p>
+      <w:pPr>
+        <w:rPr>
+          <w:lang w:val="es-AR"/>
+        </w:rPr>
+      </w:pPr>
+    </w:p>
+    <w:p>
+      <w:pPr>
+        <w:rPr>
+          <w:lang w:val="es-AR"/>
+        </w:rPr>
+      </w:pPr>
+    </w:p>
+    <w:p>
+      <w:pPr>
+        <w:rPr>
+          <w:lang w:val="es-AR"/>
+        </w:rPr>
+      </w:pPr>
+    </w:p>
+    <w:p>
+      <w:pPr>
+        <w:rPr>
+          <w:lang w:val="es-AR"/>
+        </w:rPr>
+      </w:pPr>
+    </w:p>
+    <w:p>
+      <w:pPr>
+        <w:rPr>
+          <w:lang w:val="es-AR"/>
+        </w:rPr>
+      </w:pPr>
+    </w:p>
+    <w:p>
+      <w:pPr>
+        <w:rPr>
+          <w:lang w:val="es-AR"/>
+        </w:rPr>
+      </w:pPr>
+    </w:p>
+    <w:p>
+      <w:pPr>
+        <w:rPr>
+          <w:lang w:val="es-AR"/>
+        </w:rPr>
+      </w:pPr>
+    </w:p>
+    <w:p>
+      <w:pPr>
+        <w:rPr>
+          <w:lang w:val="es-AR"/>
+        </w:rPr>
+      </w:pPr>
+    </w:p>
+    <w:p>
+      <w:pPr>
+        <w:rPr>
+          <w:lang w:val="es-AR"/>
+        </w:rPr>
+      </w:pPr>
+    </w:p>
+    <w:p>
+      <w:pPr>
+        <w:rPr>
+          <w:lang w:val="es-AR"/>
+        </w:rPr>
+      </w:pPr>
+    </w:p>
+    <w:p>
+      <w:pPr>
+        <w:rPr>
+          <w:lang w:val="es-AR"/>
+        </w:rPr>
+      </w:pPr>
+    </w:p>
+    <w:p>
+      <w:pPr>
+        <w:rPr>
+          <w:lang w:val="es-AR"/>
+        </w:rPr>
+      </w:pPr>
+      <w:r>
+        <w:rPr>
+          <w:lang w:val="es-AR"/>
+        </w:rPr>
+        <w:lastRenderedPageBreak/>
+        <w:t xml:space="preserve">Teoría 9 - </w:t>
+      </w:r>
+      <w:r>
+        <w:rPr>
+          <w:lang w:val="es-AR"/>
+        </w:rPr>
+        <w:t>Arquitectura en capas: qué archivo hace qué</w:t>
+      </w:r>
+    </w:p>
+    <w:p>
+      <w:pPr>
+        <w:rPr>
+          <w:lang w:val="es-AR"/>
+        </w:rPr>
+      </w:pPr>
+      <w:proofErr w:type="spellStart"/>
+      <w:r>
+        <w:rPr>
+          <w:lang w:val="es-AR"/>
+        </w:rPr>
+        <w:t>Models</w:t>
+      </w:r>
+      <w:proofErr w:type="spellEnd"/>
+      <w:r>
+        <w:rPr>
+          <w:lang w:val="es-AR"/>
+        </w:rPr>
+        <w:t xml:space="preserve">, managers, </w:t>
+      </w:r>
+      <w:proofErr w:type="spellStart"/>
+      <w:r>
+        <w:rPr>
+          <w:lang w:val="es-AR"/>
+        </w:rPr>
+        <w:t>selectors</w:t>
+      </w:r>
+      <w:proofErr w:type="spellEnd"/>
+      <w:r>
+        <w:rPr>
+          <w:lang w:val="es-AR"/>
+        </w:rPr>
+        <w:t xml:space="preserve"> y </w:t>
+      </w:r>
+      <w:proofErr w:type="spellStart"/>
+      <w:r>
+        <w:rPr>
+          <w:lang w:val="es-AR"/>
+        </w:rPr>
+        <w:t>services</w:t>
+      </w:r>
+      <w:proofErr w:type="spellEnd"/>
+      <w:r>
+        <w:rPr>
+          <w:lang w:val="es-AR"/>
+        </w:rPr>
+        <w:t xml:space="preserve">, </w:t>
+      </w:r>
+      <w:r>
+        <w:rPr>
+          <w:lang w:val="es-AR"/>
+        </w:rPr>
+        <w:t>y por qué la API no toca el ORM</w:t>
+      </w:r>
+      <w:bookmarkStart w:id="0" w:name="_GoBack"/>
+      <w:bookmarkEnd w:id="0"/>
+    </w:p>
+    <w:tbl>
+      <w:tblPr>
+        <w:tblStyle w:val="Tablaconcuadrcula"/>
+        <w:tblW w:w="0" w:type="auto"/>
+        <w:tblLook w:val="04A0" w:firstRow="1" w:lastRow="0" w:firstColumn="1" w:lastColumn="0" w:noHBand="0" w:noVBand="1"/>
+      </w:tblPr>
+      <w:tblGrid>
+        <w:gridCol w:w="1812"/>
+        <w:gridCol w:w="6405"/>
+        <w:gridCol w:w="3260"/>
+      </w:tblGrid>
+      <w:tr>
+        <w:tc>
+          <w:tcPr>
+            <w:tcW w:w="1812" w:type="dxa"/>
+            <w:hideMark/>
+          </w:tcPr>
+          <w:p>
+            <w:pPr>
+              <w:spacing w:before="144" w:after="264"/>
+              <w:rPr>
+                <w:rFonts w:ascii="Helvetica" w:eastAsia="Times New Roman" w:hAnsi="Helvetica" w:cs="Helvetica"/>
+                <w:b/>
+                <w:bCs/>
+                <w:sz w:val="26"/>
+                <w:szCs w:val="26"/>
+              </w:rPr>
+            </w:pPr>
+            <w:proofErr w:type="spellStart"/>
+            <w:r>
+              <w:rPr>
+                <w:rFonts w:ascii="Helvetica" w:eastAsia="Times New Roman" w:hAnsi="Helvetica" w:cs="Helvetica"/>
+                <w:b/>
+                <w:bCs/>
+                <w:sz w:val="26"/>
+                <w:szCs w:val="26"/>
+              </w:rPr>
+              <w:t>Archivo</w:t>
+            </w:r>
+            <w:proofErr w:type="spellEnd"/>
+          </w:p>
+        </w:tc>
+        <w:tc>
+          <w:tcPr>
+            <w:tcW w:w="6405" w:type="dxa"/>
+            <w:hideMark/>
+          </w:tcPr>
+          <w:p>
+            <w:pPr>
+              <w:spacing w:before="144" w:after="264"/>
+              <w:rPr>
+                <w:rFonts w:ascii="Helvetica" w:eastAsia="Times New Roman" w:hAnsi="Helvetica" w:cs="Helvetica"/>
+                <w:b/>
+                <w:bCs/>
+                <w:sz w:val="26"/>
+                <w:szCs w:val="26"/>
+              </w:rPr>
+            </w:pPr>
+            <w:proofErr w:type="spellStart"/>
+            <w:r>
+              <w:rPr>
+                <w:rFonts w:ascii="Helvetica" w:eastAsia="Times New Roman" w:hAnsi="Helvetica" w:cs="Helvetica"/>
+                <w:b/>
+                <w:bCs/>
+                <w:sz w:val="26"/>
+                <w:szCs w:val="26"/>
+              </w:rPr>
+              <w:t>Qué</w:t>
+            </w:r>
+            <w:proofErr w:type="spellEnd"/>
+            <w:r>
+              <w:rPr>
+                <w:rFonts w:ascii="Helvetica" w:eastAsia="Times New Roman" w:hAnsi="Helvetica" w:cs="Helvetica"/>
+                <w:b/>
+                <w:bCs/>
+                <w:sz w:val="26"/>
+                <w:szCs w:val="26"/>
+              </w:rPr>
+              <w:t xml:space="preserve"> </w:t>
+            </w:r>
+            <w:proofErr w:type="spellStart"/>
+            <w:r>
+              <w:rPr>
+                <w:rFonts w:ascii="Helvetica" w:eastAsia="Times New Roman" w:hAnsi="Helvetica" w:cs="Helvetica"/>
+                <w:b/>
+                <w:bCs/>
+                <w:sz w:val="26"/>
+                <w:szCs w:val="26"/>
+              </w:rPr>
+              <w:t>va</w:t>
+            </w:r>
+            <w:proofErr w:type="spellEnd"/>
+            <w:r>
+              <w:rPr>
+                <w:rFonts w:ascii="Helvetica" w:eastAsia="Times New Roman" w:hAnsi="Helvetica" w:cs="Helvetica"/>
+                <w:b/>
+                <w:bCs/>
+                <w:sz w:val="26"/>
+                <w:szCs w:val="26"/>
+              </w:rPr>
+              <w:t xml:space="preserve"> </w:t>
+            </w:r>
+            <w:proofErr w:type="spellStart"/>
+            <w:r>
+              <w:rPr>
+                <w:rFonts w:ascii="Helvetica" w:eastAsia="Times New Roman" w:hAnsi="Helvetica" w:cs="Helvetica"/>
+                <w:b/>
+                <w:bCs/>
+                <w:sz w:val="26"/>
+                <w:szCs w:val="26"/>
+              </w:rPr>
+              <w:t>adentro</w:t>
+            </w:r>
+            <w:proofErr w:type="spellEnd"/>
+          </w:p>
+        </w:tc>
+        <w:tc>
+          <w:tcPr>
+            <w:tcW w:w="3260" w:type="dxa"/>
+            <w:hideMark/>
+          </w:tcPr>
+          <w:p>
+            <w:pPr>
+              <w:spacing w:before="144" w:after="264"/>
+              <w:rPr>
+                <w:rFonts w:ascii="Helvetica" w:eastAsia="Times New Roman" w:hAnsi="Helvetica" w:cs="Helvetica"/>
+                <w:b/>
+                <w:bCs/>
+                <w:sz w:val="26"/>
+                <w:szCs w:val="26"/>
+              </w:rPr>
+            </w:pPr>
+            <w:proofErr w:type="spellStart"/>
+            <w:r>
+              <w:rPr>
+                <w:rFonts w:ascii="Helvetica" w:eastAsia="Times New Roman" w:hAnsi="Helvetica" w:cs="Helvetica"/>
+                <w:b/>
+                <w:bCs/>
+                <w:sz w:val="26"/>
+                <w:szCs w:val="26"/>
+              </w:rPr>
+              <w:t>Cómo</w:t>
+            </w:r>
+            <w:proofErr w:type="spellEnd"/>
+            <w:r>
+              <w:rPr>
+                <w:rFonts w:ascii="Helvetica" w:eastAsia="Times New Roman" w:hAnsi="Helvetica" w:cs="Helvetica"/>
+                <w:b/>
+                <w:bCs/>
+                <w:sz w:val="26"/>
+                <w:szCs w:val="26"/>
+              </w:rPr>
+              <w:t xml:space="preserve"> </w:t>
+            </w:r>
+            <w:proofErr w:type="spellStart"/>
+            <w:r>
+              <w:rPr>
+                <w:rFonts w:ascii="Helvetica" w:eastAsia="Times New Roman" w:hAnsi="Helvetica" w:cs="Helvetica"/>
+                <w:b/>
+                <w:bCs/>
+                <w:sz w:val="26"/>
+                <w:szCs w:val="26"/>
+              </w:rPr>
+              <w:t>reconocerlo</w:t>
+            </w:r>
+            <w:proofErr w:type="spellEnd"/>
+          </w:p>
+        </w:tc>
+      </w:tr>
+      <w:tr>
+        <w:tc>
+          <w:tcPr>
+            <w:tcW w:w="1812" w:type="dxa"/>
+            <w:hideMark/>
+          </w:tcPr>
+          <w:p>
+            <w:pPr>
+              <w:spacing w:before="144" w:after="264"/>
+              <w:rPr>
+                <w:rFonts w:ascii="Helvetica" w:eastAsia="Times New Roman" w:hAnsi="Helvetica" w:cs="Helvetica"/>
+                <w:sz w:val="26"/>
+                <w:szCs w:val="26"/>
+              </w:rPr>
+            </w:pPr>
+            <w:r>
+              <w:rPr>
+                <w:rFonts w:ascii="Helvetica" w:eastAsia="Times New Roman" w:hAnsi="Helvetica" w:cs="Helvetica"/>
+                <w:sz w:val="26"/>
+                <w:szCs w:val="26"/>
+                <w:shd w:val="clear" w:color="auto" w:fill="181D27"/>
+              </w:rPr>
+              <w:t>models.py</w:t>
+            </w:r>
+          </w:p>
+        </w:tc>
+        <w:tc>
+          <w:tcPr>
+            <w:tcW w:w="6405" w:type="dxa"/>
+            <w:hideMark/>
+          </w:tcPr>
+          <w:p>
+            <w:pPr>
+              <w:spacing w:before="144" w:after="264"/>
+              <w:rPr>
+                <w:rFonts w:ascii="Helvetica" w:eastAsia="Times New Roman" w:hAnsi="Helvetica" w:cs="Helvetica"/>
+                <w:sz w:val="26"/>
+                <w:szCs w:val="26"/>
+                <w:lang w:val="es-AR"/>
+              </w:rPr>
+            </w:pPr>
+            <w:r>
+              <w:rPr>
+                <w:rFonts w:ascii="Helvetica" w:eastAsia="Times New Roman" w:hAnsi="Helvetica" w:cs="Helvetica"/>
+                <w:sz w:val="26"/>
+                <w:szCs w:val="26"/>
+                <w:lang w:val="es-AR"/>
+              </w:rPr>
+              <w:t xml:space="preserve">La estructura y el comportamiento propio de cada modelo: campos, relaciones, </w:t>
+            </w:r>
+            <w:proofErr w:type="spellStart"/>
+            <w:r>
+              <w:rPr>
+                <w:rFonts w:ascii="Helvetica" w:eastAsia="Times New Roman" w:hAnsi="Helvetica" w:cs="Helvetica"/>
+                <w:sz w:val="26"/>
+                <w:szCs w:val="26"/>
+                <w:shd w:val="clear" w:color="auto" w:fill="181D27"/>
+                <w:lang w:val="es-AR"/>
+              </w:rPr>
+              <w:t>clean</w:t>
+            </w:r>
+            <w:proofErr w:type="spellEnd"/>
+            <w:r>
+              <w:rPr>
+                <w:rFonts w:ascii="Helvetica" w:eastAsia="Times New Roman" w:hAnsi="Helvetica" w:cs="Helvetica"/>
+                <w:sz w:val="26"/>
+                <w:szCs w:val="26"/>
+                <w:shd w:val="clear" w:color="auto" w:fill="181D27"/>
+                <w:lang w:val="es-AR"/>
+              </w:rPr>
+              <w:t>()</w:t>
+            </w:r>
+            <w:r>
+              <w:rPr>
+                <w:rFonts w:ascii="Helvetica" w:eastAsia="Times New Roman" w:hAnsi="Helvetica" w:cs="Helvetica"/>
+                <w:sz w:val="26"/>
+                <w:szCs w:val="26"/>
+                <w:lang w:val="es-AR"/>
+              </w:rPr>
+              <w:t xml:space="preserve">, </w:t>
+            </w:r>
+            <w:proofErr w:type="spellStart"/>
+            <w:r>
+              <w:rPr>
+                <w:rFonts w:ascii="Helvetica" w:eastAsia="Times New Roman" w:hAnsi="Helvetica" w:cs="Helvetica"/>
+                <w:sz w:val="26"/>
+                <w:szCs w:val="26"/>
+                <w:shd w:val="clear" w:color="auto" w:fill="181D27"/>
+                <w:lang w:val="es-AR"/>
+              </w:rPr>
+              <w:t>save</w:t>
+            </w:r>
+            <w:proofErr w:type="spellEnd"/>
+            <w:r>
+              <w:rPr>
+                <w:rFonts w:ascii="Helvetica" w:eastAsia="Times New Roman" w:hAnsi="Helvetica" w:cs="Helvetica"/>
+                <w:sz w:val="26"/>
+                <w:szCs w:val="26"/>
+                <w:shd w:val="clear" w:color="auto" w:fill="181D27"/>
+                <w:lang w:val="es-AR"/>
+              </w:rPr>
+              <w:t>()</w:t>
+            </w:r>
+            <w:r>
+              <w:rPr>
+                <w:rFonts w:ascii="Helvetica" w:eastAsia="Times New Roman" w:hAnsi="Helvetica" w:cs="Helvetica"/>
+                <w:sz w:val="26"/>
+                <w:szCs w:val="26"/>
+                <w:lang w:val="es-AR"/>
+              </w:rPr>
+              <w:t>, propiedades calculadas.</w:t>
+            </w:r>
+          </w:p>
+        </w:tc>
+        <w:tc>
+          <w:tcPr>
+            <w:tcW w:w="3260" w:type="dxa"/>
+            <w:hideMark/>
+          </w:tcPr>
+          <w:p>
+            <w:pPr>
+              <w:spacing w:before="144" w:after="264"/>
+              <w:rPr>
+                <w:rFonts w:ascii="Helvetica" w:eastAsia="Times New Roman" w:hAnsi="Helvetica" w:cs="Helvetica"/>
+                <w:sz w:val="26"/>
+                <w:szCs w:val="26"/>
+                <w:lang w:val="es-AR"/>
+              </w:rPr>
+            </w:pPr>
+            <w:r>
+              <w:rPr>
+                <w:rFonts w:ascii="Helvetica" w:eastAsia="Times New Roman" w:hAnsi="Helvetica" w:cs="Helvetica"/>
+                <w:sz w:val="26"/>
+                <w:szCs w:val="26"/>
+                <w:lang w:val="es-AR"/>
+              </w:rPr>
+              <w:t>Habla de una sola fila</w:t>
+            </w:r>
+          </w:p>
+        </w:tc>
+      </w:tr>
+      <w:tr>
+        <w:tc>
+          <w:tcPr>
+            <w:tcW w:w="1812" w:type="dxa"/>
+            <w:hideMark/>
+          </w:tcPr>
+          <w:p>
+            <w:pPr>
+              <w:spacing w:before="144" w:after="264"/>
+              <w:rPr>
+                <w:rFonts w:ascii="Helvetica" w:eastAsia="Times New Roman" w:hAnsi="Helvetica" w:cs="Helvetica"/>
+                <w:sz w:val="26"/>
+                <w:szCs w:val="26"/>
+              </w:rPr>
+            </w:pPr>
+            <w:r>
+              <w:rPr>
+                <w:rFonts w:ascii="Helvetica" w:eastAsia="Times New Roman" w:hAnsi="Helvetica" w:cs="Helvetica"/>
+                <w:sz w:val="26"/>
+                <w:szCs w:val="26"/>
+                <w:shd w:val="clear" w:color="auto" w:fill="181D27"/>
+              </w:rPr>
+              <w:t>managers.py</w:t>
+            </w:r>
+          </w:p>
+        </w:tc>
+        <w:tc>
+          <w:tcPr>
+            <w:tcW w:w="6405" w:type="dxa"/>
+            <w:hideMark/>
+          </w:tcPr>
+          <w:p>
+            <w:pPr>
+              <w:spacing w:before="144" w:after="264"/>
+              <w:rPr>
+                <w:rFonts w:ascii="Helvetica" w:eastAsia="Times New Roman" w:hAnsi="Helvetica" w:cs="Helvetica"/>
+                <w:sz w:val="26"/>
+                <w:szCs w:val="26"/>
+                <w:lang w:val="es-AR"/>
+              </w:rPr>
+            </w:pPr>
+            <w:r>
+              <w:rPr>
+                <w:rFonts w:ascii="Helvetica" w:eastAsia="Times New Roman" w:hAnsi="Helvetica" w:cs="Helvetica"/>
+                <w:sz w:val="26"/>
+                <w:szCs w:val="26"/>
+                <w:lang w:val="es-AR"/>
+              </w:rPr>
+              <w:t xml:space="preserve">Filtros reutilizables y </w:t>
+            </w:r>
+            <w:proofErr w:type="spellStart"/>
+            <w:r>
+              <w:rPr>
+                <w:rFonts w:ascii="Helvetica" w:eastAsia="Times New Roman" w:hAnsi="Helvetica" w:cs="Helvetica"/>
+                <w:sz w:val="26"/>
+                <w:szCs w:val="26"/>
+                <w:lang w:val="es-AR"/>
+              </w:rPr>
+              <w:t>encadenables</w:t>
+            </w:r>
+            <w:proofErr w:type="spellEnd"/>
+            <w:r>
+              <w:rPr>
+                <w:rFonts w:ascii="Helvetica" w:eastAsia="Times New Roman" w:hAnsi="Helvetica" w:cs="Helvetica"/>
+                <w:sz w:val="26"/>
+                <w:szCs w:val="26"/>
+                <w:lang w:val="es-AR"/>
+              </w:rPr>
+              <w:t xml:space="preserve"> sobre un modelo: </w:t>
+            </w:r>
+            <w:proofErr w:type="spellStart"/>
+            <w:r>
+              <w:rPr>
+                <w:rFonts w:ascii="Helvetica" w:eastAsia="Times New Roman" w:hAnsi="Helvetica" w:cs="Helvetica"/>
+                <w:sz w:val="26"/>
+                <w:szCs w:val="26"/>
+                <w:shd w:val="clear" w:color="auto" w:fill="181D27"/>
+                <w:lang w:val="es-AR"/>
+              </w:rPr>
+              <w:t>approved</w:t>
+            </w:r>
+            <w:proofErr w:type="spellEnd"/>
+            <w:r>
+              <w:rPr>
+                <w:rFonts w:ascii="Helvetica" w:eastAsia="Times New Roman" w:hAnsi="Helvetica" w:cs="Helvetica"/>
+                <w:sz w:val="26"/>
+                <w:szCs w:val="26"/>
+                <w:shd w:val="clear" w:color="auto" w:fill="181D27"/>
+                <w:lang w:val="es-AR"/>
+              </w:rPr>
+              <w:t>()</w:t>
+            </w:r>
+            <w:r>
+              <w:rPr>
+                <w:rFonts w:ascii="Helvetica" w:eastAsia="Times New Roman" w:hAnsi="Helvetica" w:cs="Helvetica"/>
+                <w:sz w:val="26"/>
+                <w:szCs w:val="26"/>
+                <w:lang w:val="es-AR"/>
+              </w:rPr>
+              <w:t xml:space="preserve">, </w:t>
+            </w:r>
+            <w:proofErr w:type="spellStart"/>
+            <w:r>
+              <w:rPr>
+                <w:rFonts w:ascii="Helvetica" w:eastAsia="Times New Roman" w:hAnsi="Helvetica" w:cs="Helvetica"/>
+                <w:sz w:val="26"/>
+                <w:szCs w:val="26"/>
+                <w:shd w:val="clear" w:color="auto" w:fill="181D27"/>
+                <w:lang w:val="es-AR"/>
+              </w:rPr>
+              <w:t>accepted</w:t>
+            </w:r>
+            <w:proofErr w:type="spellEnd"/>
+            <w:r>
+              <w:rPr>
+                <w:rFonts w:ascii="Helvetica" w:eastAsia="Times New Roman" w:hAnsi="Helvetica" w:cs="Helvetica"/>
+                <w:sz w:val="26"/>
+                <w:szCs w:val="26"/>
+                <w:shd w:val="clear" w:color="auto" w:fill="181D27"/>
+                <w:lang w:val="es-AR"/>
+              </w:rPr>
+              <w:t>()</w:t>
+            </w:r>
+            <w:r>
+              <w:rPr>
+                <w:rFonts w:ascii="Helvetica" w:eastAsia="Times New Roman" w:hAnsi="Helvetica" w:cs="Helvetica"/>
+                <w:sz w:val="26"/>
+                <w:szCs w:val="26"/>
+                <w:lang w:val="es-AR"/>
+              </w:rPr>
+              <w:t xml:space="preserve">, </w:t>
+            </w:r>
+            <w:r>
+              <w:rPr>
+                <w:rFonts w:ascii="Helvetica" w:eastAsia="Times New Roman" w:hAnsi="Helvetica" w:cs="Helvetica"/>
+                <w:sz w:val="26"/>
+                <w:szCs w:val="26"/>
+                <w:shd w:val="clear" w:color="auto" w:fill="181D27"/>
+                <w:lang w:val="es-AR"/>
+              </w:rPr>
+              <w:t>active()</w:t>
+            </w:r>
+            <w:r>
+              <w:rPr>
+                <w:rFonts w:ascii="Helvetica" w:eastAsia="Times New Roman" w:hAnsi="Helvetica" w:cs="Helvetica"/>
+                <w:sz w:val="26"/>
+                <w:szCs w:val="26"/>
+                <w:lang w:val="es-AR"/>
+              </w:rPr>
+              <w:t>.</w:t>
+            </w:r>
+          </w:p>
+        </w:tc>
+        <w:tc>
+          <w:tcPr>
+            <w:tcW w:w="3260" w:type="dxa"/>
+            <w:hideMark/>
+          </w:tcPr>
+          <w:p>
+            <w:pPr>
+              <w:spacing w:before="144" w:after="264"/>
+              <w:rPr>
+                <w:rFonts w:ascii="Helvetica" w:eastAsia="Times New Roman" w:hAnsi="Helvetica" w:cs="Helvetica"/>
+                <w:sz w:val="26"/>
+                <w:szCs w:val="26"/>
+              </w:rPr>
+            </w:pPr>
+            <w:proofErr w:type="spellStart"/>
+            <w:r>
+              <w:rPr>
+                <w:rFonts w:ascii="Helvetica" w:eastAsia="Times New Roman" w:hAnsi="Helvetica" w:cs="Helvetica"/>
+                <w:sz w:val="26"/>
+                <w:szCs w:val="26"/>
+              </w:rPr>
+              <w:t>Devuelve</w:t>
+            </w:r>
+            <w:proofErr w:type="spellEnd"/>
+            <w:r>
+              <w:rPr>
+                <w:rFonts w:ascii="Helvetica" w:eastAsia="Times New Roman" w:hAnsi="Helvetica" w:cs="Helvetica"/>
+                <w:sz w:val="26"/>
+                <w:szCs w:val="26"/>
+              </w:rPr>
+              <w:t xml:space="preserve"> </w:t>
+            </w:r>
+            <w:proofErr w:type="spellStart"/>
+            <w:r>
+              <w:rPr>
+                <w:rFonts w:ascii="Helvetica" w:eastAsia="Times New Roman" w:hAnsi="Helvetica" w:cs="Helvetica"/>
+                <w:sz w:val="26"/>
+                <w:szCs w:val="26"/>
+              </w:rPr>
+              <w:t>siempre</w:t>
+            </w:r>
+            <w:proofErr w:type="spellEnd"/>
+            <w:r>
+              <w:rPr>
+                <w:rFonts w:ascii="Helvetica" w:eastAsia="Times New Roman" w:hAnsi="Helvetica" w:cs="Helvetica"/>
+                <w:sz w:val="26"/>
+                <w:szCs w:val="26"/>
+              </w:rPr>
+              <w:t xml:space="preserve"> un </w:t>
+            </w:r>
+            <w:proofErr w:type="spellStart"/>
+            <w:r>
+              <w:rPr>
+                <w:rFonts w:ascii="Helvetica" w:eastAsia="Times New Roman" w:hAnsi="Helvetica" w:cs="Helvetica"/>
+                <w:sz w:val="26"/>
+                <w:szCs w:val="26"/>
+              </w:rPr>
+              <w:t>QuerySet</w:t>
+            </w:r>
+            <w:proofErr w:type="spellEnd"/>
+          </w:p>
+        </w:tc>
+      </w:tr>
+      <w:tr>
+        <w:tc>
+          <w:tcPr>
+            <w:tcW w:w="1812" w:type="dxa"/>
+            <w:hideMark/>
+          </w:tcPr>
+          <w:p>
+            <w:pPr>
+              <w:spacing w:before="144" w:after="264"/>
+              <w:rPr>
+                <w:rFonts w:ascii="Helvetica" w:eastAsia="Times New Roman" w:hAnsi="Helvetica" w:cs="Helvetica"/>
+                <w:sz w:val="26"/>
+                <w:szCs w:val="26"/>
+              </w:rPr>
+            </w:pPr>
+            <w:r>
+              <w:rPr>
+                <w:rFonts w:ascii="Helvetica" w:eastAsia="Times New Roman" w:hAnsi="Helvetica" w:cs="Helvetica"/>
+                <w:sz w:val="26"/>
+                <w:szCs w:val="26"/>
+                <w:shd w:val="clear" w:color="auto" w:fill="181D27"/>
+              </w:rPr>
+              <w:t>selectors.py</w:t>
+            </w:r>
+          </w:p>
+        </w:tc>
+        <w:tc>
+          <w:tcPr>
+            <w:tcW w:w="6405" w:type="dxa"/>
+            <w:hideMark/>
+          </w:tcPr>
+          <w:p>
+            <w:pPr>
+              <w:spacing w:before="144" w:after="264"/>
+              <w:rPr>
+                <w:rFonts w:ascii="Helvetica" w:eastAsia="Times New Roman" w:hAnsi="Helvetica" w:cs="Helvetica"/>
+                <w:sz w:val="26"/>
+                <w:szCs w:val="26"/>
+                <w:lang w:val="es-AR"/>
+              </w:rPr>
+            </w:pPr>
+            <w:r>
+              <w:rPr>
+                <w:rFonts w:ascii="Helvetica" w:eastAsia="Times New Roman" w:hAnsi="Helvetica" w:cs="Helvetica"/>
+                <w:sz w:val="26"/>
+                <w:szCs w:val="26"/>
+                <w:lang w:val="es-AR"/>
+              </w:rPr>
+              <w:t xml:space="preserve">Consultas de lectura más complejas, que combinan esos filtros y resuelven un caso de uso: </w:t>
+            </w:r>
+            <w:proofErr w:type="spellStart"/>
+            <w:r>
+              <w:rPr>
+                <w:rFonts w:ascii="Helvetica" w:eastAsia="Times New Roman" w:hAnsi="Helvetica" w:cs="Helvetica"/>
+                <w:sz w:val="26"/>
+                <w:szCs w:val="26"/>
+                <w:shd w:val="clear" w:color="auto" w:fill="181D27"/>
+                <w:lang w:val="es-AR"/>
+              </w:rPr>
+              <w:t>public_catalog</w:t>
+            </w:r>
+            <w:proofErr w:type="spellEnd"/>
+            <w:r>
+              <w:rPr>
+                <w:rFonts w:ascii="Helvetica" w:eastAsia="Times New Roman" w:hAnsi="Helvetica" w:cs="Helvetica"/>
+                <w:sz w:val="26"/>
+                <w:szCs w:val="26"/>
+                <w:shd w:val="clear" w:color="auto" w:fill="181D27"/>
+                <w:lang w:val="es-AR"/>
+              </w:rPr>
+              <w:t>(filtros)</w:t>
+            </w:r>
+            <w:r>
+              <w:rPr>
+                <w:rFonts w:ascii="Helvetica" w:eastAsia="Times New Roman" w:hAnsi="Helvetica" w:cs="Helvetica"/>
+                <w:sz w:val="26"/>
+                <w:szCs w:val="26"/>
+                <w:lang w:val="es-AR"/>
+              </w:rPr>
+              <w:t>.</w:t>
+            </w:r>
+          </w:p>
+        </w:tc>
+        <w:tc>
+          <w:tcPr>
+            <w:tcW w:w="3260" w:type="dxa"/>
+            <w:hideMark/>
+          </w:tcPr>
+          <w:p>
+            <w:pPr>
+              <w:spacing w:before="144" w:after="264"/>
+              <w:rPr>
+                <w:rFonts w:ascii="Helvetica" w:eastAsia="Times New Roman" w:hAnsi="Helvetica" w:cs="Helvetica"/>
+                <w:sz w:val="26"/>
+                <w:szCs w:val="26"/>
+              </w:rPr>
+            </w:pPr>
+            <w:r>
+              <w:rPr>
+                <w:rFonts w:ascii="Helvetica" w:eastAsia="Times New Roman" w:hAnsi="Helvetica" w:cs="Helvetica"/>
+                <w:sz w:val="26"/>
+                <w:szCs w:val="26"/>
+              </w:rPr>
+              <w:t xml:space="preserve">Lee, </w:t>
+            </w:r>
+            <w:proofErr w:type="spellStart"/>
+            <w:r>
+              <w:rPr>
+                <w:rFonts w:ascii="Helvetica" w:eastAsia="Times New Roman" w:hAnsi="Helvetica" w:cs="Helvetica"/>
+                <w:sz w:val="26"/>
+                <w:szCs w:val="26"/>
+              </w:rPr>
+              <w:t>nunca</w:t>
+            </w:r>
+            <w:proofErr w:type="spellEnd"/>
+            <w:r>
+              <w:rPr>
+                <w:rFonts w:ascii="Helvetica" w:eastAsia="Times New Roman" w:hAnsi="Helvetica" w:cs="Helvetica"/>
+                <w:sz w:val="26"/>
+                <w:szCs w:val="26"/>
+              </w:rPr>
+              <w:t xml:space="preserve"> escribe</w:t>
+            </w:r>
+          </w:p>
+        </w:tc>
+      </w:tr>
+      <w:tr>
+        <w:tc>
+          <w:tcPr>
+            <w:tcW w:w="1812" w:type="dxa"/>
+            <w:hideMark/>
+          </w:tcPr>
+          <w:p>
+            <w:pPr>
+              <w:spacing w:before="144" w:after="264"/>
+              <w:rPr>
+                <w:rFonts w:ascii="Helvetica" w:eastAsia="Times New Roman" w:hAnsi="Helvetica" w:cs="Helvetica"/>
+                <w:sz w:val="26"/>
+                <w:szCs w:val="26"/>
+              </w:rPr>
+            </w:pPr>
+            <w:r>
+              <w:rPr>
+                <w:rFonts w:ascii="Helvetica" w:eastAsia="Times New Roman" w:hAnsi="Helvetica" w:cs="Helvetica"/>
+                <w:sz w:val="26"/>
+                <w:szCs w:val="26"/>
+                <w:shd w:val="clear" w:color="auto" w:fill="181D27"/>
+              </w:rPr>
+              <w:t>services.py</w:t>
+            </w:r>
+          </w:p>
+        </w:tc>
+        <w:tc>
+          <w:tcPr>
+            <w:tcW w:w="6405" w:type="dxa"/>
+            <w:hideMark/>
+          </w:tcPr>
+          <w:p>
+            <w:pPr>
+              <w:spacing w:before="144" w:after="264"/>
+              <w:rPr>
+                <w:rFonts w:ascii="Helvetica" w:eastAsia="Times New Roman" w:hAnsi="Helvetica" w:cs="Helvetica"/>
+                <w:sz w:val="26"/>
+                <w:szCs w:val="26"/>
+                <w:lang w:val="es-AR"/>
+              </w:rPr>
+            </w:pPr>
+            <w:r>
+              <w:rPr>
+                <w:rFonts w:ascii="Helvetica" w:eastAsia="Times New Roman" w:hAnsi="Helvetica" w:cs="Helvetica"/>
+                <w:sz w:val="26"/>
+                <w:szCs w:val="26"/>
+                <w:lang w:val="es-AR"/>
+              </w:rPr>
+              <w:t xml:space="preserve">Operaciones que modifican datos o coordinan varios modelos: </w:t>
+            </w:r>
+            <w:proofErr w:type="spellStart"/>
+            <w:r>
+              <w:rPr>
+                <w:rFonts w:ascii="Helvetica" w:eastAsia="Times New Roman" w:hAnsi="Helvetica" w:cs="Helvetica"/>
+                <w:sz w:val="26"/>
+                <w:szCs w:val="26"/>
+                <w:shd w:val="clear" w:color="auto" w:fill="181D27"/>
+                <w:lang w:val="es-AR"/>
+              </w:rPr>
+              <w:t>create_project</w:t>
+            </w:r>
+            <w:proofErr w:type="spellEnd"/>
+            <w:r>
+              <w:rPr>
+                <w:rFonts w:ascii="Helvetica" w:eastAsia="Times New Roman" w:hAnsi="Helvetica" w:cs="Helvetica"/>
+                <w:sz w:val="26"/>
+                <w:szCs w:val="26"/>
+                <w:shd w:val="clear" w:color="auto" w:fill="181D27"/>
+                <w:lang w:val="es-AR"/>
+              </w:rPr>
+              <w:t>()</w:t>
+            </w:r>
+            <w:r>
+              <w:rPr>
+                <w:rFonts w:ascii="Helvetica" w:eastAsia="Times New Roman" w:hAnsi="Helvetica" w:cs="Helvetica"/>
+                <w:sz w:val="26"/>
+                <w:szCs w:val="26"/>
+                <w:lang w:val="es-AR"/>
+              </w:rPr>
+              <w:t xml:space="preserve">, </w:t>
+            </w:r>
+            <w:proofErr w:type="spellStart"/>
+            <w:r>
+              <w:rPr>
+                <w:rFonts w:ascii="Helvetica" w:eastAsia="Times New Roman" w:hAnsi="Helvetica" w:cs="Helvetica"/>
+                <w:sz w:val="26"/>
+                <w:szCs w:val="26"/>
+                <w:shd w:val="clear" w:color="auto" w:fill="181D27"/>
+                <w:lang w:val="es-AR"/>
+              </w:rPr>
+              <w:t>review_project</w:t>
+            </w:r>
+            <w:proofErr w:type="spellEnd"/>
+            <w:r>
+              <w:rPr>
+                <w:rFonts w:ascii="Helvetica" w:eastAsia="Times New Roman" w:hAnsi="Helvetica" w:cs="Helvetica"/>
+                <w:sz w:val="26"/>
+                <w:szCs w:val="26"/>
+                <w:shd w:val="clear" w:color="auto" w:fill="181D27"/>
+                <w:lang w:val="es-AR"/>
+              </w:rPr>
+              <w:t>()</w:t>
+            </w:r>
+            <w:r>
+              <w:rPr>
+                <w:rFonts w:ascii="Helvetica" w:eastAsia="Times New Roman" w:hAnsi="Helvetica" w:cs="Helvetica"/>
+                <w:sz w:val="26"/>
+                <w:szCs w:val="26"/>
+                <w:lang w:val="es-AR"/>
+              </w:rPr>
+              <w:t>.</w:t>
+            </w:r>
+          </w:p>
+        </w:tc>
+        <w:tc>
+          <w:tcPr>
+            <w:tcW w:w="3260" w:type="dxa"/>
+            <w:hideMark/>
+          </w:tcPr>
+          <w:p>
+            <w:pPr>
+              <w:spacing w:before="144" w:after="264"/>
+              <w:rPr>
+                <w:rFonts w:ascii="Helvetica" w:eastAsia="Times New Roman" w:hAnsi="Helvetica" w:cs="Helvetica"/>
+                <w:sz w:val="26"/>
+                <w:szCs w:val="26"/>
+                <w:lang w:val="es-AR"/>
+              </w:rPr>
+            </w:pPr>
+            <w:r>
+              <w:rPr>
+                <w:rFonts w:ascii="Helvetica" w:eastAsia="Times New Roman" w:hAnsi="Helvetica" w:cs="Helvetica"/>
+                <w:sz w:val="26"/>
+                <w:szCs w:val="26"/>
+                <w:lang w:val="es-AR"/>
+              </w:rPr>
+              <w:t>Escribe, y suele ser transaccional</w:t>
+            </w:r>
+          </w:p>
+        </w:tc>
+      </w:tr>
+      <w:tr>
+        <w:tc>
+          <w:tcPr>
+            <w:tcW w:w="1812" w:type="dxa"/>
+            <w:hideMark/>
+          </w:tcPr>
+          <w:p>
+            <w:pPr>
+              <w:spacing w:before="144" w:after="264"/>
+              <w:rPr>
+                <w:rFonts w:ascii="Helvetica" w:eastAsia="Times New Roman" w:hAnsi="Helvetica" w:cs="Helvetica"/>
+                <w:sz w:val="26"/>
+                <w:szCs w:val="26"/>
+              </w:rPr>
+            </w:pPr>
+            <w:r>
+              <w:rPr>
+                <w:rFonts w:ascii="Helvetica" w:eastAsia="Times New Roman" w:hAnsi="Helvetica" w:cs="Helvetica"/>
+                <w:sz w:val="26"/>
+                <w:szCs w:val="26"/>
+                <w:shd w:val="clear" w:color="auto" w:fill="181D27"/>
+              </w:rPr>
+              <w:t>schemas.py</w:t>
+            </w:r>
+          </w:p>
+        </w:tc>
+        <w:tc>
+          <w:tcPr>
+            <w:tcW w:w="6405" w:type="dxa"/>
+            <w:hideMark/>
+          </w:tcPr>
+          <w:p>
+            <w:pPr>
+              <w:spacing w:before="144" w:after="264"/>
+              <w:rPr>
+                <w:rFonts w:ascii="Helvetica" w:eastAsia="Times New Roman" w:hAnsi="Helvetica" w:cs="Helvetica"/>
+                <w:sz w:val="26"/>
+                <w:szCs w:val="26"/>
+                <w:lang w:val="es-AR"/>
+              </w:rPr>
+            </w:pPr>
+            <w:r>
+              <w:rPr>
+                <w:rFonts w:ascii="Helvetica" w:eastAsia="Times New Roman" w:hAnsi="Helvetica" w:cs="Helvetica"/>
+                <w:sz w:val="26"/>
+                <w:szCs w:val="26"/>
+                <w:lang w:val="es-AR"/>
+              </w:rPr>
+              <w:t>La forma de lo que entra y sale por la API, con su validación.</w:t>
+            </w:r>
+          </w:p>
+        </w:tc>
+        <w:tc>
+          <w:tcPr>
+            <w:tcW w:w="3260" w:type="dxa"/>
+            <w:hideMark/>
+          </w:tcPr>
+          <w:p>
+            <w:pPr>
+              <w:spacing w:before="144" w:after="264"/>
+              <w:rPr>
+                <w:rFonts w:ascii="Helvetica" w:eastAsia="Times New Roman" w:hAnsi="Helvetica" w:cs="Helvetica"/>
+                <w:sz w:val="26"/>
+                <w:szCs w:val="26"/>
+                <w:lang w:val="es-AR"/>
+              </w:rPr>
+            </w:pPr>
+            <w:r>
+              <w:rPr>
+                <w:rFonts w:ascii="Helvetica" w:eastAsia="Times New Roman" w:hAnsi="Helvetica" w:cs="Helvetica"/>
+                <w:sz w:val="26"/>
+                <w:szCs w:val="26"/>
+                <w:lang w:val="es-AR"/>
+              </w:rPr>
+              <w:t>No sabe nada de la base</w:t>
+            </w:r>
+          </w:p>
+        </w:tc>
+      </w:tr>
+      <w:tr>
+        <w:tc>
+          <w:tcPr>
+            <w:tcW w:w="1812" w:type="dxa"/>
+            <w:hideMark/>
+          </w:tcPr>
+          <w:p>
+            <w:pPr>
+              <w:spacing w:before="144" w:after="264"/>
+              <w:rPr>
+                <w:rFonts w:ascii="Helvetica" w:eastAsia="Times New Roman" w:hAnsi="Helvetica" w:cs="Helvetica"/>
+                <w:sz w:val="26"/>
+                <w:szCs w:val="26"/>
+              </w:rPr>
+            </w:pPr>
+            <w:r>
+              <w:rPr>
+                <w:rFonts w:ascii="Helvetica" w:eastAsia="Times New Roman" w:hAnsi="Helvetica" w:cs="Helvetica"/>
+                <w:sz w:val="26"/>
+                <w:szCs w:val="26"/>
+                <w:shd w:val="clear" w:color="auto" w:fill="181D27"/>
+              </w:rPr>
+              <w:t>api.py</w:t>
+            </w:r>
+          </w:p>
+        </w:tc>
+        <w:tc>
+          <w:tcPr>
+            <w:tcW w:w="6405" w:type="dxa"/>
+            <w:hideMark/>
+          </w:tcPr>
+          <w:p>
+            <w:pPr>
+              <w:spacing w:before="144" w:after="264"/>
+              <w:rPr>
+                <w:rFonts w:ascii="Helvetica" w:eastAsia="Times New Roman" w:hAnsi="Helvetica" w:cs="Helvetica"/>
+                <w:sz w:val="26"/>
+                <w:szCs w:val="26"/>
+                <w:lang w:val="es-AR"/>
+              </w:rPr>
+            </w:pPr>
+            <w:r>
+              <w:rPr>
+                <w:rFonts w:ascii="Helvetica" w:eastAsia="Times New Roman" w:hAnsi="Helvetica" w:cs="Helvetica"/>
+                <w:sz w:val="26"/>
+                <w:szCs w:val="26"/>
+                <w:lang w:val="es-AR"/>
+              </w:rPr>
+              <w:t xml:space="preserve">Los </w:t>
+            </w:r>
+            <w:proofErr w:type="spellStart"/>
+            <w:r>
+              <w:rPr>
+                <w:rFonts w:ascii="Helvetica" w:eastAsia="Times New Roman" w:hAnsi="Helvetica" w:cs="Helvetica"/>
+                <w:sz w:val="26"/>
+                <w:szCs w:val="26"/>
+                <w:lang w:val="es-AR"/>
+              </w:rPr>
+              <w:t>endpoints</w:t>
+            </w:r>
+            <w:proofErr w:type="spellEnd"/>
+            <w:r>
+              <w:rPr>
+                <w:rFonts w:ascii="Helvetica" w:eastAsia="Times New Roman" w:hAnsi="Helvetica" w:cs="Helvetica"/>
+                <w:sz w:val="26"/>
+                <w:szCs w:val="26"/>
+                <w:lang w:val="es-AR"/>
+              </w:rPr>
+              <w:t xml:space="preserve">: permisos, validación de entrada, llamada a un selector o a un </w:t>
+            </w:r>
+            <w:proofErr w:type="spellStart"/>
+            <w:r>
+              <w:rPr>
+                <w:rFonts w:ascii="Helvetica" w:eastAsia="Times New Roman" w:hAnsi="Helvetica" w:cs="Helvetica"/>
+                <w:sz w:val="26"/>
+                <w:szCs w:val="26"/>
+                <w:lang w:val="es-AR"/>
+              </w:rPr>
+              <w:t>service</w:t>
+            </w:r>
+            <w:proofErr w:type="spellEnd"/>
+            <w:r>
+              <w:rPr>
+                <w:rFonts w:ascii="Helvetica" w:eastAsia="Times New Roman" w:hAnsi="Helvetica" w:cs="Helvetica"/>
+                <w:sz w:val="26"/>
+                <w:szCs w:val="26"/>
+                <w:lang w:val="es-AR"/>
+              </w:rPr>
+              <w:t>, y traducción de errores.</w:t>
+            </w:r>
+          </w:p>
+        </w:tc>
+        <w:tc>
+          <w:tcPr>
+            <w:tcW w:w="3260" w:type="dxa"/>
+            <w:hideMark/>
+          </w:tcPr>
+          <w:p>
+            <w:pPr>
+              <w:spacing w:before="144" w:after="264"/>
+              <w:rPr>
+                <w:rFonts w:ascii="Helvetica" w:eastAsia="Times New Roman" w:hAnsi="Helvetica" w:cs="Helvetica"/>
+                <w:sz w:val="26"/>
+                <w:szCs w:val="26"/>
+              </w:rPr>
+            </w:pPr>
+            <w:r>
+              <w:rPr>
+                <w:rFonts w:ascii="Helvetica" w:eastAsia="Times New Roman" w:hAnsi="Helvetica" w:cs="Helvetica"/>
+                <w:sz w:val="26"/>
+                <w:szCs w:val="26"/>
+              </w:rPr>
+              <w:t xml:space="preserve">No </w:t>
+            </w:r>
+            <w:proofErr w:type="spellStart"/>
+            <w:r>
+              <w:rPr>
+                <w:rFonts w:ascii="Helvetica" w:eastAsia="Times New Roman" w:hAnsi="Helvetica" w:cs="Helvetica"/>
+                <w:sz w:val="26"/>
+                <w:szCs w:val="26"/>
+              </w:rPr>
+              <w:t>debería</w:t>
+            </w:r>
+            <w:proofErr w:type="spellEnd"/>
+            <w:r>
+              <w:rPr>
+                <w:rFonts w:ascii="Helvetica" w:eastAsia="Times New Roman" w:hAnsi="Helvetica" w:cs="Helvetica"/>
+                <w:sz w:val="26"/>
+                <w:szCs w:val="26"/>
+              </w:rPr>
+              <w:t xml:space="preserve"> </w:t>
+            </w:r>
+            <w:proofErr w:type="spellStart"/>
+            <w:r>
+              <w:rPr>
+                <w:rFonts w:ascii="Helvetica" w:eastAsia="Times New Roman" w:hAnsi="Helvetica" w:cs="Helvetica"/>
+                <w:sz w:val="26"/>
+                <w:szCs w:val="26"/>
+              </w:rPr>
+              <w:t>tener</w:t>
+            </w:r>
+            <w:proofErr w:type="spellEnd"/>
+            <w:r>
+              <w:rPr>
+                <w:rFonts w:ascii="Helvetica" w:eastAsia="Times New Roman" w:hAnsi="Helvetica" w:cs="Helvetica"/>
+                <w:sz w:val="26"/>
+                <w:szCs w:val="26"/>
+              </w:rPr>
+              <w:t xml:space="preserve"> </w:t>
+            </w:r>
+            <w:proofErr w:type="spellStart"/>
+            <w:r>
+              <w:rPr>
+                <w:rFonts w:ascii="Helvetica" w:eastAsia="Times New Roman" w:hAnsi="Helvetica" w:cs="Helvetica"/>
+                <w:sz w:val="26"/>
+                <w:szCs w:val="26"/>
+              </w:rPr>
+              <w:t>lógica</w:t>
+            </w:r>
+            <w:proofErr w:type="spellEnd"/>
+          </w:p>
+        </w:tc>
+      </w:tr>
+    </w:tbl>
     <w:p>
       <w:pPr>
         <w:rPr>

</xml_diff>

<commit_message>
feat: Paso 12 Editar el settings.py, variables de entorno
</commit_message>
<xml_diff>
--- a/221_backend/App.docx
+++ b/221_backend/App.docx
@@ -2292,8 +2292,6 @@
         </w:rPr>
         <w:t>y por qué la API no toca el ORM</w:t>
       </w:r>
-      <w:bookmarkStart w:id="0" w:name="_GoBack"/>
-      <w:bookmarkEnd w:id="0"/>
     </w:p>
     <w:tbl>
       <w:tblPr>
@@ -3325,6 +3323,1433 @@
                 <w:szCs w:val="26"/>
               </w:rPr>
               <w:t>lógica</w:t>
+            </w:r>
+            <w:proofErr w:type="spellEnd"/>
+          </w:p>
+        </w:tc>
+      </w:tr>
+    </w:tbl>
+    <w:p>
+      <w:pPr>
+        <w:rPr>
+          <w:lang w:val="es-AR"/>
+        </w:rPr>
+      </w:pPr>
+    </w:p>
+    <w:p>
+      <w:pPr>
+        <w:rPr>
+          <w:lang w:val="es-AR"/>
+        </w:rPr>
+      </w:pPr>
+      <w:r>
+        <w:rPr>
+          <w:lang w:val="es-AR"/>
+        </w:rPr>
+        <w:t>Teoría 11</w:t>
+      </w:r>
+      <w:r>
+        <w:rPr>
+          <w:lang w:val="es-AR"/>
+        </w:rPr>
+        <w:t xml:space="preserve"> - INSTALLED_APPS y el arranque de Django</w:t>
+      </w:r>
+    </w:p>
+    <w:tbl>
+      <w:tblPr>
+        <w:tblStyle w:val="Tablaconcuadrcula"/>
+        <w:tblW w:w="0" w:type="auto"/>
+        <w:tblLook w:val="04A0" w:firstRow="1" w:lastRow="0" w:firstColumn="1" w:lastColumn="0" w:noHBand="0" w:noVBand="1"/>
+      </w:tblPr>
+      <w:tblGrid>
+        <w:gridCol w:w="3111"/>
+        <w:gridCol w:w="8366"/>
+      </w:tblGrid>
+      <w:tr>
+        <w:tc>
+          <w:tcPr>
+            <w:tcW w:w="3920" w:type="dxa"/>
+            <w:hideMark/>
+          </w:tcPr>
+          <w:p>
+            <w:pPr>
+              <w:spacing w:before="144" w:after="264"/>
+              <w:rPr>
+                <w:rFonts w:ascii="Helvetica" w:eastAsia="Times New Roman" w:hAnsi="Helvetica" w:cs="Helvetica"/>
+                <w:b/>
+                <w:bCs/>
+                <w:sz w:val="28"/>
+                <w:szCs w:val="28"/>
+              </w:rPr>
+            </w:pPr>
+            <w:r>
+              <w:rPr>
+                <w:rFonts w:ascii="Helvetica" w:eastAsia="Times New Roman" w:hAnsi="Helvetica" w:cs="Helvetica"/>
+                <w:b/>
+                <w:bCs/>
+                <w:sz w:val="28"/>
+                <w:szCs w:val="28"/>
+              </w:rPr>
+              <w:t xml:space="preserve">App de </w:t>
+            </w:r>
+            <w:proofErr w:type="spellStart"/>
+            <w:r>
+              <w:rPr>
+                <w:rFonts w:ascii="Helvetica" w:eastAsia="Times New Roman" w:hAnsi="Helvetica" w:cs="Helvetica"/>
+                <w:b/>
+                <w:bCs/>
+                <w:sz w:val="28"/>
+                <w:szCs w:val="28"/>
+              </w:rPr>
+              <w:t>contrib</w:t>
+            </w:r>
+            <w:proofErr w:type="spellEnd"/>
+          </w:p>
+        </w:tc>
+        <w:tc>
+          <w:tcPr>
+            <w:tcW w:w="7557" w:type="dxa"/>
+            <w:hideMark/>
+          </w:tcPr>
+          <w:p>
+            <w:pPr>
+              <w:spacing w:before="144" w:after="264"/>
+              <w:rPr>
+                <w:rFonts w:ascii="Helvetica" w:eastAsia="Times New Roman" w:hAnsi="Helvetica" w:cs="Helvetica"/>
+                <w:b/>
+                <w:bCs/>
+                <w:sz w:val="28"/>
+                <w:szCs w:val="28"/>
+              </w:rPr>
+            </w:pPr>
+            <w:proofErr w:type="spellStart"/>
+            <w:r>
+              <w:rPr>
+                <w:rFonts w:ascii="Helvetica" w:eastAsia="Times New Roman" w:hAnsi="Helvetica" w:cs="Helvetica"/>
+                <w:b/>
+                <w:bCs/>
+                <w:sz w:val="28"/>
+                <w:szCs w:val="28"/>
+              </w:rPr>
+              <w:t>Qué</w:t>
+            </w:r>
+            <w:proofErr w:type="spellEnd"/>
+            <w:r>
+              <w:rPr>
+                <w:rFonts w:ascii="Helvetica" w:eastAsia="Times New Roman" w:hAnsi="Helvetica" w:cs="Helvetica"/>
+                <w:b/>
+                <w:bCs/>
+                <w:sz w:val="28"/>
+                <w:szCs w:val="28"/>
+              </w:rPr>
+              <w:t xml:space="preserve"> </w:t>
+            </w:r>
+            <w:proofErr w:type="spellStart"/>
+            <w:r>
+              <w:rPr>
+                <w:rFonts w:ascii="Helvetica" w:eastAsia="Times New Roman" w:hAnsi="Helvetica" w:cs="Helvetica"/>
+                <w:b/>
+                <w:bCs/>
+                <w:sz w:val="28"/>
+                <w:szCs w:val="28"/>
+              </w:rPr>
+              <w:t>aporta</w:t>
+            </w:r>
+            <w:proofErr w:type="spellEnd"/>
+          </w:p>
+        </w:tc>
+      </w:tr>
+      <w:tr>
+        <w:tc>
+          <w:tcPr>
+            <w:tcW w:w="0" w:type="auto"/>
+            <w:hideMark/>
+          </w:tcPr>
+          <w:p>
+            <w:pPr>
+              <w:spacing w:before="144" w:after="264"/>
+              <w:rPr>
+                <w:rFonts w:ascii="Helvetica" w:eastAsia="Times New Roman" w:hAnsi="Helvetica" w:cs="Helvetica"/>
+                <w:sz w:val="28"/>
+                <w:szCs w:val="28"/>
+              </w:rPr>
+            </w:pPr>
+            <w:r>
+              <w:rPr>
+                <w:rFonts w:ascii="Helvetica" w:eastAsia="Times New Roman" w:hAnsi="Helvetica" w:cs="Helvetica"/>
+                <w:sz w:val="28"/>
+                <w:szCs w:val="28"/>
+                <w:shd w:val="clear" w:color="auto" w:fill="181D27"/>
+              </w:rPr>
+              <w:t>admin</w:t>
+            </w:r>
+          </w:p>
+        </w:tc>
+        <w:tc>
+          <w:tcPr>
+            <w:tcW w:w="0" w:type="auto"/>
+            <w:hideMark/>
+          </w:tcPr>
+          <w:p>
+            <w:pPr>
+              <w:spacing w:before="144" w:after="264"/>
+              <w:rPr>
+                <w:rFonts w:ascii="Helvetica" w:eastAsia="Times New Roman" w:hAnsi="Helvetica" w:cs="Helvetica"/>
+                <w:sz w:val="28"/>
+                <w:szCs w:val="28"/>
+                <w:lang w:val="es-AR"/>
+              </w:rPr>
+            </w:pPr>
+            <w:r>
+              <w:rPr>
+                <w:rFonts w:ascii="Helvetica" w:eastAsia="Times New Roman" w:hAnsi="Helvetica" w:cs="Helvetica"/>
+                <w:sz w:val="28"/>
+                <w:szCs w:val="28"/>
+                <w:lang w:val="es-AR"/>
+              </w:rPr>
+              <w:t xml:space="preserve">El panel de administración, con su </w:t>
+            </w:r>
+            <w:proofErr w:type="spellStart"/>
+            <w:r>
+              <w:rPr>
+                <w:rFonts w:ascii="Helvetica" w:eastAsia="Times New Roman" w:hAnsi="Helvetica" w:cs="Helvetica"/>
+                <w:sz w:val="28"/>
+                <w:szCs w:val="28"/>
+                <w:lang w:val="es-AR"/>
+              </w:rPr>
+              <w:t>login</w:t>
+            </w:r>
+            <w:proofErr w:type="spellEnd"/>
+            <w:r>
+              <w:rPr>
+                <w:rFonts w:ascii="Helvetica" w:eastAsia="Times New Roman" w:hAnsi="Helvetica" w:cs="Helvetica"/>
+                <w:sz w:val="28"/>
+                <w:szCs w:val="28"/>
+                <w:lang w:val="es-AR"/>
+              </w:rPr>
+              <w:t xml:space="preserve"> y sus formularios generados.</w:t>
+            </w:r>
+          </w:p>
+        </w:tc>
+      </w:tr>
+      <w:tr>
+        <w:tc>
+          <w:tcPr>
+            <w:tcW w:w="0" w:type="auto"/>
+            <w:hideMark/>
+          </w:tcPr>
+          <w:p>
+            <w:pPr>
+              <w:spacing w:before="144" w:after="264"/>
+              <w:rPr>
+                <w:rFonts w:ascii="Helvetica" w:eastAsia="Times New Roman" w:hAnsi="Helvetica" w:cs="Helvetica"/>
+                <w:sz w:val="28"/>
+                <w:szCs w:val="28"/>
+              </w:rPr>
+            </w:pPr>
+            <w:proofErr w:type="spellStart"/>
+            <w:r>
+              <w:rPr>
+                <w:rFonts w:ascii="Helvetica" w:eastAsia="Times New Roman" w:hAnsi="Helvetica" w:cs="Helvetica"/>
+                <w:sz w:val="28"/>
+                <w:szCs w:val="28"/>
+                <w:shd w:val="clear" w:color="auto" w:fill="181D27"/>
+              </w:rPr>
+              <w:t>auth</w:t>
+            </w:r>
+            <w:proofErr w:type="spellEnd"/>
+          </w:p>
+        </w:tc>
+        <w:tc>
+          <w:tcPr>
+            <w:tcW w:w="0" w:type="auto"/>
+            <w:hideMark/>
+          </w:tcPr>
+          <w:p>
+            <w:pPr>
+              <w:spacing w:before="144" w:after="264"/>
+              <w:rPr>
+                <w:rFonts w:ascii="Helvetica" w:eastAsia="Times New Roman" w:hAnsi="Helvetica" w:cs="Helvetica"/>
+                <w:sz w:val="28"/>
+                <w:szCs w:val="28"/>
+                <w:lang w:val="es-AR"/>
+              </w:rPr>
+            </w:pPr>
+            <w:r>
+              <w:rPr>
+                <w:rFonts w:ascii="Helvetica" w:eastAsia="Times New Roman" w:hAnsi="Helvetica" w:cs="Helvetica"/>
+                <w:sz w:val="28"/>
+                <w:szCs w:val="28"/>
+                <w:lang w:val="es-AR"/>
+              </w:rPr>
+              <w:t xml:space="preserve">Usuarios, grupos, permisos y el </w:t>
+            </w:r>
+            <w:proofErr w:type="spellStart"/>
+            <w:r>
+              <w:rPr>
+                <w:rFonts w:ascii="Helvetica" w:eastAsia="Times New Roman" w:hAnsi="Helvetica" w:cs="Helvetica"/>
+                <w:sz w:val="28"/>
+                <w:szCs w:val="28"/>
+                <w:lang w:val="es-AR"/>
+              </w:rPr>
+              <w:t>hasheo</w:t>
+            </w:r>
+            <w:proofErr w:type="spellEnd"/>
+            <w:r>
+              <w:rPr>
+                <w:rFonts w:ascii="Helvetica" w:eastAsia="Times New Roman" w:hAnsi="Helvetica" w:cs="Helvetica"/>
+                <w:sz w:val="28"/>
+                <w:szCs w:val="28"/>
+                <w:lang w:val="es-AR"/>
+              </w:rPr>
+              <w:t xml:space="preserve"> de contraseñas.</w:t>
+            </w:r>
+          </w:p>
+        </w:tc>
+      </w:tr>
+      <w:tr>
+        <w:tc>
+          <w:tcPr>
+            <w:tcW w:w="0" w:type="auto"/>
+            <w:hideMark/>
+          </w:tcPr>
+          <w:p>
+            <w:pPr>
+              <w:spacing w:before="144" w:after="264"/>
+              <w:rPr>
+                <w:rFonts w:ascii="Helvetica" w:eastAsia="Times New Roman" w:hAnsi="Helvetica" w:cs="Helvetica"/>
+                <w:sz w:val="28"/>
+                <w:szCs w:val="28"/>
+              </w:rPr>
+            </w:pPr>
+            <w:proofErr w:type="spellStart"/>
+            <w:r>
+              <w:rPr>
+                <w:rFonts w:ascii="Helvetica" w:eastAsia="Times New Roman" w:hAnsi="Helvetica" w:cs="Helvetica"/>
+                <w:sz w:val="28"/>
+                <w:szCs w:val="28"/>
+                <w:shd w:val="clear" w:color="auto" w:fill="181D27"/>
+              </w:rPr>
+              <w:t>contenttypes</w:t>
+            </w:r>
+            <w:proofErr w:type="spellEnd"/>
+          </w:p>
+        </w:tc>
+        <w:tc>
+          <w:tcPr>
+            <w:tcW w:w="0" w:type="auto"/>
+            <w:hideMark/>
+          </w:tcPr>
+          <w:p>
+            <w:pPr>
+              <w:spacing w:before="144" w:after="264"/>
+              <w:rPr>
+                <w:rFonts w:ascii="Helvetica" w:eastAsia="Times New Roman" w:hAnsi="Helvetica" w:cs="Helvetica"/>
+                <w:sz w:val="28"/>
+                <w:szCs w:val="28"/>
+                <w:lang w:val="es-AR"/>
+              </w:rPr>
+            </w:pPr>
+            <w:r>
+              <w:rPr>
+                <w:rFonts w:ascii="Helvetica" w:eastAsia="Times New Roman" w:hAnsi="Helvetica" w:cs="Helvetica"/>
+                <w:sz w:val="28"/>
+                <w:szCs w:val="28"/>
+                <w:lang w:val="es-AR"/>
+              </w:rPr>
+              <w:t>Un registro de todos los modelos del proyecto, que usan los permisos y las relaciones genéricas.</w:t>
+            </w:r>
+          </w:p>
+        </w:tc>
+      </w:tr>
+      <w:tr>
+        <w:tc>
+          <w:tcPr>
+            <w:tcW w:w="0" w:type="auto"/>
+            <w:hideMark/>
+          </w:tcPr>
+          <w:p>
+            <w:pPr>
+              <w:spacing w:before="144" w:after="264"/>
+              <w:rPr>
+                <w:rFonts w:ascii="Helvetica" w:eastAsia="Times New Roman" w:hAnsi="Helvetica" w:cs="Helvetica"/>
+                <w:sz w:val="28"/>
+                <w:szCs w:val="28"/>
+              </w:rPr>
+            </w:pPr>
+            <w:r>
+              <w:rPr>
+                <w:rFonts w:ascii="Helvetica" w:eastAsia="Times New Roman" w:hAnsi="Helvetica" w:cs="Helvetica"/>
+                <w:sz w:val="28"/>
+                <w:szCs w:val="28"/>
+                <w:shd w:val="clear" w:color="auto" w:fill="181D27"/>
+              </w:rPr>
+              <w:t>sessions</w:t>
+            </w:r>
+          </w:p>
+        </w:tc>
+        <w:tc>
+          <w:tcPr>
+            <w:tcW w:w="0" w:type="auto"/>
+            <w:hideMark/>
+          </w:tcPr>
+          <w:p>
+            <w:pPr>
+              <w:spacing w:before="144" w:after="264"/>
+              <w:rPr>
+                <w:rFonts w:ascii="Helvetica" w:eastAsia="Times New Roman" w:hAnsi="Helvetica" w:cs="Helvetica"/>
+                <w:sz w:val="28"/>
+                <w:szCs w:val="28"/>
+                <w:lang w:val="es-AR"/>
+              </w:rPr>
+            </w:pPr>
+            <w:r>
+              <w:rPr>
+                <w:rFonts w:ascii="Helvetica" w:eastAsia="Times New Roman" w:hAnsi="Helvetica" w:cs="Helvetica"/>
+                <w:sz w:val="28"/>
+                <w:szCs w:val="28"/>
+                <w:lang w:val="es-AR"/>
+              </w:rPr>
+              <w:t xml:space="preserve">Sesiones guardadas del lado del servidor (las que usa el </w:t>
+            </w:r>
+            <w:proofErr w:type="spellStart"/>
+            <w:r>
+              <w:rPr>
+                <w:rFonts w:ascii="Helvetica" w:eastAsia="Times New Roman" w:hAnsi="Helvetica" w:cs="Helvetica"/>
+                <w:sz w:val="28"/>
+                <w:szCs w:val="28"/>
+                <w:lang w:val="es-AR"/>
+              </w:rPr>
+              <w:t>admin</w:t>
+            </w:r>
+            <w:proofErr w:type="spellEnd"/>
+            <w:r>
+              <w:rPr>
+                <w:rFonts w:ascii="Helvetica" w:eastAsia="Times New Roman" w:hAnsi="Helvetica" w:cs="Helvetica"/>
+                <w:sz w:val="28"/>
+                <w:szCs w:val="28"/>
+                <w:lang w:val="es-AR"/>
+              </w:rPr>
+              <w:t>).</w:t>
+            </w:r>
+          </w:p>
+        </w:tc>
+      </w:tr>
+      <w:tr>
+        <w:tc>
+          <w:tcPr>
+            <w:tcW w:w="0" w:type="auto"/>
+            <w:hideMark/>
+          </w:tcPr>
+          <w:p>
+            <w:pPr>
+              <w:spacing w:before="144" w:after="264"/>
+              <w:rPr>
+                <w:rFonts w:ascii="Helvetica" w:eastAsia="Times New Roman" w:hAnsi="Helvetica" w:cs="Helvetica"/>
+                <w:sz w:val="28"/>
+                <w:szCs w:val="28"/>
+              </w:rPr>
+            </w:pPr>
+            <w:r>
+              <w:rPr>
+                <w:rFonts w:ascii="Helvetica" w:eastAsia="Times New Roman" w:hAnsi="Helvetica" w:cs="Helvetica"/>
+                <w:sz w:val="28"/>
+                <w:szCs w:val="28"/>
+                <w:shd w:val="clear" w:color="auto" w:fill="181D27"/>
+              </w:rPr>
+              <w:t>messages</w:t>
+            </w:r>
+          </w:p>
+        </w:tc>
+        <w:tc>
+          <w:tcPr>
+            <w:tcW w:w="0" w:type="auto"/>
+            <w:hideMark/>
+          </w:tcPr>
+          <w:p>
+            <w:pPr>
+              <w:spacing w:before="144" w:after="264"/>
+              <w:rPr>
+                <w:rFonts w:ascii="Helvetica" w:eastAsia="Times New Roman" w:hAnsi="Helvetica" w:cs="Helvetica"/>
+                <w:sz w:val="28"/>
+                <w:szCs w:val="28"/>
+                <w:lang w:val="es-AR"/>
+              </w:rPr>
+            </w:pPr>
+            <w:r>
+              <w:rPr>
+                <w:rFonts w:ascii="Helvetica" w:eastAsia="Times New Roman" w:hAnsi="Helvetica" w:cs="Helvetica"/>
+                <w:sz w:val="28"/>
+                <w:szCs w:val="28"/>
+                <w:lang w:val="es-AR"/>
+              </w:rPr>
+              <w:t xml:space="preserve">Los avisos de una pantalla a la siguiente en el </w:t>
+            </w:r>
+            <w:proofErr w:type="spellStart"/>
+            <w:r>
+              <w:rPr>
+                <w:rFonts w:ascii="Helvetica" w:eastAsia="Times New Roman" w:hAnsi="Helvetica" w:cs="Helvetica"/>
+                <w:sz w:val="28"/>
+                <w:szCs w:val="28"/>
+                <w:lang w:val="es-AR"/>
+              </w:rPr>
+              <w:t>admin</w:t>
+            </w:r>
+            <w:proofErr w:type="spellEnd"/>
+            <w:r>
+              <w:rPr>
+                <w:rFonts w:ascii="Helvetica" w:eastAsia="Times New Roman" w:hAnsi="Helvetica" w:cs="Helvetica"/>
+                <w:sz w:val="28"/>
+                <w:szCs w:val="28"/>
+                <w:lang w:val="es-AR"/>
+              </w:rPr>
+              <w:t>.</w:t>
+            </w:r>
+          </w:p>
+        </w:tc>
+      </w:tr>
+      <w:tr>
+        <w:tc>
+          <w:tcPr>
+            <w:tcW w:w="0" w:type="auto"/>
+            <w:hideMark/>
+          </w:tcPr>
+          <w:p>
+            <w:pPr>
+              <w:spacing w:before="144" w:after="264"/>
+              <w:rPr>
+                <w:rFonts w:ascii="Helvetica" w:eastAsia="Times New Roman" w:hAnsi="Helvetica" w:cs="Helvetica"/>
+                <w:sz w:val="28"/>
+                <w:szCs w:val="28"/>
+              </w:rPr>
+            </w:pPr>
+            <w:proofErr w:type="spellStart"/>
+            <w:r>
+              <w:rPr>
+                <w:rFonts w:ascii="Helvetica" w:eastAsia="Times New Roman" w:hAnsi="Helvetica" w:cs="Helvetica"/>
+                <w:sz w:val="28"/>
+                <w:szCs w:val="28"/>
+                <w:shd w:val="clear" w:color="auto" w:fill="181D27"/>
+              </w:rPr>
+              <w:t>staticfiles</w:t>
+            </w:r>
+            <w:proofErr w:type="spellEnd"/>
+          </w:p>
+        </w:tc>
+        <w:tc>
+          <w:tcPr>
+            <w:tcW w:w="0" w:type="auto"/>
+            <w:hideMark/>
+          </w:tcPr>
+          <w:p>
+            <w:pPr>
+              <w:spacing w:before="144" w:after="264"/>
+              <w:rPr>
+                <w:rFonts w:ascii="Helvetica" w:eastAsia="Times New Roman" w:hAnsi="Helvetica" w:cs="Helvetica"/>
+                <w:sz w:val="28"/>
+                <w:szCs w:val="28"/>
+                <w:lang w:val="es-AR"/>
+              </w:rPr>
+            </w:pPr>
+            <w:r>
+              <w:rPr>
+                <w:rFonts w:ascii="Helvetica" w:eastAsia="Times New Roman" w:hAnsi="Helvetica" w:cs="Helvetica"/>
+                <w:sz w:val="28"/>
+                <w:szCs w:val="28"/>
+                <w:lang w:val="es-AR"/>
+              </w:rPr>
+              <w:t xml:space="preserve">El manejo de CSS, imágenes y JavaScript del </w:t>
+            </w:r>
+            <w:proofErr w:type="spellStart"/>
+            <w:r>
+              <w:rPr>
+                <w:rFonts w:ascii="Helvetica" w:eastAsia="Times New Roman" w:hAnsi="Helvetica" w:cs="Helvetica"/>
+                <w:sz w:val="28"/>
+                <w:szCs w:val="28"/>
+                <w:lang w:val="es-AR"/>
+              </w:rPr>
+              <w:t>admin</w:t>
+            </w:r>
+            <w:proofErr w:type="spellEnd"/>
+            <w:r>
+              <w:rPr>
+                <w:rFonts w:ascii="Helvetica" w:eastAsia="Times New Roman" w:hAnsi="Helvetica" w:cs="Helvetica"/>
+                <w:sz w:val="28"/>
+                <w:szCs w:val="28"/>
+                <w:lang w:val="es-AR"/>
+              </w:rPr>
+              <w:t>.</w:t>
+            </w:r>
+          </w:p>
+        </w:tc>
+      </w:tr>
+    </w:tbl>
+    <w:p>
+      <w:pPr>
+        <w:rPr>
+          <w:lang w:val="es-AR"/>
+        </w:rPr>
+      </w:pPr>
+    </w:p>
+    <w:p>
+      <w:pPr>
+        <w:rPr>
+          <w:lang w:val="es-AR"/>
+        </w:rPr>
+      </w:pPr>
+    </w:p>
+    <w:p>
+      <w:pPr>
+        <w:rPr>
+          <w:sz w:val="24"/>
+          <w:lang w:val="es-AR"/>
+        </w:rPr>
+      </w:pPr>
+      <w:r>
+        <w:rPr>
+          <w:sz w:val="24"/>
+          <w:lang w:val="es-AR"/>
+        </w:rPr>
+        <w:lastRenderedPageBreak/>
+        <w:t>Teoría 12</w:t>
+      </w:r>
+      <w:r>
+        <w:rPr>
+          <w:sz w:val="24"/>
+          <w:lang w:val="es-AR"/>
+        </w:rPr>
+        <w:t xml:space="preserve"> - </w:t>
+      </w:r>
+      <w:r>
+        <w:rPr>
+          <w:sz w:val="24"/>
+          <w:lang w:val="es-AR"/>
+        </w:rPr>
+        <w:t>La con</w:t>
+      </w:r>
+      <w:bookmarkStart w:id="0" w:name="_GoBack"/>
+      <w:bookmarkEnd w:id="0"/>
+      <w:r>
+        <w:rPr>
+          <w:sz w:val="24"/>
+          <w:lang w:val="es-AR"/>
+        </w:rPr>
+        <w:t>figuración de un proyecto</w:t>
+      </w:r>
+    </w:p>
+    <w:tbl>
+      <w:tblPr>
+        <w:tblStyle w:val="Tablaconcuadrcula"/>
+        <w:tblW w:w="11477" w:type="dxa"/>
+        <w:tblLook w:val="04A0" w:firstRow="1" w:lastRow="0" w:firstColumn="1" w:lastColumn="0" w:noHBand="0" w:noVBand="1"/>
+      </w:tblPr>
+      <w:tblGrid>
+        <w:gridCol w:w="2860"/>
+        <w:gridCol w:w="8617"/>
+      </w:tblGrid>
+      <w:tr>
+        <w:tc>
+          <w:tcPr>
+            <w:tcW w:w="2830" w:type="dxa"/>
+            <w:hideMark/>
+          </w:tcPr>
+          <w:p>
+            <w:pPr>
+              <w:spacing w:before="144" w:after="264"/>
+              <w:rPr>
+                <w:rFonts w:ascii="Helvetica" w:eastAsia="Times New Roman" w:hAnsi="Helvetica" w:cs="Helvetica"/>
+                <w:b/>
+                <w:bCs/>
+                <w:sz w:val="26"/>
+                <w:szCs w:val="26"/>
+              </w:rPr>
+            </w:pPr>
+            <w:proofErr w:type="spellStart"/>
+            <w:r>
+              <w:rPr>
+                <w:rFonts w:ascii="Helvetica" w:eastAsia="Times New Roman" w:hAnsi="Helvetica" w:cs="Helvetica"/>
+                <w:b/>
+                <w:bCs/>
+                <w:sz w:val="26"/>
+                <w:szCs w:val="26"/>
+              </w:rPr>
+              <w:t>Ajuste</w:t>
+            </w:r>
+            <w:proofErr w:type="spellEnd"/>
+          </w:p>
+        </w:tc>
+        <w:tc>
+          <w:tcPr>
+            <w:tcW w:w="8647" w:type="dxa"/>
+            <w:hideMark/>
+          </w:tcPr>
+          <w:p>
+            <w:pPr>
+              <w:spacing w:before="144" w:after="264"/>
+              <w:rPr>
+                <w:rFonts w:ascii="Helvetica" w:eastAsia="Times New Roman" w:hAnsi="Helvetica" w:cs="Helvetica"/>
+                <w:b/>
+                <w:bCs/>
+                <w:sz w:val="26"/>
+                <w:szCs w:val="26"/>
+              </w:rPr>
+            </w:pPr>
+            <w:proofErr w:type="spellStart"/>
+            <w:r>
+              <w:rPr>
+                <w:rFonts w:ascii="Helvetica" w:eastAsia="Times New Roman" w:hAnsi="Helvetica" w:cs="Helvetica"/>
+                <w:b/>
+                <w:bCs/>
+                <w:sz w:val="26"/>
+                <w:szCs w:val="26"/>
+              </w:rPr>
+              <w:t>Qué</w:t>
+            </w:r>
+            <w:proofErr w:type="spellEnd"/>
+            <w:r>
+              <w:rPr>
+                <w:rFonts w:ascii="Helvetica" w:eastAsia="Times New Roman" w:hAnsi="Helvetica" w:cs="Helvetica"/>
+                <w:b/>
+                <w:bCs/>
+                <w:sz w:val="26"/>
+                <w:szCs w:val="26"/>
+              </w:rPr>
+              <w:t xml:space="preserve"> </w:t>
+            </w:r>
+            <w:proofErr w:type="spellStart"/>
+            <w:r>
+              <w:rPr>
+                <w:rFonts w:ascii="Helvetica" w:eastAsia="Times New Roman" w:hAnsi="Helvetica" w:cs="Helvetica"/>
+                <w:b/>
+                <w:bCs/>
+                <w:sz w:val="26"/>
+                <w:szCs w:val="26"/>
+              </w:rPr>
+              <w:t>hace</w:t>
+            </w:r>
+            <w:proofErr w:type="spellEnd"/>
+          </w:p>
+        </w:tc>
+      </w:tr>
+      <w:tr>
+        <w:tc>
+          <w:tcPr>
+            <w:tcW w:w="2830" w:type="dxa"/>
+            <w:hideMark/>
+          </w:tcPr>
+          <w:p>
+            <w:pPr>
+              <w:spacing w:before="144" w:after="264"/>
+              <w:rPr>
+                <w:rFonts w:ascii="Helvetica" w:eastAsia="Times New Roman" w:hAnsi="Helvetica" w:cs="Helvetica"/>
+                <w:sz w:val="26"/>
+                <w:szCs w:val="26"/>
+              </w:rPr>
+            </w:pPr>
+            <w:r>
+              <w:rPr>
+                <w:rFonts w:ascii="Helvetica" w:eastAsia="Times New Roman" w:hAnsi="Helvetica" w:cs="Helvetica"/>
+                <w:sz w:val="26"/>
+                <w:szCs w:val="26"/>
+                <w:shd w:val="clear" w:color="auto" w:fill="181D27"/>
+              </w:rPr>
+              <w:t>SECRET_KEY</w:t>
+            </w:r>
+          </w:p>
+        </w:tc>
+        <w:tc>
+          <w:tcPr>
+            <w:tcW w:w="8647" w:type="dxa"/>
+            <w:hideMark/>
+          </w:tcPr>
+          <w:p>
+            <w:pPr>
+              <w:spacing w:before="144" w:after="264"/>
+              <w:rPr>
+                <w:rFonts w:ascii="Helvetica" w:eastAsia="Times New Roman" w:hAnsi="Helvetica" w:cs="Helvetica"/>
+                <w:sz w:val="26"/>
+                <w:szCs w:val="26"/>
+                <w:lang w:val="es-AR"/>
+              </w:rPr>
+            </w:pPr>
+            <w:r>
+              <w:rPr>
+                <w:rFonts w:ascii="Helvetica" w:eastAsia="Times New Roman" w:hAnsi="Helvetica" w:cs="Helvetica"/>
+                <w:sz w:val="26"/>
+                <w:szCs w:val="26"/>
+                <w:lang w:val="es-AR"/>
+              </w:rPr>
+              <w:t xml:space="preserve">La clave con la que el proyecto firma cosas: cookies de sesión, </w:t>
+            </w:r>
+            <w:proofErr w:type="spellStart"/>
+            <w:r>
+              <w:rPr>
+                <w:rFonts w:ascii="Helvetica" w:eastAsia="Times New Roman" w:hAnsi="Helvetica" w:cs="Helvetica"/>
+                <w:sz w:val="26"/>
+                <w:szCs w:val="26"/>
+                <w:lang w:val="es-AR"/>
+              </w:rPr>
+              <w:t>tokens</w:t>
+            </w:r>
+            <w:proofErr w:type="spellEnd"/>
+            <w:r>
+              <w:rPr>
+                <w:rFonts w:ascii="Helvetica" w:eastAsia="Times New Roman" w:hAnsi="Helvetica" w:cs="Helvetica"/>
+                <w:sz w:val="26"/>
+                <w:szCs w:val="26"/>
+                <w:lang w:val="es-AR"/>
+              </w:rPr>
+              <w:t xml:space="preserve"> de recuperación y, en esta guía, los JWT. Si se filtra, alguien puede firmar como si fuera el servidor.</w:t>
+            </w:r>
+          </w:p>
+        </w:tc>
+      </w:tr>
+      <w:tr>
+        <w:tc>
+          <w:tcPr>
+            <w:tcW w:w="2830" w:type="dxa"/>
+            <w:hideMark/>
+          </w:tcPr>
+          <w:p>
+            <w:pPr>
+              <w:spacing w:before="144" w:after="264"/>
+              <w:rPr>
+                <w:rFonts w:ascii="Helvetica" w:eastAsia="Times New Roman" w:hAnsi="Helvetica" w:cs="Helvetica"/>
+                <w:sz w:val="26"/>
+                <w:szCs w:val="26"/>
+              </w:rPr>
+            </w:pPr>
+            <w:r>
+              <w:rPr>
+                <w:rFonts w:ascii="Helvetica" w:eastAsia="Times New Roman" w:hAnsi="Helvetica" w:cs="Helvetica"/>
+                <w:sz w:val="26"/>
+                <w:szCs w:val="26"/>
+                <w:shd w:val="clear" w:color="auto" w:fill="181D27"/>
+              </w:rPr>
+              <w:t>DEBUG</w:t>
+            </w:r>
+          </w:p>
+        </w:tc>
+        <w:tc>
+          <w:tcPr>
+            <w:tcW w:w="8647" w:type="dxa"/>
+            <w:hideMark/>
+          </w:tcPr>
+          <w:p>
+            <w:pPr>
+              <w:spacing w:before="144" w:after="264"/>
+              <w:rPr>
+                <w:rFonts w:ascii="Helvetica" w:eastAsia="Times New Roman" w:hAnsi="Helvetica" w:cs="Helvetica"/>
+                <w:sz w:val="26"/>
+                <w:szCs w:val="26"/>
+              </w:rPr>
+            </w:pPr>
+            <w:r>
+              <w:rPr>
+                <w:rFonts w:ascii="Helvetica" w:eastAsia="Times New Roman" w:hAnsi="Helvetica" w:cs="Helvetica"/>
+                <w:sz w:val="26"/>
+                <w:szCs w:val="26"/>
+                <w:lang w:val="es-AR"/>
+              </w:rPr>
+              <w:t xml:space="preserve">En </w:t>
+            </w:r>
+            <w:r>
+              <w:rPr>
+                <w:rFonts w:ascii="Helvetica" w:eastAsia="Times New Roman" w:hAnsi="Helvetica" w:cs="Helvetica"/>
+                <w:sz w:val="26"/>
+                <w:szCs w:val="26"/>
+                <w:shd w:val="clear" w:color="auto" w:fill="181D27"/>
+                <w:lang w:val="es-AR"/>
+              </w:rPr>
+              <w:t>True</w:t>
+            </w:r>
+            <w:r>
+              <w:rPr>
+                <w:rFonts w:ascii="Helvetica" w:eastAsia="Times New Roman" w:hAnsi="Helvetica" w:cs="Helvetica"/>
+                <w:sz w:val="26"/>
+                <w:szCs w:val="26"/>
+                <w:lang w:val="es-AR"/>
+              </w:rPr>
+              <w:t xml:space="preserve"> muestra el error completo con el código fuente y las variables. </w:t>
+            </w:r>
+            <w:proofErr w:type="spellStart"/>
+            <w:r>
+              <w:rPr>
+                <w:rFonts w:ascii="Helvetica" w:eastAsia="Times New Roman" w:hAnsi="Helvetica" w:cs="Helvetica"/>
+                <w:sz w:val="26"/>
+                <w:szCs w:val="26"/>
+              </w:rPr>
+              <w:t>Es</w:t>
+            </w:r>
+            <w:proofErr w:type="spellEnd"/>
+            <w:r>
+              <w:rPr>
+                <w:rFonts w:ascii="Helvetica" w:eastAsia="Times New Roman" w:hAnsi="Helvetica" w:cs="Helvetica"/>
+                <w:sz w:val="26"/>
+                <w:szCs w:val="26"/>
+              </w:rPr>
+              <w:t xml:space="preserve"> invaluable </w:t>
+            </w:r>
+            <w:proofErr w:type="spellStart"/>
+            <w:r>
+              <w:rPr>
+                <w:rFonts w:ascii="Helvetica" w:eastAsia="Times New Roman" w:hAnsi="Helvetica" w:cs="Helvetica"/>
+                <w:sz w:val="26"/>
+                <w:szCs w:val="26"/>
+              </w:rPr>
+              <w:t>desarrollando</w:t>
+            </w:r>
+            <w:proofErr w:type="spellEnd"/>
+            <w:r>
+              <w:rPr>
+                <w:rFonts w:ascii="Helvetica" w:eastAsia="Times New Roman" w:hAnsi="Helvetica" w:cs="Helvetica"/>
+                <w:sz w:val="26"/>
+                <w:szCs w:val="26"/>
+              </w:rPr>
+              <w:t xml:space="preserve"> y </w:t>
+            </w:r>
+            <w:proofErr w:type="spellStart"/>
+            <w:r>
+              <w:rPr>
+                <w:rFonts w:ascii="Helvetica" w:eastAsia="Times New Roman" w:hAnsi="Helvetica" w:cs="Helvetica"/>
+                <w:sz w:val="26"/>
+                <w:szCs w:val="26"/>
+              </w:rPr>
+              <w:t>gravísimo</w:t>
+            </w:r>
+            <w:proofErr w:type="spellEnd"/>
+            <w:r>
+              <w:rPr>
+                <w:rFonts w:ascii="Helvetica" w:eastAsia="Times New Roman" w:hAnsi="Helvetica" w:cs="Helvetica"/>
+                <w:sz w:val="26"/>
+                <w:szCs w:val="26"/>
+              </w:rPr>
+              <w:t xml:space="preserve"> </w:t>
+            </w:r>
+            <w:proofErr w:type="spellStart"/>
+            <w:r>
+              <w:rPr>
+                <w:rFonts w:ascii="Helvetica" w:eastAsia="Times New Roman" w:hAnsi="Helvetica" w:cs="Helvetica"/>
+                <w:sz w:val="26"/>
+                <w:szCs w:val="26"/>
+              </w:rPr>
+              <w:t>en</w:t>
+            </w:r>
+            <w:proofErr w:type="spellEnd"/>
+            <w:r>
+              <w:rPr>
+                <w:rFonts w:ascii="Helvetica" w:eastAsia="Times New Roman" w:hAnsi="Helvetica" w:cs="Helvetica"/>
+                <w:sz w:val="26"/>
+                <w:szCs w:val="26"/>
+              </w:rPr>
+              <w:t xml:space="preserve"> </w:t>
+            </w:r>
+            <w:proofErr w:type="spellStart"/>
+            <w:r>
+              <w:rPr>
+                <w:rFonts w:ascii="Helvetica" w:eastAsia="Times New Roman" w:hAnsi="Helvetica" w:cs="Helvetica"/>
+                <w:sz w:val="26"/>
+                <w:szCs w:val="26"/>
+              </w:rPr>
+              <w:t>producción</w:t>
+            </w:r>
+            <w:proofErr w:type="spellEnd"/>
+            <w:r>
+              <w:rPr>
+                <w:rFonts w:ascii="Helvetica" w:eastAsia="Times New Roman" w:hAnsi="Helvetica" w:cs="Helvetica"/>
+                <w:sz w:val="26"/>
+                <w:szCs w:val="26"/>
+              </w:rPr>
+              <w:t>.</w:t>
+            </w:r>
+          </w:p>
+        </w:tc>
+      </w:tr>
+      <w:tr>
+        <w:tc>
+          <w:tcPr>
+            <w:tcW w:w="2830" w:type="dxa"/>
+            <w:hideMark/>
+          </w:tcPr>
+          <w:p>
+            <w:pPr>
+              <w:spacing w:before="144" w:after="264"/>
+              <w:rPr>
+                <w:rFonts w:ascii="Helvetica" w:eastAsia="Times New Roman" w:hAnsi="Helvetica" w:cs="Helvetica"/>
+                <w:sz w:val="26"/>
+                <w:szCs w:val="26"/>
+              </w:rPr>
+            </w:pPr>
+            <w:r>
+              <w:rPr>
+                <w:rFonts w:ascii="Helvetica" w:eastAsia="Times New Roman" w:hAnsi="Helvetica" w:cs="Helvetica"/>
+                <w:sz w:val="26"/>
+                <w:szCs w:val="26"/>
+                <w:shd w:val="clear" w:color="auto" w:fill="181D27"/>
+              </w:rPr>
+              <w:t>ALLOWED_HOSTS</w:t>
+            </w:r>
+          </w:p>
+        </w:tc>
+        <w:tc>
+          <w:tcPr>
+            <w:tcW w:w="8647" w:type="dxa"/>
+            <w:hideMark/>
+          </w:tcPr>
+          <w:p>
+            <w:pPr>
+              <w:spacing w:before="144" w:after="264"/>
+              <w:rPr>
+                <w:rFonts w:ascii="Helvetica" w:eastAsia="Times New Roman" w:hAnsi="Helvetica" w:cs="Helvetica"/>
+                <w:sz w:val="26"/>
+                <w:szCs w:val="26"/>
+                <w:lang w:val="es-AR"/>
+              </w:rPr>
+            </w:pPr>
+            <w:r>
+              <w:rPr>
+                <w:rFonts w:ascii="Helvetica" w:eastAsia="Times New Roman" w:hAnsi="Helvetica" w:cs="Helvetica"/>
+                <w:sz w:val="26"/>
+                <w:szCs w:val="26"/>
+                <w:lang w:val="es-AR"/>
+              </w:rPr>
+              <w:t>Con qué nombres de dominio acepta que la llamen. Evita que alguien sirva tu aplicación desde un dominio ajeno.</w:t>
+            </w:r>
+          </w:p>
+        </w:tc>
+      </w:tr>
+      <w:tr>
+        <w:tc>
+          <w:tcPr>
+            <w:tcW w:w="2830" w:type="dxa"/>
+            <w:hideMark/>
+          </w:tcPr>
+          <w:p>
+            <w:pPr>
+              <w:spacing w:before="144" w:after="264"/>
+              <w:rPr>
+                <w:rFonts w:ascii="Helvetica" w:eastAsia="Times New Roman" w:hAnsi="Helvetica" w:cs="Helvetica"/>
+                <w:sz w:val="26"/>
+                <w:szCs w:val="26"/>
+              </w:rPr>
+            </w:pPr>
+            <w:r>
+              <w:rPr>
+                <w:rFonts w:ascii="Helvetica" w:eastAsia="Times New Roman" w:hAnsi="Helvetica" w:cs="Helvetica"/>
+                <w:sz w:val="26"/>
+                <w:szCs w:val="26"/>
+                <w:shd w:val="clear" w:color="auto" w:fill="181D27"/>
+              </w:rPr>
+              <w:t>INSTALLED_APPS</w:t>
+            </w:r>
+          </w:p>
+        </w:tc>
+        <w:tc>
+          <w:tcPr>
+            <w:tcW w:w="8647" w:type="dxa"/>
+            <w:hideMark/>
+          </w:tcPr>
+          <w:p>
+            <w:pPr>
+              <w:spacing w:before="144" w:after="264"/>
+              <w:rPr>
+                <w:rFonts w:ascii="Helvetica" w:eastAsia="Times New Roman" w:hAnsi="Helvetica" w:cs="Helvetica"/>
+                <w:sz w:val="26"/>
+                <w:szCs w:val="26"/>
+                <w:lang w:val="es-AR"/>
+              </w:rPr>
+            </w:pPr>
+            <w:r>
+              <w:rPr>
+                <w:rFonts w:ascii="Helvetica" w:eastAsia="Times New Roman" w:hAnsi="Helvetica" w:cs="Helvetica"/>
+                <w:sz w:val="26"/>
+                <w:szCs w:val="26"/>
+                <w:lang w:val="es-AR"/>
+              </w:rPr>
+              <w:t>Qué apps forman el proyecto.</w:t>
+            </w:r>
+          </w:p>
+        </w:tc>
+      </w:tr>
+      <w:tr>
+        <w:tc>
+          <w:tcPr>
+            <w:tcW w:w="2830" w:type="dxa"/>
+            <w:hideMark/>
+          </w:tcPr>
+          <w:p>
+            <w:pPr>
+              <w:spacing w:before="144" w:after="264"/>
+              <w:rPr>
+                <w:rFonts w:ascii="Helvetica" w:eastAsia="Times New Roman" w:hAnsi="Helvetica" w:cs="Helvetica"/>
+                <w:sz w:val="26"/>
+                <w:szCs w:val="26"/>
+              </w:rPr>
+            </w:pPr>
+            <w:r>
+              <w:rPr>
+                <w:rFonts w:ascii="Helvetica" w:eastAsia="Times New Roman" w:hAnsi="Helvetica" w:cs="Helvetica"/>
+                <w:sz w:val="26"/>
+                <w:szCs w:val="26"/>
+                <w:shd w:val="clear" w:color="auto" w:fill="181D27"/>
+              </w:rPr>
+              <w:t>DATABASES</w:t>
+            </w:r>
+          </w:p>
+        </w:tc>
+        <w:tc>
+          <w:tcPr>
+            <w:tcW w:w="8647" w:type="dxa"/>
+            <w:hideMark/>
+          </w:tcPr>
+          <w:p>
+            <w:pPr>
+              <w:spacing w:before="144" w:after="264"/>
+              <w:rPr>
+                <w:rFonts w:ascii="Helvetica" w:eastAsia="Times New Roman" w:hAnsi="Helvetica" w:cs="Helvetica"/>
+                <w:sz w:val="26"/>
+                <w:szCs w:val="26"/>
+                <w:lang w:val="es-AR"/>
+              </w:rPr>
+            </w:pPr>
+            <w:r>
+              <w:rPr>
+                <w:rFonts w:ascii="Helvetica" w:eastAsia="Times New Roman" w:hAnsi="Helvetica" w:cs="Helvetica"/>
+                <w:sz w:val="26"/>
+                <w:szCs w:val="26"/>
+                <w:lang w:val="es-AR"/>
+              </w:rPr>
+              <w:t xml:space="preserve">Con qué base hablar. Acá es </w:t>
+            </w:r>
+            <w:proofErr w:type="spellStart"/>
+            <w:r>
+              <w:rPr>
+                <w:rFonts w:ascii="Helvetica" w:eastAsia="Times New Roman" w:hAnsi="Helvetica" w:cs="Helvetica"/>
+                <w:sz w:val="26"/>
+                <w:szCs w:val="26"/>
+                <w:lang w:val="es-AR"/>
+              </w:rPr>
+              <w:t>SQLite</w:t>
+            </w:r>
+            <w:proofErr w:type="spellEnd"/>
+            <w:r>
+              <w:rPr>
+                <w:rFonts w:ascii="Helvetica" w:eastAsia="Times New Roman" w:hAnsi="Helvetica" w:cs="Helvetica"/>
+                <w:sz w:val="26"/>
+                <w:szCs w:val="26"/>
+                <w:lang w:val="es-AR"/>
+              </w:rPr>
+              <w:t xml:space="preserve">, que es un archivo; cambiar a </w:t>
+            </w:r>
+            <w:proofErr w:type="spellStart"/>
+            <w:r>
+              <w:rPr>
+                <w:rFonts w:ascii="Helvetica" w:eastAsia="Times New Roman" w:hAnsi="Helvetica" w:cs="Helvetica"/>
+                <w:sz w:val="26"/>
+                <w:szCs w:val="26"/>
+                <w:lang w:val="es-AR"/>
+              </w:rPr>
+              <w:t>PostgreSQL</w:t>
+            </w:r>
+            <w:proofErr w:type="spellEnd"/>
+            <w:r>
+              <w:rPr>
+                <w:rFonts w:ascii="Helvetica" w:eastAsia="Times New Roman" w:hAnsi="Helvetica" w:cs="Helvetica"/>
+                <w:sz w:val="26"/>
+                <w:szCs w:val="26"/>
+                <w:lang w:val="es-AR"/>
+              </w:rPr>
+              <w:t xml:space="preserve"> es cambiar este bloque y nada más.</w:t>
+            </w:r>
+          </w:p>
+        </w:tc>
+      </w:tr>
+      <w:tr>
+        <w:tc>
+          <w:tcPr>
+            <w:tcW w:w="2830" w:type="dxa"/>
+            <w:hideMark/>
+          </w:tcPr>
+          <w:p>
+            <w:pPr>
+              <w:spacing w:before="144" w:after="264"/>
+              <w:rPr>
+                <w:rFonts w:ascii="Helvetica" w:eastAsia="Times New Roman" w:hAnsi="Helvetica" w:cs="Helvetica"/>
+                <w:sz w:val="26"/>
+                <w:szCs w:val="26"/>
+              </w:rPr>
+            </w:pPr>
+            <w:r>
+              <w:rPr>
+                <w:rFonts w:ascii="Helvetica" w:eastAsia="Times New Roman" w:hAnsi="Helvetica" w:cs="Helvetica"/>
+                <w:sz w:val="26"/>
+                <w:szCs w:val="26"/>
+                <w:shd w:val="clear" w:color="auto" w:fill="181D27"/>
+              </w:rPr>
+              <w:t>AUTH_USER_MODEL</w:t>
+            </w:r>
+          </w:p>
+        </w:tc>
+        <w:tc>
+          <w:tcPr>
+            <w:tcW w:w="8647" w:type="dxa"/>
+            <w:hideMark/>
+          </w:tcPr>
+          <w:p>
+            <w:pPr>
+              <w:spacing w:before="144" w:after="264"/>
+              <w:rPr>
+                <w:rFonts w:ascii="Helvetica" w:eastAsia="Times New Roman" w:hAnsi="Helvetica" w:cs="Helvetica"/>
+                <w:sz w:val="26"/>
+                <w:szCs w:val="26"/>
+                <w:lang w:val="es-AR"/>
+              </w:rPr>
+            </w:pPr>
+            <w:r>
+              <w:rPr>
+                <w:rFonts w:ascii="Helvetica" w:eastAsia="Times New Roman" w:hAnsi="Helvetica" w:cs="Helvetica"/>
+                <w:sz w:val="26"/>
+                <w:szCs w:val="26"/>
+                <w:lang w:val="es-AR"/>
+              </w:rPr>
+              <w:t>Cuál es el modelo de usuario del proyecto. Se define una vez, al principio, y no se cambia.</w:t>
+            </w:r>
+          </w:p>
+        </w:tc>
+      </w:tr>
+      <w:tr>
+        <w:tc>
+          <w:tcPr>
+            <w:tcW w:w="2830" w:type="dxa"/>
+            <w:hideMark/>
+          </w:tcPr>
+          <w:p>
+            <w:pPr>
+              <w:spacing w:before="144" w:after="264"/>
+              <w:rPr>
+                <w:rFonts w:ascii="Helvetica" w:eastAsia="Times New Roman" w:hAnsi="Helvetica" w:cs="Helvetica"/>
+                <w:sz w:val="26"/>
+                <w:szCs w:val="26"/>
+              </w:rPr>
+            </w:pPr>
+            <w:r>
+              <w:rPr>
+                <w:rFonts w:ascii="Helvetica" w:eastAsia="Times New Roman" w:hAnsi="Helvetica" w:cs="Helvetica"/>
+                <w:sz w:val="26"/>
+                <w:szCs w:val="26"/>
+                <w:shd w:val="clear" w:color="auto" w:fill="181D27"/>
+              </w:rPr>
+              <w:t>TIME_ZONE</w:t>
+            </w:r>
+            <w:r>
+              <w:rPr>
+                <w:rFonts w:ascii="Helvetica" w:eastAsia="Times New Roman" w:hAnsi="Helvetica" w:cs="Helvetica"/>
+                <w:sz w:val="26"/>
+                <w:szCs w:val="26"/>
+              </w:rPr>
+              <w:t xml:space="preserve"> y </w:t>
+            </w:r>
+            <w:r>
+              <w:rPr>
+                <w:rFonts w:ascii="Helvetica" w:eastAsia="Times New Roman" w:hAnsi="Helvetica" w:cs="Helvetica"/>
+                <w:sz w:val="26"/>
+                <w:szCs w:val="26"/>
+                <w:shd w:val="clear" w:color="auto" w:fill="181D27"/>
+              </w:rPr>
+              <w:t>USE_TZ</w:t>
+            </w:r>
+          </w:p>
+        </w:tc>
+        <w:tc>
+          <w:tcPr>
+            <w:tcW w:w="8647" w:type="dxa"/>
+            <w:hideMark/>
+          </w:tcPr>
+          <w:p>
+            <w:pPr>
+              <w:spacing w:before="144" w:after="264"/>
+              <w:rPr>
+                <w:rFonts w:ascii="Helvetica" w:eastAsia="Times New Roman" w:hAnsi="Helvetica" w:cs="Helvetica"/>
+                <w:sz w:val="26"/>
+                <w:szCs w:val="26"/>
+                <w:lang w:val="es-AR"/>
+              </w:rPr>
+            </w:pPr>
+            <w:r>
+              <w:rPr>
+                <w:rFonts w:ascii="Helvetica" w:eastAsia="Times New Roman" w:hAnsi="Helvetica" w:cs="Helvetica"/>
+                <w:sz w:val="26"/>
+                <w:szCs w:val="26"/>
+                <w:lang w:val="es-AR"/>
+              </w:rPr>
+              <w:t>En qué zona horaria se muestran las fechas, y que por dentro se guarden siempre en UTC.</w:t>
+            </w:r>
+          </w:p>
+        </w:tc>
+      </w:tr>
+      <w:tr>
+        <w:tc>
+          <w:tcPr>
+            <w:tcW w:w="2830" w:type="dxa"/>
+            <w:hideMark/>
+          </w:tcPr>
+          <w:p>
+            <w:pPr>
+              <w:spacing w:before="144" w:after="264"/>
+              <w:rPr>
+                <w:rFonts w:ascii="Helvetica" w:eastAsia="Times New Roman" w:hAnsi="Helvetica" w:cs="Helvetica"/>
+                <w:sz w:val="26"/>
+                <w:szCs w:val="26"/>
+                <w:lang w:val="es-AR"/>
+              </w:rPr>
+            </w:pPr>
+            <w:r>
+              <w:rPr>
+                <w:rFonts w:ascii="Helvetica" w:eastAsia="Times New Roman" w:hAnsi="Helvetica" w:cs="Helvetica"/>
+                <w:sz w:val="26"/>
+                <w:szCs w:val="26"/>
+                <w:shd w:val="clear" w:color="auto" w:fill="181D27"/>
+                <w:lang w:val="es-AR"/>
+              </w:rPr>
+              <w:t>MEDIA_ROOT</w:t>
+            </w:r>
+            <w:r>
+              <w:rPr>
+                <w:rFonts w:ascii="Helvetica" w:eastAsia="Times New Roman" w:hAnsi="Helvetica" w:cs="Helvetica"/>
+                <w:sz w:val="26"/>
+                <w:szCs w:val="26"/>
+                <w:lang w:val="es-AR"/>
+              </w:rPr>
+              <w:t xml:space="preserve"> y </w:t>
+            </w:r>
+            <w:r>
+              <w:rPr>
+                <w:rFonts w:ascii="Helvetica" w:eastAsia="Times New Roman" w:hAnsi="Helvetica" w:cs="Helvetica"/>
+                <w:sz w:val="26"/>
+                <w:szCs w:val="26"/>
+                <w:shd w:val="clear" w:color="auto" w:fill="181D27"/>
+                <w:lang w:val="es-AR"/>
+              </w:rPr>
+              <w:t>MEDIA_URL</w:t>
+            </w:r>
+          </w:p>
+        </w:tc>
+        <w:tc>
+          <w:tcPr>
+            <w:tcW w:w="8647" w:type="dxa"/>
+            <w:hideMark/>
+          </w:tcPr>
+          <w:p>
+            <w:pPr>
+              <w:spacing w:before="144" w:after="264"/>
+              <w:rPr>
+                <w:rFonts w:ascii="Helvetica" w:eastAsia="Times New Roman" w:hAnsi="Helvetica" w:cs="Helvetica"/>
+                <w:sz w:val="26"/>
+                <w:szCs w:val="26"/>
+                <w:lang w:val="es-AR"/>
+              </w:rPr>
+            </w:pPr>
+            <w:r>
+              <w:rPr>
+                <w:rFonts w:ascii="Helvetica" w:eastAsia="Times New Roman" w:hAnsi="Helvetica" w:cs="Helvetica"/>
+                <w:sz w:val="26"/>
+                <w:szCs w:val="26"/>
+                <w:lang w:val="es-AR"/>
+              </w:rPr>
+              <w:t>Dónde se guardan los archivos que sube la gente y bajo qué URL se sirven.</w:t>
+            </w:r>
+          </w:p>
+        </w:tc>
+      </w:tr>
+      <w:tr>
+        <w:tc>
+          <w:tcPr>
+            <w:tcW w:w="2830" w:type="dxa"/>
+            <w:hideMark/>
+          </w:tcPr>
+          <w:p>
+            <w:pPr>
+              <w:spacing w:before="144" w:after="264"/>
+              <w:rPr>
+                <w:rFonts w:ascii="Helvetica" w:eastAsia="Times New Roman" w:hAnsi="Helvetica" w:cs="Helvetica"/>
+                <w:b/>
+                <w:bCs/>
+                <w:sz w:val="26"/>
+                <w:szCs w:val="26"/>
+              </w:rPr>
+            </w:pPr>
+            <w:r>
+              <w:rPr>
+                <w:rFonts w:ascii="Helvetica" w:eastAsia="Times New Roman" w:hAnsi="Helvetica" w:cs="Helvetica"/>
+                <w:b/>
+                <w:bCs/>
+                <w:sz w:val="26"/>
+                <w:szCs w:val="26"/>
+              </w:rPr>
+              <w:t xml:space="preserve">App de </w:t>
+            </w:r>
+            <w:proofErr w:type="spellStart"/>
+            <w:r>
+              <w:rPr>
+                <w:rFonts w:ascii="Helvetica" w:eastAsia="Times New Roman" w:hAnsi="Helvetica" w:cs="Helvetica"/>
+                <w:b/>
+                <w:bCs/>
+                <w:sz w:val="26"/>
+                <w:szCs w:val="26"/>
+              </w:rPr>
+              <w:t>contrib</w:t>
+            </w:r>
+            <w:proofErr w:type="spellEnd"/>
+          </w:p>
+        </w:tc>
+        <w:tc>
+          <w:tcPr>
+            <w:tcW w:w="8647" w:type="dxa"/>
+            <w:hideMark/>
+          </w:tcPr>
+          <w:p>
+            <w:pPr>
+              <w:spacing w:before="144" w:after="264"/>
+              <w:rPr>
+                <w:rFonts w:ascii="Helvetica" w:eastAsia="Times New Roman" w:hAnsi="Helvetica" w:cs="Helvetica"/>
+                <w:b/>
+                <w:bCs/>
+                <w:sz w:val="26"/>
+                <w:szCs w:val="26"/>
+              </w:rPr>
+            </w:pPr>
+            <w:proofErr w:type="spellStart"/>
+            <w:r>
+              <w:rPr>
+                <w:rFonts w:ascii="Helvetica" w:eastAsia="Times New Roman" w:hAnsi="Helvetica" w:cs="Helvetica"/>
+                <w:b/>
+                <w:bCs/>
+                <w:sz w:val="26"/>
+                <w:szCs w:val="26"/>
+              </w:rPr>
+              <w:t>Qué</w:t>
+            </w:r>
+            <w:proofErr w:type="spellEnd"/>
+            <w:r>
+              <w:rPr>
+                <w:rFonts w:ascii="Helvetica" w:eastAsia="Times New Roman" w:hAnsi="Helvetica" w:cs="Helvetica"/>
+                <w:b/>
+                <w:bCs/>
+                <w:sz w:val="26"/>
+                <w:szCs w:val="26"/>
+              </w:rPr>
+              <w:t xml:space="preserve"> </w:t>
+            </w:r>
+            <w:proofErr w:type="spellStart"/>
+            <w:r>
+              <w:rPr>
+                <w:rFonts w:ascii="Helvetica" w:eastAsia="Times New Roman" w:hAnsi="Helvetica" w:cs="Helvetica"/>
+                <w:b/>
+                <w:bCs/>
+                <w:sz w:val="26"/>
+                <w:szCs w:val="26"/>
+              </w:rPr>
+              <w:t>aporta</w:t>
             </w:r>
             <w:proofErr w:type="spellEnd"/>
           </w:p>
@@ -3741,6 +5166,7 @@
   <w:style w:type="paragraph" w:default="1" w:styleId="Normal">
     <w:name w:val="Normal"/>
     <w:qFormat/>
+    <w:rsid w:val="00FA6B89"/>
   </w:style>
   <w:style w:type="character" w:default="1" w:styleId="Fuentedeprrafopredeter">
     <w:name w:val="Default Paragraph Font"/>

</xml_diff>